<commit_message>
Manuscript v2: P6 state-dependent sign (tariff test registered), section 4.8, contributions; Word file regenerated
Co-Authored-By: Claude Sonnet 5.5 <noreply@anthropic.com>
Claude-Session: https://claude.ai/code/session_011aZmoPyuUT34TyBPwawaPZ
</commit_message>
<xml_diff>
--- a/misq_note/hf/MANUSCRIPT_MISQ_v2.docx
+++ b/misq_note/hf/MANUSCRIPT_MISQ_v2.docx
@@ -2,7 +2,7 @@
 <file path=word/document.xml><?xml version="1.0" encoding="utf-8"?>
 <w:document xmlns:w="http://schemas.openxmlformats.org/wordprocessingml/2006/main" xmlns:m="http://schemas.openxmlformats.org/officeDocument/2006/math" xmlns:r="http://schemas.openxmlformats.org/officeDocument/2006/relationships" xmlns:o="urn:schemas-microsoft-com:office:office" xmlns:v="urn:schemas-microsoft-com:vml" xmlns:w10="urn:schemas-microsoft-com:office:word" xmlns:a="http://schemas.openxmlformats.org/drawingml/2006/main" xmlns:pic="http://schemas.openxmlformats.org/drawingml/2006/picture" xmlns:wp="http://schemas.openxmlformats.org/drawingml/2006/wordprocessingDrawing">
   <w:body>
-    <w:bookmarkStart w:id="64" w:name="Xd843f14cd1fee397f8d6847dbb12b7ac644a355"/>
+    <w:bookmarkStart w:id="65" w:name="Xd843f14cd1fee397f8d6847dbb12b7ac644a355"/>
     <w:p>
       <w:pPr>
         <w:pStyle w:val="Heading1"/>
@@ -275,7 +275,7 @@
         <w:t xml:space="preserve"> </w:t>
       </w:r>
       <w:r>
-        <w:t xml:space="preserve">of impact. The account predicts magnitude, |reaction|, rather than the sign assigned by a classifier; the sign depends on which direction the message moves π. During the closure, the prior probability of de-escalation was low and that of continued closure high, so a de-escalation announcement is high-surprisal and an escalation threat low-surprisal. The apparent asymmetry between de-escalation and escalation posts is thus an implication of the prior, not an additional assumption.</w:t>
+        <w:t xml:space="preserve">of impact, and it is the one we state with most care. The 2026 closure and the 2017–2021 sample (Section 4.7) show opposite directional asymmetries in oil, which we read, after the fact, as the prior at work: when closure is the prior, relief is the improbable message; when peace is the prior, a threat is. We turn that post hoc reading into a proposition (P6) and test it with a variable, the recent balance of escalatory and de-escalatory messages, that is measured from labels alone and registered before the tariff-sample returns were examined (Section 4.8). The account predicts magnitude, |reaction|, rather than the sign assigned by a classifier; the sign depends on which direction the message moves π. During the closure, the prior probability of de-escalation was low and that of continued closure high, so a de-escalation announcement is high-surprisal and an escalation threat low-surprisal. The apparent asymmetry between de-escalation and escalation posts is thus an implication of the prior, not an additional assumption.</w:t>
       </w:r>
     </w:p>
     <w:bookmarkEnd w:id="23"/>
@@ -344,6 +344,12 @@
       </w:r>
       <w:r>
         <w:t xml:space="preserve">P5 (redundancy): re-posts, links, and repeats carry little information and produce little reaction.</w:t>
+      </w:r>
+      <w:r>
+        <w:t xml:space="preserve"> </w:t>
+      </w:r>
+      <w:r>
+        <w:t xml:space="preserve">P6 (state-dependent sign): the sign of the response is not fixed by the message class but by the prior. A message that runs against the market’s recent regime moves prices more than a message that continues it, so de-escalation announcements should move prices more when the recent regime has been escalatory, and escalation announcements more when it has been de-escalatory.</w:t>
       </w:r>
     </w:p>
     <w:p>
@@ -580,7 +586,7 @@
     </w:p>
     <w:bookmarkEnd w:id="33"/>
     <w:bookmarkEnd w:id="34"/>
-    <w:bookmarkStart w:id="51" w:name="results"/>
+    <w:bookmarkStart w:id="52" w:name="results"/>
     <w:p>
       <w:pPr>
         <w:pStyle w:val="Heading2"/>
@@ -1777,12 +1783,30 @@
         <w:pStyle w:val="BodyText"/>
       </w:pPr>
       <w:r>
-        <w:t xml:space="preserve">The directional response differs from 2026 in sign. Among tweets that both model instances label escalation (n = 32), oil rose by 0.51% in the 30 minutes after the tweet (median +0.09%; one-sided Wilcoxon p = 0.001); the preceding 30 minutes show +0.04%, and the excess is +0.50 points (p = 0.010). Among tweets labelled de-escalation (n = 11) the response is +0.18% in the expected direction and not significant (p = 0.22), too few to conclude. With the strait closed in 2026 the pattern was the reverse: de-escalation moved oil, and escalation did so when humans, not the model, labelled it. An information-theoretic account can accommodate this (a message is informative when it changes beliefs about the state to which the market assigns little probability: relief when closure is the prior, threat when peace is), but we had not pre-registered the sign flip, and we offer it as a post hoc reading to be tested with human labels and a third period. Finally, the standardized reaction is larger in the 2026 posts (mean 1.39 against 0.84; exploratory permutation p = 0.002); the comparison is confounded with the war and cannot isolate the platform.</w:t>
+        <w:t xml:space="preserve">The directional response differs from 2026 in sign. Among tweets that both model instances label escalation (n = 32), oil rose by 0.51% in the 30 minutes after the tweet (median +0.09%; one-sided Wilcoxon p = 0.001); the preceding 30 minutes show +0.04%, and the excess is +0.50 points (p = 0.010). Among tweets labelled de-escalation (n = 11) the response is +0.18% in the expected direction and not significant (p = 0.22), too few to conclude. With the strait closed in 2026 the pattern was the reverse: de-escalation moved oil, and escalation did so when humans, not the model, labelled it. An information-theoretic account can accommodate this (a message is informative when it changes beliefs about the state to which the market assigns little probability: relief when closure is the prior, threat when peace is), but we had not pre-registered the sign flip, and we offer it as a post hoc reading. P6 turns it into a prediction that is tested on the tariff and trade tweets of the same period, with a plan registered before their returns were examined (ANALYSIS_PLAN_TARIFF.md, Amendment 1); human labels for the oil sample are also pending. Finally, the standardized reaction is larger in the 2026 posts (mean 1.39 against 0.84; exploratory permutation p = 0.002); the comparison is confounded with the war and cannot isolate the platform.</w:t>
       </w:r>
     </w:p>
     <w:bookmarkEnd w:id="50"/>
+    <w:bookmarkStart w:id="51" w:name="Xf901202c13dd620e3f0b286dfd91f9aab10eb93"/>
+    <w:p>
+      <w:pPr>
+        <w:pStyle w:val="Heading3"/>
+      </w:pPr>
+      <w:r>
+        <w:t xml:space="preserve">4.8 A pre-registered test of the state-dependent sign (tariff tweets; pending)</w:t>
+      </w:r>
+    </w:p>
+    <w:p>
+      <w:pPr>
+        <w:pStyle w:val="FirstParagraph"/>
+      </w:pPr>
+      <w:r>
+        <w:t xml:space="preserve">The state-dependence reading of Section 4.7 was formed after the oil results, so it cannot be tested on them. For the tariff, trade, and China tweets of 2017–2021 (937 original tweets; 632 after the three-hour filter) we registered the test before any price or return was examined. A regime variable R is computed from the two model labels alone: the balance of escalation and de-escalation among the same author’s labelled trade tweets in the preceding 30 days, so that R &gt; 0 marks a hawkish recent regime. The prediction (H12) is that the directional 30-minute S&amp;P 500 return is larger when the message runs against the regime, tested as the coefficient on s × R, with s = +1 for de-escalation and −1 for escalation, in a regression with class-specific intercepts and standard errors clustered by day (one-sided, α = 0.05). The tariff sample also carries the pre-registered novelty and uncertainty propositions (HI1–HI3) and the directional test, with S&amp;P 500 index CFD ticks and USD/CNH as secondary asset. The tick data and human labels for this sample are being collected, so no result is reported here [to be completed before submission]. If H12 is not supported, the sign flip stays a post hoc observation and carries no theoretical weight.</w:t>
+      </w:r>
+    </w:p>
     <w:bookmarkEnd w:id="51"/>
-    <w:bookmarkStart w:id="57" w:name="discussion"/>
+    <w:bookmarkEnd w:id="52"/>
+    <w:bookmarkStart w:id="58" w:name="discussion"/>
     <w:p>
       <w:pPr>
         <w:pStyle w:val="Heading2"/>
@@ -1791,7 +1815,7 @@
         <w:t xml:space="preserve">5. Discussion</w:t>
       </w:r>
     </w:p>
-    <w:bookmarkStart w:id="52" w:name="what-the-evidence-supports"/>
+    <w:bookmarkStart w:id="53" w:name="what-the-evidence-supports"/>
     <w:p>
       <w:pPr>
         <w:pStyle w:val="Heading3"/>
@@ -1808,8 +1832,8 @@
         <w:t xml:space="preserve">The evidence supports four statements. First, platform speech by a head of state arrives as an overdispersed, bursty process whose timing follows volatile market hours. Second, during a period of high uncertainty about one physical state, oil co-moved with posts that humans label de-escalation (about +1.05% in 30 minutes) and, at about half the size, with posts that humans label escalation (+0.48%), and not with posts on topics lacking comparable uncertainty; the model’s labels had suggested a one-sided response because its escalation label is mostly wrong. Third, that co-movement is robust to rank-based and block inference and to standardization, yet at hourly resolution it cannot be separated from drift that precedes the post; at tick resolution, on human-labelled posts, the 30 minutes after the post exceed the 30 minutes before it by 0.48 points (p = 0.030). Fourth, variables that the information-theoretic account says should matter, novelty and prior uncertainty, have the predicted sign consistently in the 2026 sample but are not individually significant, and in an independent 2017–2021 sample they are not supported at all, while the information transferred from post class to return direction is detectably above chance during the closure only. Fifth, the sign of the directional response depends on the state: with the strait closed, de-escalation moved oil; with it open, escalation did.</w:t>
       </w:r>
     </w:p>
-    <w:bookmarkEnd w:id="52"/>
-    <w:bookmarkStart w:id="53" w:name="contributions"/>
+    <w:bookmarkEnd w:id="53"/>
+    <w:bookmarkStart w:id="54" w:name="contributions"/>
     <w:p>
       <w:pPr>
         <w:pStyle w:val="Heading3"/>
@@ -1839,11 +1863,19 @@
         <w:pStyle w:val="BodyText"/>
       </w:pPr>
       <w:r>
-        <w:t xml:space="preserve">A third contribution is methodological. The design (written plans before estimation, independent model coders blind to outcomes, explicit power calculations, dated amendments, pre-registered placebos, and independent timing checks) allowed us to report that the headline result is robust in some respects and not in others, and that three mechanisms and two content-analytic propositions could not be confirmed. It also caught a misclassification that would have produced a false headline.</w:t>
-      </w:r>
-    </w:p>
-    <w:bookmarkEnd w:id="53"/>
-    <w:bookmarkStart w:id="54" w:name="implications-for-practice"/>
+        <w:t xml:space="preserve">A third contribution is a proposition about the sign of the response. Platform speech does not move a price in a fixed direction according to its content; it moves it when it runs against what the market already expects of the state. Oil responded to relief in the closure and to threats in the open-strait years, which is the pattern P6 implies, and we put the proposition in a form that the tariff sample can refute. Until that test is reported the proposition is a post hoc reading of two oil samples and it should be weighed as such.</w:t>
+      </w:r>
+    </w:p>
+    <w:p>
+      <w:pPr>
+        <w:pStyle w:val="BodyText"/>
+      </w:pPr>
+      <w:r>
+        <w:t xml:space="preserve">A fourth contribution is methodological. The design (written plans before estimation, independent model coders blind to outcomes, explicit power calculations, dated amendments, pre-registered placebos, and independent timing checks) allowed us to report that the headline result is robust in some respects and not in others, and that three mechanisms and two content-analytic propositions could not be confirmed. It also caught a misclassification that would have produced a false headline.</w:t>
+      </w:r>
+    </w:p>
+    <w:bookmarkEnd w:id="54"/>
+    <w:bookmarkStart w:id="55" w:name="implications-for-practice"/>
     <w:p>
       <w:pPr>
         <w:pStyle w:val="Heading3"/>
@@ -1860,8 +1892,8 @@
         <w:t xml:space="preserve">For analysts who monitor executive feeds, the account suggests weighting a message by its novelty relative to recent messages and by the current uncertainty about the state it concerns, and ignoring re-posts and links. For platform operators and regulators, the account highlights that when a platform is the first channel for decisions, the information advantage in the interval before secondary coverage is concentrated at the platform; we make no claim about any trading behavior.</w:t>
       </w:r>
     </w:p>
-    <w:bookmarkEnd w:id="54"/>
-    <w:bookmarkStart w:id="55" w:name="limitations"/>
+    <w:bookmarkEnd w:id="55"/>
+    <w:bookmarkStart w:id="56" w:name="limitations"/>
     <w:p>
       <w:pPr>
         <w:pStyle w:val="Heading3"/>
@@ -1878,8 +1910,8 @@
         <w:t xml:space="preserve">The coders are model instances, and the human validation (Section 4.6) shows only moderate agreement with them (κ = 0.43 and 0.56 against the human consensus; 0.51 between the humans), with de-escalation precision of about one half; the two instances are copies of one model and agree with each other (κ = 0.74) far more than with either human. Every model-labelled result is therefore conditional on a labelling that is not validated. Posting times are endogenous: posts follow volatile hours, and all 20 triangulated cases show other drivers; neither the momentum control nor the first-source classification resolves simultaneity, and the latter is itself an upper bound. Hourly bars cannot separate the post from the preceding hour. The tick analysis can, but it uses a CFD rather than exchange futures, 33 de-escalation events, and one asset; the matched-hour placebo is pending. Prior uncertainty is proxied by relative volatility and novelty by redundancy relative to the account’s own recent posts, neither of which is the market’s information set; weak measures of both would lower power. The war-period result rests on 33 events, two of which supply half of the mean. The 2017–2021 sample adds a second period but not a second sender; it uses model labels only (human labelling is pending), loses 31% of events to closed markets, and its two novelty measures disagree. The sample contains one conflict and one administration. We tested four sets of mechanisms and confirmed none; we cannot exclude that a different formulation would succeed. The plans are not registered with an independent registry, and several were written after related results had been seen.</w:t>
       </w:r>
     </w:p>
-    <w:bookmarkEnd w:id="55"/>
-    <w:bookmarkStart w:id="56" w:name="future-research"/>
+    <w:bookmarkEnd w:id="56"/>
+    <w:bookmarkStart w:id="57" w:name="future-research"/>
     <w:p>
       <w:pPr>
         <w:pStyle w:val="Heading3"/>
@@ -1896,9 +1928,9 @@
         <w:t xml:space="preserve">The most informative next steps are extension of the tick-level design to several assets and to exchange futures, with a completed placebo; a continuous measure of physical constraint (tanker transits, insurance spreads, term-structure) as a measure of prior uncertainty; prospective collection, under the protocol we registered, of counterparty denials and concurrent news; and a sample large enough to test redundancy (roughly 480 to 560 signal posts for the habituation effect).</w:t>
       </w:r>
     </w:p>
-    <w:bookmarkEnd w:id="56"/>
     <w:bookmarkEnd w:id="57"/>
-    <w:bookmarkStart w:id="58" w:name="conclusion"/>
+    <w:bookmarkEnd w:id="58"/>
+    <w:bookmarkStart w:id="59" w:name="conclusion"/>
     <w:p>
       <w:pPr>
         <w:pStyle w:val="Heading2"/>
@@ -1922,8 +1954,8 @@
         </w:pict>
       </w:r>
     </w:p>
-    <w:bookmarkEnd w:id="58"/>
-    <w:bookmarkStart w:id="59" w:name="declarations-to-be-completed"/>
+    <w:bookmarkEnd w:id="59"/>
+    <w:bookmarkStart w:id="60" w:name="declarations-to-be-completed"/>
     <w:p>
       <w:pPr>
         <w:pStyle w:val="Heading2"/>
@@ -1968,8 +2000,8 @@
         <w:t xml:space="preserve">Code, pre-registration files, coder outputs, and results are in the project repository; the post archive and market data come from public sources [add repository DOI].</w:t>
       </w:r>
     </w:p>
-    <w:bookmarkEnd w:id="59"/>
-    <w:bookmarkStart w:id="60" w:name="references"/>
+    <w:bookmarkEnd w:id="60"/>
+    <w:bookmarkStart w:id="61" w:name="references"/>
     <w:p>
       <w:pPr>
         <w:pStyle w:val="Heading2"/>
@@ -2660,8 +2692,8 @@
         <w:t xml:space="preserve">(62:3), pp. 1139–1168.</w:t>
       </w:r>
     </w:p>
-    <w:bookmarkEnd w:id="60"/>
-    <w:bookmarkStart w:id="61" w:name="appendix-a.-pre-registration-ledger"/>
+    <w:bookmarkEnd w:id="61"/>
+    <w:bookmarkStart w:id="62" w:name="appendix-a.-pre-registration-ledger"/>
     <w:p>
       <w:pPr>
         <w:pStyle w:val="Heading2"/>
@@ -3522,24 +3554,24 @@
                 <w:rFonts w:ascii="Times New Roman" w:hAnsi="Times New Roman"/>
                 <w:sz w:val="19"/>
               </w:rPr>
-              <w:t xml:space="preserve">twitter/ANALYSIS_PLAN_TARIFF.md</w:t>
-            </w:r>
-          </w:p>
-        </w:tc>
-        <w:tc>
-          <w:tcPr/>
-          <w:p>
-            <w:pPr>
-              <w:pStyle w:val="Compact"/>
-              <w:spacing w:line="240" w:lineRule="auto" w:after="40"/>
-              <w:jc w:val="left"/>
-            </w:pPr>
-            <w:r>
-              <w:rPr>
-                <w:rFonts w:ascii="Times New Roman" w:hAnsi="Times New Roman"/>
-                <w:sz w:val="19"/>
-              </w:rPr>
-              <w:t xml:space="preserve">Registered; tick data and labels in progress</w:t>
+              <w:t xml:space="preserve">twitter/ANALYSIS_PLAN_TARIFF.md (Amendment 1: P6/H12 state-dependent sign)</w:t>
+            </w:r>
+          </w:p>
+        </w:tc>
+        <w:tc>
+          <w:tcPr/>
+          <w:p>
+            <w:pPr>
+              <w:pStyle w:val="Compact"/>
+              <w:spacing w:line="240" w:lineRule="auto" w:after="40"/>
+              <w:jc w:val="left"/>
+            </w:pPr>
+            <w:r>
+              <w:rPr>
+                <w:rFonts w:ascii="Times New Roman" w:hAnsi="Times New Roman"/>
+                <w:sz w:val="19"/>
+              </w:rPr>
+              <w:t xml:space="preserve">Registered before returns; tick data and human labels in progress</w:t>
             </w:r>
           </w:p>
         </w:tc>
@@ -3757,8 +3789,8 @@
         </w:tc>
       </w:tr>
     </w:tbl>
-    <w:bookmarkEnd w:id="61"/>
-    <w:bookmarkStart w:id="62" w:name="appendix-b.-coding-protocol"/>
+    <w:bookmarkEnd w:id="62"/>
+    <w:bookmarkStart w:id="63" w:name="appendix-b.-coding-protocol"/>
     <w:p>
       <w:pPr>
         <w:pStyle w:val="Heading2"/>
@@ -3775,8 +3807,8 @@
         <w:t xml:space="preserve">[Summary of direction and type definitions, blind-coding instructions, the primary-label rule, reconciliation of content-analysis codebooks, the model and prompt provenance, and a reference to the repository files.]</w:t>
       </w:r>
     </w:p>
-    <w:bookmarkEnd w:id="62"/>
-    <w:bookmarkStart w:id="63" w:name="appendix-c.-human-validation"/>
+    <w:bookmarkEnd w:id="63"/>
+    <w:bookmarkStart w:id="64" w:name="appendix-c.-human-validation"/>
     <w:p>
       <w:pPr>
         <w:pStyle w:val="Heading2"/>
@@ -3793,8 +3825,8 @@
         <w:t xml:space="preserve">Two human coders coded 150 posts independently from text only (war-period 67, pre-war Iran 23, other oil-geopolitics 60). Four-class kappa: human–human 0.51; model 1–model 2 0.74; human consensus (97 posts) with model 1 0.43 and with model 2 0.56 (three-class 0.48 and 0.59). De-escalation precision against the consensus is 0.52 (model 1) and 0.54 (model 2); recall 0.77 and 0.88. Of the 12 posts in the tick-level de-escalation sample that fall in the round-1 human sample, the human consensus is de-escalation for 3, escalation for 2, other for 1, and absent for 6. In round 2 (all 61 war-period signal posts, codebook v2, κ between humans 0.69, 13 disagreements adjudicated), the final human labels are 25 de-escalation, 11 escalation, 12 mixed, and 13 other; the model agrees at κ = 0.29. On the 25 human-labelled de-escalation posts the 30-minute directional return is +1.03% (p = 0.0015) and its excess over the preceding 30 minutes +0.35% (p = 0.082). Details are in RESULTS_HUMAN.md and RESULTS_HUMAN61.md.</w:t>
       </w:r>
     </w:p>
-    <w:bookmarkEnd w:id="63"/>
     <w:bookmarkEnd w:id="64"/>
+    <w:bookmarkEnd w:id="65"/>
     <w:sectPr>
       <w:pgMar w:bottom="1440" w:left="1440" w:right="1440" w:top="1440"/>
     </w:sectPr>

</xml_diff>

<commit_message>
Manuscript v2: tariff-sample results (HI2 supported with caveat; H12 not supported); P6 downgraded; Word regenerated
Co-Authored-By: Claude Sonnet 5.5 <noreply@anthropic.com>
Claude-Session: https://claude.ai/code/session_011aZmoPyuUT34TyBPwawaPZ
</commit_message>
<xml_diff>
--- a/misq_note/hf/MANUSCRIPT_MISQ_v2.docx
+++ b/misq_note/hf/MANUSCRIPT_MISQ_v2.docx
@@ -52,7 +52,7 @@
         <w:pStyle w:val="FirstParagraph"/>
       </w:pPr>
       <w:r>
-        <w:t xml:space="preserve">Heads of state now announce policy on social platforms, and markets read those feeds in real time. Existing accounts explain market reactions to such speech with attention, salience, or sentiment, but they say little about why identical channels produce messages that sometimes move prices and sometimes do not. We propose an information-theoretic account. A post updates a market’s belief over states of the world; the size of the update depends on the message’s surprisal under the market’s prior, on the prior’s entropy, and on the channel’s reliability, while redundant messages carry no bits. We examine the account using 4,838 posts from the U.S. president’s platform (March–October 2026), hourly futures data, and the 2026 closure of the Strait of Hormuz, a period of unusually high prior uncertainty about a single physical state. Posting is overdispersed and bursty yet conditionally Poisson, and it follows volatile hours. During the closure, oil fell 1.29% (median 0.31%) over two hours after posts that a model coded as de-escalation. All 191 war-period keyword posts were then labelled by two humans (κ = 0.61 to 0.69; disagreements adjudicated), and the model’s labels agree with them only moderately (κ = 0.50). On posts that humans label de-escalation, tick data show a directional move of 0.67% within five minutes and 1.05% within 30 minutes (n = 29, p = 0.0002), exceeding the preceding 30 minutes by 0.48% (p = 0.030). Posts that humans label escalation (n = 16) are followed by 0.48% (p = 0.007), a response that the model’s labels hide because only 36% of its escalation labels are escalation in human judgment; the difference between the two directions is not distinguishable from zero. Posts on monetary policy or non-tariff China matters show no hourly response. Pre-registered measures of novelty and prior uncertainty have the predicted sign in every topic and in a 2022–2024 replication, but none clears its threshold (p = 0.08, 0.07), while mutual information between post class and return direction is above its null during the closure (p = 0.041) and not before. In an independent sample of 191 oil- and Iran-related tweets from 2017–2021, when the strait was open, the three propositions are again not supported (Holm-adjusted p ≥ 0.45), and the direction of the response reverses: oil rises by 0.51% within 30 minutes after tweets that the models label escalation (p = 0.001) and does not respond to de-escalation tweets, so the sign of the response depends on the state. We read the account as an organizing framework that fits the evidence without being confirmed by it, and we document the design that makes that statement credible.</w:t>
+        <w:t xml:space="preserve">Heads of state now announce policy on social platforms, and markets read those feeds in real time. Existing accounts explain market reactions to such speech with attention, salience, or sentiment, but they say little about why identical channels produce messages that sometimes move prices and sometimes do not. We propose an information-theoretic account. A post updates a market’s belief over states of the world; the size of the update depends on the message’s surprisal under the market’s prior, on the prior’s entropy, and on the channel’s reliability, while redundant messages carry no bits. We examine the account using 4,838 posts from the U.S. president’s platform (March–October 2026), hourly futures data, and the 2026 closure of the Strait of Hormuz, a period of unusually high prior uncertainty about a single physical state. Posting is overdispersed and bursty yet conditionally Poisson, and it follows volatile hours. During the closure, oil fell 1.29% (median 0.31%) over two hours after posts that a model coded as de-escalation. All 191 war-period keyword posts were then labelled by two humans (κ = 0.61 to 0.69; disagreements adjudicated), and the model’s labels agree with them only moderately (κ = 0.50). On posts that humans label de-escalation, tick data show a directional move of 0.67% within five minutes and 1.05% within 30 minutes (n = 29, p = 0.0002), exceeding the preceding 30 minutes by 0.48% (p = 0.030). Posts that humans label escalation (n = 16) are followed by 0.48% (p = 0.007), a response that the model’s labels hide because only 36% of its escalation labels are escalation in human judgment; the difference between the two directions is not distinguishable from zero. Posts on monetary policy or non-tariff China matters show no hourly response. Pre-registered measures of novelty and prior uncertainty have the predicted sign in every topic and in a 2022–2024 replication, but none clears its threshold (p = 0.08, 0.07), while mutual information between post class and return direction is above its null during the closure (p = 0.041) and not before. In an independent sample of 191 oil- and Iran-related tweets from 2017–2021, when the strait was open, the three propositions are again not supported (Holm-adjusted p ≥ 0.45), and the direction of the response reverses: oil rises by 0.51% within 30 minutes after tweets that the models label escalation (p = 0.001) and does not respond to de-escalation tweets, so the sign of the response seems to depend on the state. In 410 tariff and trade tweets, prior uncertainty is supported (Holm-adjusted p &lt; 0.001) although it is confounded with volatility clustering, novelty and the interaction are not, responses in the expected direction are small (0.05–0.09% of the index), and a pre-registered state-dependent sign proposition fails, in the opposite direction. We read the account as an organizing framework that fits the evidence without being confirmed by it, and we document the design that makes that statement credible.</w:t>
       </w:r>
     </w:p>
     <w:p>
@@ -127,7 +127,7 @@
         <w:pStyle w:val="BodyText"/>
       </w:pPr>
       <w:r>
-        <w:t xml:space="preserve">We therefore claim a framework and a pattern of evidence, not a confirmed mechanism. Four further contributions are secondary. First, we document the arrival process of presidential posts and show that event-study designs that treat posting times as random are fragile. Second, we show how pre-registered plans, independent model-instance coders working blind to outcomes, and explicit power reporting can make negative and ambiguous results interpretable; three earlier mechanisms (binding constraint, salience, habituation) were pre-registered and none was confirmed, and we report all of them. Third, we test the account in an independent 2017–2021 sample of the same author’s tweets with a different asset regime, and the pre-registered propositions are again not supported while the sign of the directional response reverses with the state of the strait. Fourth, we describe what we could not do, namely establish causality, validate model coding against human coders (the validation shows moderate agreement only), and test the account with a continuous measure of the physical constraint.</w:t>
+        <w:t xml:space="preserve">We therefore claim a framework and a pattern of evidence, not a confirmed mechanism. Four further contributions are secondary. First, we document the arrival process of presidential posts and show that event-study designs that treat posting times as random are fragile. Second, we show how pre-registered plans, independent model-instance coders working blind to outcomes, and explicit power reporting can make negative and ambiguous results interpretable; three earlier mechanisms (binding constraint, salience, habituation) were pre-registered and none was confirmed, and we report all of them. Third, we test the account in independent 2017–2021 samples of the same author’s tweets (oil and Iran; tariffs and trade) under plans registered before returns were examined: the propositions about novelty and the interaction are not supported in either, prior uncertainty is supported in the tariff tweets with a volatility-clustering caveat, the sign of the oil response differs between the closed-strait and open-strait periods, and a pre-registered state-dependent sign proposition fails. Fourth, we describe what we could not do, namely establish causality, validate model coding against human coders (the validation shows moderate agreement only), and test the account with a continuous measure of the physical constraint.</w:t>
       </w:r>
     </w:p>
     <w:p>
@@ -349,7 +349,7 @@
         <w:t xml:space="preserve"> </w:t>
       </w:r>
       <w:r>
-        <w:t xml:space="preserve">P6 (state-dependent sign): the sign of the response is not fixed by the message class but by the prior. A message that runs against the market’s recent regime moves prices more than a message that continues it, so de-escalation announcements should move prices more when the recent regime has been escalatory, and escalation announcements more when it has been de-escalatory.</w:t>
+        <w:t xml:space="preserve">P6 (state-dependent sign): the sign of the response is not fixed by the message class but by the prior. A message that runs against the market’s recent regime moves prices more than a message that continues it, so de-escalation announcements should move prices more when the recent regime has been escalatory, and escalation announcements more when it has been de-escalatory. (P6 is not supported in the pre-registered test of Section 4.8.)</w:t>
       </w:r>
     </w:p>
     <w:p>
@@ -1787,13 +1787,13 @@
       </w:r>
     </w:p>
     <w:bookmarkEnd w:id="50"/>
-    <w:bookmarkStart w:id="51" w:name="Xf901202c13dd620e3f0b286dfd91f9aab10eb93"/>
+    <w:bookmarkStart w:id="51" w:name="X5dc7f9b3b0e8d4672e4bbe835f31e80bcbadda9"/>
     <w:p>
       <w:pPr>
         <w:pStyle w:val="Heading3"/>
       </w:pPr>
       <w:r>
-        <w:t xml:space="preserve">4.8 A pre-registered test of the state-dependent sign (tariff tweets; pending)</w:t>
+        <w:t xml:space="preserve">4.8 A pre-registered test in the tariff and trade tweets</w:t>
       </w:r>
     </w:p>
     <w:p>
@@ -1801,7 +1801,61 @@
         <w:pStyle w:val="FirstParagraph"/>
       </w:pPr>
       <w:r>
-        <w:t xml:space="preserve">The state-dependence reading of Section 4.7 was formed after the oil results, so it cannot be tested on them. For the tariff, trade, and China tweets of 2017–2021 (937 original tweets; 632 after the three-hour filter) we registered the test before any price or return was examined. A regime variable R is computed from the two model labels alone: the balance of escalation and de-escalation among the same author’s labelled trade tweets in the preceding 30 days, so that R &gt; 0 marks a hawkish recent regime. The prediction (H12) is that the directional 30-minute S&amp;P 500 return is larger when the message runs against the regime, tested as the coefficient on s × R, with s = +1 for de-escalation and −1 for escalation, in a regression with class-specific intercepts and standard errors clustered by day (one-sided, α = 0.05). The tariff sample also carries the pre-registered novelty and uncertainty propositions (HI1–HI3) and the directional test, with S&amp;P 500 index CFD ticks and USD/CNH as secondary asset. The tick data and human labels for this sample are being collected, so no result is reported here [to be completed before submission]. If H12 is not supported, the sign flip stays a post hoc observation and carries no theoretical weight.</w:t>
+        <w:t xml:space="preserve">The state-dependence reading of Section 4.7 was formed after the oil results, so it could not be tested on them. For the tariff, trade, and China tweets of 2017–2021 (937 original tweets; 632 after the three-hour filter; 410 with a tick window of the S&amp;P 500 index CFD; labels from two model instances, κ = 0.80, human labels pending) we registered the test before any price or return was examined (ANALYSIS_PLAN_TARIFF.md and its Amendment 1).</w:t>
+      </w:r>
+    </w:p>
+    <w:p>
+      <w:pPr>
+        <w:pStyle w:val="BodyText"/>
+      </w:pPr>
+      <w:r>
+        <w:rPr>
+          <w:iCs/>
+          <w:i/>
+        </w:rPr>
+        <w:t xml:space="preserve">Novelty, uncertainty, and their interaction.</w:t>
+      </w:r>
+      <w:r>
+        <w:t xml:space="preserve"> </w:t>
+      </w:r>
+      <w:r>
+        <w:t xml:space="preserve">Prior uncertainty is supported: the coefficient of U on the standardized absolute 30-minute reaction is +0.40 (SE 0.10; one-sided p &lt; 0.001; Holm-adjusted 0.0001). Novelty (−0.05, SE 0.68; Holm-adjusted p = 0.74) and the interaction (+0.32, SE 0.97; 0.74) are not. The result for U needs a caveat that restricts its meaning: U is the log ratio of recent to long-run daily volatility and the outcome is scaled by long-run volatility, so the coefficient is what the persistence of volatility predicts without any account of information. It is consistent with our account but does not distinguish it from volatility clustering, and in the oil sample the same coefficient was not significant (p = 0.15).</w:t>
+      </w:r>
+    </w:p>
+    <w:p>
+      <w:pPr>
+        <w:pStyle w:val="BodyText"/>
+      </w:pPr>
+      <w:r>
+        <w:rPr>
+          <w:iCs/>
+          <w:i/>
+        </w:rPr>
+        <w:t xml:space="preserve">Direction.</w:t>
+      </w:r>
+      <w:r>
+        <w:t xml:space="preserve"> </w:t>
+      </w:r>
+      <w:r>
+        <w:t xml:space="preserve">Among tweets with an agreed label, the S&amp;P 500 rose by 0.085% in the 30 minutes after de-escalation tweets (n = 70; one-sided Wilcoxon p = 0.0007) and fell by 0.046% after escalation tweets (n = 50; p = 0.024); the excess over the preceding 30 minutes is significant for escalation (p = 0.048) and not for de-escalation (p = 0.099). Both responses have the expected sign and are small in index terms.</w:t>
+      </w:r>
+    </w:p>
+    <w:p>
+      <w:pPr>
+        <w:pStyle w:val="BodyText"/>
+      </w:pPr>
+      <w:r>
+        <w:rPr>
+          <w:iCs/>
+          <w:i/>
+        </w:rPr>
+        <w:t xml:space="preserve">State-dependent sign.</w:t>
+      </w:r>
+      <w:r>
+        <w:t xml:space="preserve"> </w:t>
+      </w:r>
+      <w:r>
+        <w:t xml:space="preserve">A regime variable R, computed from labels alone as the balance of escalatory and de-escalatory trade tweets in the preceding 30 days, was used to test P6: a message that runs against the regime should move prices more than one that continues it (H12). Among 108 tweets with a defined regime the coefficient is −0.097 (SE 0.032; one-sided p = 0.9987; two-sided p = 0.003). The effect is in the opposite direction: messages that continued the recent regime moved the index more (mean directional returns of +0.119% for aligned and +0.045% for opposed de-escalation; +0.150% and −0.084% for escalation). By the rule we fixed in advance, P6 is not supported and the sign flip in the oil samples remains a post hoc observation that carries no theoretical weight. A reader should therefore not take the opposite signs of the 2026 and 2017–2021 oil responses as evidence for the account. USD/CNH ticks for the China-related subset have not been analysed [to be completed before submission].</w:t>
       </w:r>
     </w:p>
     <w:bookmarkEnd w:id="51"/>
@@ -1829,7 +1883,7 @@
         <w:pStyle w:val="FirstParagraph"/>
       </w:pPr>
       <w:r>
-        <w:t xml:space="preserve">The evidence supports four statements. First, platform speech by a head of state arrives as an overdispersed, bursty process whose timing follows volatile market hours. Second, during a period of high uncertainty about one physical state, oil co-moved with posts that humans label de-escalation (about +1.05% in 30 minutes) and, at about half the size, with posts that humans label escalation (+0.48%), and not with posts on topics lacking comparable uncertainty; the model’s labels had suggested a one-sided response because its escalation label is mostly wrong. Third, that co-movement is robust to rank-based and block inference and to standardization, yet at hourly resolution it cannot be separated from drift that precedes the post; at tick resolution, on human-labelled posts, the 30 minutes after the post exceed the 30 minutes before it by 0.48 points (p = 0.030). Fourth, variables that the information-theoretic account says should matter, novelty and prior uncertainty, have the predicted sign consistently in the 2026 sample but are not individually significant, and in an independent 2017–2021 sample they are not supported at all, while the information transferred from post class to return direction is detectably above chance during the closure only. Fifth, the sign of the directional response depends on the state: with the strait closed, de-escalation moved oil; with it open, escalation did.</w:t>
+        <w:t xml:space="preserve">The evidence supports four statements. First, platform speech by a head of state arrives as an overdispersed, bursty process whose timing follows volatile market hours. Second, during a period of high uncertainty about one physical state, oil co-moved with posts that humans label de-escalation (about +1.05% in 30 minutes) and, at about half the size, with posts that humans label escalation (+0.48%), and not with posts on topics lacking comparable uncertainty; the model’s labels had suggested a one-sided response because its escalation label is mostly wrong. Third, that co-movement is robust to rank-based and block inference and to standardization, yet at hourly resolution it cannot be separated from drift that precedes the post; at tick resolution, on human-labelled posts, the 30 minutes after the post exceed the 30 minutes before it by 0.48 points (p = 0.030). Fourth, variables that the information-theoretic account says should matter, novelty and prior uncertainty, have the predicted sign consistently in the 2026 sample but are not individually significant, and in an independent 2017–2021 sample they are not supported at all, while the information transferred from post class to return direction is detectably above chance during the closure only. Fifth, in the oil samples the sign of the directional response differed between the closed-strait and open-strait periods: with the strait closed, de-escalation moved oil; with it open, escalation did. We offered the proposition that this reflects the prior (P6), and the pre-registered test in the tariff tweets rejected it, so the difference remains an observation we cannot yet explain.</w:t>
       </w:r>
     </w:p>
     <w:bookmarkEnd w:id="53"/>
@@ -1863,15 +1917,7 @@
         <w:pStyle w:val="BodyText"/>
       </w:pPr>
       <w:r>
-        <w:t xml:space="preserve">A third contribution is a proposition about the sign of the response. Platform speech does not move a price in a fixed direction according to its content; it moves it when it runs against what the market already expects of the state. Oil responded to relief in the closure and to threats in the open-strait years, which is the pattern P6 implies, and we put the proposition in a form that the tariff sample can refute. Until that test is reported the proposition is a post hoc reading of two oil samples and it should be weighed as such.</w:t>
-      </w:r>
-    </w:p>
-    <w:p>
-      <w:pPr>
-        <w:pStyle w:val="BodyText"/>
-      </w:pPr>
-      <w:r>
-        <w:t xml:space="preserve">A fourth contribution is methodological. The design (written plans before estimation, independent model coders blind to outcomes, explicit power calculations, dated amendments, pre-registered placebos, and independent timing checks) allowed us to report that the headline result is robust in some respects and not in others, and that three mechanisms and two content-analytic propositions could not be confirmed. It also caught a misclassification that would have produced a false headline.</w:t>
+        <w:t xml:space="preserve">A third contribution is methodological. The design (written plans before estimation, independent model coders blind to outcomes, explicit power calculations, dated amendments, pre-registered placebos, and independent timing checks) allowed us to report that the headline result is robust in some respects and not in others, and that three mechanisms and two content-analytic propositions could not be confirmed. It also caught a misclassification that would have produced a false headline.</w:t>
       </w:r>
     </w:p>
     <w:bookmarkEnd w:id="54"/>
@@ -1907,7 +1953,7 @@
         <w:pStyle w:val="FirstParagraph"/>
       </w:pPr>
       <w:r>
-        <w:t xml:space="preserve">The coders are model instances, and the human validation (Section 4.6) shows only moderate agreement with them (κ = 0.43 and 0.56 against the human consensus; 0.51 between the humans), with de-escalation precision of about one half; the two instances are copies of one model and agree with each other (κ = 0.74) far more than with either human. Every model-labelled result is therefore conditional on a labelling that is not validated. Posting times are endogenous: posts follow volatile hours, and all 20 triangulated cases show other drivers; neither the momentum control nor the first-source classification resolves simultaneity, and the latter is itself an upper bound. Hourly bars cannot separate the post from the preceding hour. The tick analysis can, but it uses a CFD rather than exchange futures, 33 de-escalation events, and one asset; the matched-hour placebo is pending. Prior uncertainty is proxied by relative volatility and novelty by redundancy relative to the account’s own recent posts, neither of which is the market’s information set; weak measures of both would lower power. The war-period result rests on 33 events, two of which supply half of the mean. The 2017–2021 sample adds a second period but not a second sender; it uses model labels only (human labelling is pending), loses 31% of events to closed markets, and its two novelty measures disagree. The sample contains one conflict and one administration. We tested four sets of mechanisms and confirmed none; we cannot exclude that a different formulation would succeed. The plans are not registered with an independent registry, and several were written after related results had been seen.</w:t>
+        <w:t xml:space="preserve">The coders are model instances, and the human validation (Section 4.6) shows only moderate agreement with them (κ = 0.43 and 0.56 against the human consensus; 0.51 between the humans), with de-escalation precision of about one half; the two instances are copies of one model and agree with each other (κ = 0.74) far more than with either human. Every model-labelled result is therefore conditional on a labelling that is not validated. Posting times are endogenous: posts follow volatile hours, and all 20 triangulated cases show other drivers; neither the momentum control nor the first-source classification resolves simultaneity, and the latter is itself an upper bound. Hourly bars cannot separate the post from the preceding hour. The tick analysis can, but it uses a CFD rather than exchange futures, 33 de-escalation events, and one asset; the matched-hour placebo is pending. Prior uncertainty is proxied by relative volatility and novelty by redundancy relative to the account’s own recent posts, neither of which is the market’s information set; weak measures of both would lower power. The war-period result rests on 33 events, two of which supply half of the mean. The 2017–2021 sample adds a second period but not a second sender; it uses model labels only (human labelling is pending), loses 31% of events to closed markets, and its two novelty measures disagree; the tariff sample loses 35% of events to closed markets, relies on model labels, and its supported uncertainty result is confounded with volatility clustering. The sample contains one conflict and one administration. We tested four sets of mechanisms and confirmed none; we cannot exclude that a different formulation would succeed. The plans are not registered with an independent registry, and several were written after related results had been seen.</w:t>
       </w:r>
     </w:p>
     <w:bookmarkEnd w:id="56"/>
@@ -3571,7 +3617,7 @@
                 <w:rFonts w:ascii="Times New Roman" w:hAnsi="Times New Roman"/>
                 <w:sz w:val="19"/>
               </w:rPr>
-              <w:t xml:space="preserve">Registered before returns; tick data and human labels in progress</w:t>
+              <w:t xml:space="preserve">HI2 supported (Holm p &lt; 0.001; volatility caveat); HI1, HI3 not supported; H10 supported (small); H12 not supported, opposite sign (β = −0.097)</w:t>
             </w:r>
           </w:p>
         </w:tc>

</xml_diff>

<commit_message>
SOX channel: H13 not supported; manuscript and Word updated
Co-Authored-By: Claude Sonnet 5.5 <noreply@anthropic.com>
Claude-Session: https://claude.ai/code/session_011aZmoPyuUT34TyBPwawaPZ
</commit_message>
<xml_diff>
--- a/misq_note/hf/MANUSCRIPT_MISQ_v2.docx
+++ b/misq_note/hf/MANUSCRIPT_MISQ_v2.docx
@@ -1855,7 +1855,23 @@
         <w:t xml:space="preserve"> </w:t>
       </w:r>
       <w:r>
-        <w:t xml:space="preserve">A regime variable R, computed from labels alone as the balance of escalatory and de-escalatory trade tweets in the preceding 30 days, was used to test P6: a message that runs against the regime should move prices more than one that continues it (H12). Among 108 tweets with a defined regime the coefficient is −0.097 (SE 0.032; one-sided p = 0.9987; two-sided p = 0.003). The effect is in the opposite direction: messages that continued the recent regime moved the index more (mean directional returns of +0.119% for aligned and +0.045% for opposed de-escalation; +0.150% and −0.084% for escalation). By the rule we fixed in advance, P6 is not supported and the sign flip in the oil samples remains a post hoc observation that carries no theoretical weight. A reader should therefore not take the opposite signs of the 2026 and 2017–2021 oil responses as evidence for the account. USD/CNH ticks for the China-related subset have not been analysed [to be completed before submission].</w:t>
+        <w:t xml:space="preserve">A regime variable R, computed from labels alone as the balance of escalatory and de-escalatory trade tweets in the preceding 30 days, was used to test P6: a message that runs against the regime should move prices more than one that continues it (H12). Among 108 tweets with a defined regime the coefficient is −0.097 (SE 0.032; one-sided p = 0.9987; two-sided p = 0.003). The effect is in the opposite direction: messages that continued the recent regime moved the index more (mean directional returns of +0.119% for aligned and +0.045% for opposed de-escalation; +0.150% and −0.084% for escalation). By the rule we fixed in advance, P6 is not supported and the sign flip in the oil samples remains a post hoc observation that carries no theoretical weight. A reader should therefore not take the opposite signs of the 2026 and 2017–2021 oil responses as evidence for the account.</w:t>
+      </w:r>
+      <w:r>
+        <w:t xml:space="preserve"> </w:t>
+      </w:r>
+      <w:r>
+        <w:rPr>
+          <w:iCs/>
+          <w:i/>
+        </w:rPr>
+        <w:t xml:space="preserve">Semiconductor channel.</w:t>
+      </w:r>
+      <w:r>
+        <w:t xml:space="preserve"> </w:t>
+      </w:r>
+      <w:r>
+        <w:t xml:space="preserve">Because trade measures aimed at China bear more directly on semiconductors, a secondary test (registered in Amendment 2 before any semiconductor return was computed) used the daily abnormal return of the Philadelphia Semiconductor Index relative to the S&amp;P 500 (market-model beta from the preceding 250 trading days) for tweets outside regular hours, mapped to the next session. In the China-related subset (63 events; 51 day-class observations) the mean directional abnormal return is +0.14% (median +0.03%; one-sided Wilcoxon p = 0.155) and for all tariff tweets +0.02% (p = 0.49); the semiconductor response does not exceed the response of the index. Neither is supported, so no tick-level basket was built. USD/CNH ticks for the China-related subset have not been analysed [to be completed before submission].</w:t>
       </w:r>
     </w:p>
     <w:bookmarkEnd w:id="51"/>

</xml_diff>

<commit_message>
Manuscript: remove SOX discussion from text (ledger note kept); Word regenerated
Co-Authored-By: Claude Sonnet 5.5 <noreply@anthropic.com>
Claude-Session: https://claude.ai/code/session_011aZmoPyuUT34TyBPwawaPZ
</commit_message>
<xml_diff>
--- a/misq_note/hf/MANUSCRIPT_MISQ_v2.docx
+++ b/misq_note/hf/MANUSCRIPT_MISQ_v2.docx
@@ -1855,23 +1855,7 @@
         <w:t xml:space="preserve"> </w:t>
       </w:r>
       <w:r>
-        <w:t xml:space="preserve">A regime variable R, computed from labels alone as the balance of escalatory and de-escalatory trade tweets in the preceding 30 days, was used to test P6: a message that runs against the regime should move prices more than one that continues it (H12). Among 108 tweets with a defined regime the coefficient is −0.097 (SE 0.032; one-sided p = 0.9987; two-sided p = 0.003). The effect is in the opposite direction: messages that continued the recent regime moved the index more (mean directional returns of +0.119% for aligned and +0.045% for opposed de-escalation; +0.150% and −0.084% for escalation). By the rule we fixed in advance, P6 is not supported and the sign flip in the oil samples remains a post hoc observation that carries no theoretical weight. A reader should therefore not take the opposite signs of the 2026 and 2017–2021 oil responses as evidence for the account.</w:t>
-      </w:r>
-      <w:r>
-        <w:t xml:space="preserve"> </w:t>
-      </w:r>
-      <w:r>
-        <w:rPr>
-          <w:iCs/>
-          <w:i/>
-        </w:rPr>
-        <w:t xml:space="preserve">Semiconductor channel.</w:t>
-      </w:r>
-      <w:r>
-        <w:t xml:space="preserve"> </w:t>
-      </w:r>
-      <w:r>
-        <w:t xml:space="preserve">Because trade measures aimed at China bear more directly on semiconductors, a secondary test (registered in Amendment 2 before any semiconductor return was computed) used the daily abnormal return of the Philadelphia Semiconductor Index relative to the S&amp;P 500 (market-model beta from the preceding 250 trading days) for tweets outside regular hours, mapped to the next session. In the China-related subset (63 events; 51 day-class observations) the mean directional abnormal return is +0.14% (median +0.03%; one-sided Wilcoxon p = 0.155) and for all tariff tweets +0.02% (p = 0.49); the semiconductor response does not exceed the response of the index. Neither is supported, so no tick-level basket was built. USD/CNH ticks for the China-related subset have not been analysed [to be completed before submission].</w:t>
+        <w:t xml:space="preserve">A regime variable R, computed from labels alone as the balance of escalatory and de-escalatory trade tweets in the preceding 30 days, was used to test P6: a message that runs against the regime should move prices more than one that continues it (H12). Among 108 tweets with a defined regime the coefficient is −0.097 (SE 0.032; one-sided p = 0.9987; two-sided p = 0.003). The effect is in the opposite direction: messages that continued the recent regime moved the index more (mean directional returns of +0.119% for aligned and +0.045% for opposed de-escalation; +0.150% and −0.084% for escalation). By the rule we fixed in advance, P6 is not supported and the sign flip in the oil samples remains a post hoc observation that carries no theoretical weight. A reader should therefore not take the opposite signs of the 2026 and 2017–2021 oil responses as evidence for the account. USD/CNH ticks for the China-related subset have not been analysed [to be completed before submission].</w:t>
       </w:r>
     </w:p>
     <w:bookmarkEnd w:id="51"/>
@@ -3616,7 +3600,7 @@
                 <w:rFonts w:ascii="Times New Roman" w:hAnsi="Times New Roman"/>
                 <w:sz w:val="19"/>
               </w:rPr>
-              <w:t xml:space="preserve">twitter/ANALYSIS_PLAN_TARIFF.md (Amendment 1: P6/H12 state-dependent sign)</w:t>
+              <w:t xml:space="preserve">twitter/ANALYSIS_PLAN_TARIFF.md (Amendments 1–2: P6/H12 state-dependent sign; secondary semiconductor channel H13, daily, not supported, not discussed in the text)</w:t>
             </w:r>
           </w:p>
         </w:tc>

</xml_diff>

<commit_message>
Tariff human validation (adjudicated): kappa 0.34-0.39; H10 not reproduced for de-escalation; H12 not supported; manuscript updated
Co-Authored-By: Claude Sonnet 5.5 <noreply@anthropic.com>
Claude-Session: https://claude.ai/code/session_011aZmoPyuUT34TyBPwawaPZ
</commit_message>
<xml_diff>
--- a/misq_note/hf/MANUSCRIPT_MISQ_v2.docx
+++ b/misq_note/hf/MANUSCRIPT_MISQ_v2.docx
@@ -1849,13 +1849,31 @@
           <w:iCs/>
           <w:i/>
         </w:rPr>
+        <w:t xml:space="preserve">Human validation.</w:t>
+      </w:r>
+      <w:r>
+        <w:t xml:space="preserve"> </w:t>
+      </w:r>
+      <w:r>
+        <w:t xml:space="preserve">Two coders labelled 150 of these tweets (a stratified sample of model-agreed signals, model-disagreed candidates, and model-agreed other tweets; κ between the coders 0.54; 44 disagreements adjudicated from the text). The model labels agree with the final human labels only weakly (κ = 0.39 and 0.34): of the 60 tweets that both models call escalation or de-escalation, humans give the same label to 33 (55%), call 19 other, and reverse the sign of 8; the models almost never miss a signal (1 of 30 model-other tweets is a human signal). On the human labels the directional 30-minute S&amp;P 500 return is −0.10% after de-escalation tweets (n = 20 with a window; one-sided p = 0.49) and +0.058% after escalation tweets (n = 30; p = 0.069; excess over the preceding 30 minutes +0.056, p = 0.026). The response to de-escalation seen with model labels is therefore not reproduced on the human-labelled subset, which is small and not random, and the escalation response is borderline.</w:t>
+      </w:r>
+    </w:p>
+    <w:p>
+      <w:pPr>
+        <w:pStyle w:val="BodyText"/>
+      </w:pPr>
+      <w:r>
+        <w:rPr>
+          <w:iCs/>
+          <w:i/>
+        </w:rPr>
         <w:t xml:space="preserve">State-dependent sign.</w:t>
       </w:r>
       <w:r>
         <w:t xml:space="preserve"> </w:t>
       </w:r>
       <w:r>
-        <w:t xml:space="preserve">A regime variable R, computed from labels alone as the balance of escalatory and de-escalatory trade tweets in the preceding 30 days, was used to test P6: a message that runs against the regime should move prices more than one that continues it (H12). Among 108 tweets with a defined regime the coefficient is −0.097 (SE 0.032; one-sided p = 0.9987; two-sided p = 0.003). The effect is in the opposite direction: messages that continued the recent regime moved the index more (mean directional returns of +0.119% for aligned and +0.045% for opposed de-escalation; +0.150% and −0.084% for escalation). By the rule we fixed in advance, P6 is not supported and the sign flip in the oil samples remains a post hoc observation that carries no theoretical weight. A reader should therefore not take the opposite signs of the 2026 and 2017–2021 oil responses as evidence for the account. USD/CNH ticks for the China-related subset have not been analysed [to be completed before submission].</w:t>
+        <w:t xml:space="preserve">A regime variable R, computed from labels alone as the balance of escalatory and de-escalatory trade tweets in the preceding 30 days, was used to test P6: a message that runs against the regime should move prices more than one that continues it (H12). Among 108 tweets with a defined regime the coefficient is −0.097 (SE 0.032; one-sided p = 0.9987; two-sided p = 0.003). The effect is in the opposite direction: messages that continued the recent regime moved the index more (mean directional returns of +0.119% for aligned and +0.045% for opposed de-escalation; +0.150% and −0.084% for escalation). The test on the human-labelled subset (46 tweets with a window and a regime) gives the same answer (β = −0.041, SE 0.079; one-sided p = 0.70). By the rule we fixed in advance, P6 is not supported and the sign flip in the oil samples remains a post hoc observation that carries no theoretical weight. A reader should therefore not take the opposite signs of the 2026 and 2017–2021 oil responses as evidence for the account. USD/CNH ticks for the China-related subset have not been analysed [to be completed before submission].</w:t>
       </w:r>
     </w:p>
     <w:bookmarkEnd w:id="51"/>
@@ -1953,7 +1971,7 @@
         <w:pStyle w:val="FirstParagraph"/>
       </w:pPr>
       <w:r>
-        <w:t xml:space="preserve">The coders are model instances, and the human validation (Section 4.6) shows only moderate agreement with them (κ = 0.43 and 0.56 against the human consensus; 0.51 between the humans), with de-escalation precision of about one half; the two instances are copies of one model and agree with each other (κ = 0.74) far more than with either human. Every model-labelled result is therefore conditional on a labelling that is not validated. Posting times are endogenous: posts follow volatile hours, and all 20 triangulated cases show other drivers; neither the momentum control nor the first-source classification resolves simultaneity, and the latter is itself an upper bound. Hourly bars cannot separate the post from the preceding hour. The tick analysis can, but it uses a CFD rather than exchange futures, 33 de-escalation events, and one asset; the matched-hour placebo is pending. Prior uncertainty is proxied by relative volatility and novelty by redundancy relative to the account’s own recent posts, neither of which is the market’s information set; weak measures of both would lower power. The war-period result rests on 33 events, two of which supply half of the mean. The 2017–2021 sample adds a second period but not a second sender; it uses model labels only (human labelling is pending), loses 31% of events to closed markets, and its two novelty measures disagree; the tariff sample loses 35% of events to closed markets, relies on model labels, and its supported uncertainty result is confounded with volatility clustering. The sample contains one conflict and one administration. We tested four sets of mechanisms and confirmed none; we cannot exclude that a different formulation would succeed. The plans are not registered with an independent registry, and several were written after related results had been seen.</w:t>
+        <w:t xml:space="preserve">The coders are model instances, and the human validation (Section 4.6) shows only moderate agreement with them (κ = 0.43 and 0.56 against the human consensus; 0.51 between the humans), with de-escalation precision of about one half; the two instances are copies of one model and agree with each other (κ = 0.74) far more than with either human. Every model-labelled result is therefore conditional on a labelling that is not validated. Posting times are endogenous: posts follow volatile hours, and all 20 triangulated cases show other drivers; neither the momentum control nor the first-source classification resolves simultaneity, and the latter is itself an upper bound. Hourly bars cannot separate the post from the preceding hour. The tick analysis can, but it uses a CFD rather than exchange futures, 33 de-escalation events, and one asset; the matched-hour placebo is pending. Prior uncertainty is proxied by relative volatility and novelty by redundancy relative to the account’s own recent posts, neither of which is the market’s information set; weak measures of both would lower power. The war-period result rests on 33 events, two of which supply half of the mean. The 2017–2021 sample adds a second period but not a second sender; it uses model labels only (human labelling is pending), loses 31% of events to closed markets, and its two novelty measures disagree; the tariff sample loses 35% of events to closed markets, relies on model labels that humans accept for only about half of the model-agreed signals, and its supported uncertainty result is confounded with volatility clustering. The sample contains one conflict and one administration. We tested four sets of mechanisms and confirmed none; we cannot exclude that a different formulation would succeed. The plans are not registered with an independent registry, and several were written after related results had been seen.</w:t>
       </w:r>
     </w:p>
     <w:bookmarkEnd w:id="56"/>

</xml_diff>

<commit_message>
Manuscript v2: add P7, arrival-model comparison (Table 0), Musk account, ledger rows
Co-Authored-By: Claude Sonnet 5.5 <noreply@anthropic.com>
Claude-Session: https://claude.ai/code/session_011aZmoPyuUT34TyBPwawaPZ
</commit_message>
<xml_diff>
--- a/misq_note/hf/MANUSCRIPT_MISQ_v2.docx
+++ b/misq_note/hf/MANUSCRIPT_MISQ_v2.docx
@@ -311,7 +311,7 @@
         <w:pStyle w:val="FirstParagraph"/>
       </w:pPr>
       <w:r>
-        <w:t xml:space="preserve">We state five propositions, each with a pre-registered operationalization in Section 3.5.</w:t>
+        <w:t xml:space="preserve">We state seven propositions, each with a pre-registered operationalization (P1–P5 in Section 3.5; P6 and P7 in the plans cited in Sections 4.3 and 4.8).</w:t>
       </w:r>
     </w:p>
     <w:p>
@@ -350,6 +350,12 @@
       </w:r>
       <w:r>
         <w:t xml:space="preserve">P6 (state-dependent sign): the sign of the response is not fixed by the message class but by the prior. A message that runs against the market’s recent regime moves prices more than a message that continues it, so de-escalation announcements should move prices more when the recent regime has been escalatory, and escalation announcements more when it has been de-escalatory. (P6 is not supported in the pre-registered test of Section 4.8.)</w:t>
+      </w:r>
+      <w:r>
+        <w:t xml:space="preserve"> </w:t>
+      </w:r>
+      <w:r>
+        <w:t xml:space="preserve">P7 (timing surprisal): a post also carries information in when it arrives. If the market holds a predictive distribution over the poster’s timing, a post at an improbable time has high surprisal, S = −ln f(gap | past), and, holding content novelty, prior uncertainty and market state constant, should be followed by a larger |reaction|. (P7 is not supported; Section 4.3.)</w:t>
       </w:r>
     </w:p>
     <w:p>
@@ -687,6 +693,581 @@
         <w:t xml:space="preserve">Posting is not independent of market conditions. In an hourly logit over 3,605 war-period bars, the absolute prior six-hour oil return predicts a de-escalation post (coefficient 0.115, p = 0.033) and an escalation post (0.144, p = 0.024), and regular trading hours predict escalation posts (p = 0.012); the signed prior return does not (p = 0.32 and 0.18). Posts follow volatile hours. This is what a source whose rate depends on the environment looks like, and it implies that posting times cannot be treated as random for identification.</w:t>
       </w:r>
     </w:p>
+    <w:p>
+      <w:pPr>
+        <w:pStyle w:val="BodyText"/>
+      </w:pPr>
+      <w:r>
+        <w:rPr>
+          <w:bCs/>
+          <w:b/>
+        </w:rPr>
+        <w:t xml:space="preserve">Alternative arrival models and other accounts.</w:t>
+      </w:r>
+      <w:r>
+        <w:t xml:space="preserve"> </w:t>
+      </w:r>
+      <w:r>
+        <w:t xml:space="preserve">Poisson is not the only candidate, and the negative binomial (a Poisson–Gamma mixture) is a particular one. Table 0 compares daily-count models by AIC for the Truth Social series, for the 2017–2021 Twitter series (all original tweets and the two topic subsets of Sections 4.7–4.8), and for Elon Musk’s account as a second influential poster (a public third-party extract of 3,218 tweets, 2012–2017, whose completeness and time zone we could not verify). A homogeneous Poisson process is rejected everywhere (ΔAIC 150 to 3,700). The negative binomial and a Poisson–lognormal mixture fit equally well (differences within about 13 AIC units), so the data do not support choosing a gamma over a lognormal mixing distribution. In the multi-year Twitter series a dynamic model, a negative-binomial INGARCH(1,1) in which today’s rate depends on yesterday’s count and rate, is far better than every static mixture (ΔAIC 57 to 626); the 227-day Truth Social series is too short for this and the static negative binomial suffices. Waiting times follow no power law (Pareto is worst in every series); the best form is Weibull for all of Trump’s tweets, gamma for the topic subsets, and lognormal for Truth Social and Musk (CV 1.7 to 2.5). Musk’s account shows the same qualitative pattern as the president’s. We read this as evidence that human posting is bursty and self-exciting, not as evidence that the pattern is specific to people whose words carry weight: we have no comparison with ordinary accounts. A pre-registered comparison with matched ordinary accounts is specified (ANALYSIS_PLAN_ACCOUNTS.md) but has not been run, because we have not established that data of sufficient quality exist.</w:t>
+      </w:r>
+    </w:p>
+    <w:tbl>
+      <w:tblPr>
+        <w:tblStyle w:val="Table"/>
+        <w:tblW w:type="pct" w:w="5000"/>
+        <w:tblLook w:firstRow="1" w:lastRow="0" w:firstColumn="0" w:lastColumn="0" w:noHBand="0" w:noVBand="0" w:val="0020"/>
+        <w:jc w:val="start"/>
+        <w:tblBorders>
+          <w:top w:val="single" w:sz="4" w:color="000000"/>
+          <w:left w:val="single" w:sz="4" w:color="000000"/>
+          <w:bottom w:val="single" w:sz="4" w:color="000000"/>
+          <w:right w:val="single" w:sz="4" w:color="000000"/>
+          <w:insideH w:val="single" w:sz="4" w:color="000000"/>
+          <w:insideV w:val="single" w:sz="4" w:color="000000"/>
+        </w:tblBorders>
+      </w:tblPr>
+      <w:tblGrid>
+        <w:gridCol w:w="1320"/>
+        <w:gridCol w:w="1320"/>
+        <w:gridCol w:w="1320"/>
+        <w:gridCol w:w="1320"/>
+        <w:gridCol w:w="1320"/>
+        <w:gridCol w:w="1320"/>
+      </w:tblGrid>
+      <w:tr>
+        <w:trPr>
+          <w:tblHeader w:val="true"/>
+        </w:trPr>
+        <w:tc>
+          <w:tcPr/>
+          <w:p>
+            <w:pPr>
+              <w:pStyle w:val="Compact"/>
+              <w:jc w:val="left"/>
+            </w:pPr>
+            <w:r>
+              <w:t xml:space="preserve">Series</w:t>
+            </w:r>
+          </w:p>
+        </w:tc>
+        <w:tc>
+          <w:tcPr/>
+          <w:p>
+            <w:pPr>
+              <w:pStyle w:val="Compact"/>
+              <w:jc w:val="left"/>
+            </w:pPr>
+            <w:r>
+              <w:t xml:space="preserve">Days</w:t>
+            </w:r>
+          </w:p>
+        </w:tc>
+        <w:tc>
+          <w:tcPr/>
+          <w:p>
+            <w:pPr>
+              <w:pStyle w:val="Compact"/>
+              <w:jc w:val="left"/>
+            </w:pPr>
+            <w:r>
+              <w:t xml:space="preserve">Static NB (ΔAIC)</w:t>
+            </w:r>
+          </w:p>
+        </w:tc>
+        <w:tc>
+          <w:tcPr/>
+          <w:p>
+            <w:pPr>
+              <w:pStyle w:val="Compact"/>
+              <w:jc w:val="left"/>
+            </w:pPr>
+            <w:r>
+              <w:t xml:space="preserve">Poisson–lognormal (ΔAIC)</w:t>
+            </w:r>
+          </w:p>
+        </w:tc>
+        <w:tc>
+          <w:tcPr/>
+          <w:p>
+            <w:pPr>
+              <w:pStyle w:val="Compact"/>
+              <w:jc w:val="left"/>
+            </w:pPr>
+            <w:r>
+              <w:t xml:space="preserve">NB-INGARCH (ΔAIC)</w:t>
+            </w:r>
+          </w:p>
+        </w:tc>
+        <w:tc>
+          <w:tcPr/>
+          <w:p>
+            <w:pPr>
+              <w:pStyle w:val="Compact"/>
+              <w:jc w:val="left"/>
+            </w:pPr>
+            <w:r>
+              <w:t xml:space="preserve">Best waiting-time model</w:t>
+            </w:r>
+          </w:p>
+        </w:tc>
+      </w:tr>
+      <w:tr>
+        <w:tc>
+          <w:tcPr/>
+          <w:p>
+            <w:pPr>
+              <w:pStyle w:val="Compact"/>
+              <w:jc w:val="left"/>
+            </w:pPr>
+            <w:r>
+              <w:t xml:space="preserve">Trump, Truth Social 2026</w:t>
+            </w:r>
+          </w:p>
+        </w:tc>
+        <w:tc>
+          <w:tcPr/>
+          <w:p>
+            <w:pPr>
+              <w:pStyle w:val="Compact"/>
+              <w:jc w:val="left"/>
+            </w:pPr>
+            <w:r>
+              <w:t xml:space="preserve">227</w:t>
+            </w:r>
+          </w:p>
+        </w:tc>
+        <w:tc>
+          <w:tcPr/>
+          <w:p>
+            <w:pPr>
+              <w:pStyle w:val="Compact"/>
+              <w:jc w:val="left"/>
+            </w:pPr>
+            <w:r>
+              <w:t xml:space="preserve">0</w:t>
+            </w:r>
+          </w:p>
+        </w:tc>
+        <w:tc>
+          <w:tcPr/>
+          <w:p>
+            <w:pPr>
+              <w:pStyle w:val="Compact"/>
+              <w:jc w:val="left"/>
+            </w:pPr>
+            <w:r>
+              <w:t xml:space="preserve">1</w:t>
+            </w:r>
+          </w:p>
+        </w:tc>
+        <w:tc>
+          <w:tcPr/>
+          <w:p>
+            <w:pPr>
+              <w:pStyle w:val="Compact"/>
+              <w:jc w:val="left"/>
+            </w:pPr>
+            <w:r>
+              <w:t xml:space="preserve">0 (collapses to NB)</w:t>
+            </w:r>
+          </w:p>
+        </w:tc>
+        <w:tc>
+          <w:tcPr/>
+          <w:p>
+            <w:pPr>
+              <w:pStyle w:val="Compact"/>
+              <w:jc w:val="left"/>
+            </w:pPr>
+            <w:r>
+              <w:t xml:space="preserve">Lognormal</w:t>
+            </w:r>
+          </w:p>
+        </w:tc>
+      </w:tr>
+      <w:tr>
+        <w:tc>
+          <w:tcPr/>
+          <w:p>
+            <w:pPr>
+              <w:pStyle w:val="Compact"/>
+              <w:jc w:val="left"/>
+            </w:pPr>
+            <w:r>
+              <w:t xml:space="preserve">Trump, Twitter, all original</w:t>
+            </w:r>
+          </w:p>
+        </w:tc>
+        <w:tc>
+          <w:tcPr/>
+          <w:p>
+            <w:pPr>
+              <w:pStyle w:val="Compact"/>
+              <w:jc w:val="left"/>
+            </w:pPr>
+            <w:r>
+              <w:t xml:space="preserve">1,448</w:t>
+            </w:r>
+          </w:p>
+        </w:tc>
+        <w:tc>
+          <w:tcPr/>
+          <w:p>
+            <w:pPr>
+              <w:pStyle w:val="Compact"/>
+              <w:jc w:val="left"/>
+            </w:pPr>
+            <w:r>
+              <w:t xml:space="preserve">626</w:t>
+            </w:r>
+          </w:p>
+        </w:tc>
+        <w:tc>
+          <w:tcPr/>
+          <w:p>
+            <w:pPr>
+              <w:pStyle w:val="Compact"/>
+              <w:jc w:val="left"/>
+            </w:pPr>
+            <w:r>
+              <w:t xml:space="preserve">639</w:t>
+            </w:r>
+          </w:p>
+        </w:tc>
+        <w:tc>
+          <w:tcPr/>
+          <w:p>
+            <w:pPr>
+              <w:pStyle w:val="Compact"/>
+              <w:jc w:val="left"/>
+            </w:pPr>
+            <w:r>
+              <w:t xml:space="preserve">0</w:t>
+            </w:r>
+          </w:p>
+        </w:tc>
+        <w:tc>
+          <w:tcPr/>
+          <w:p>
+            <w:pPr>
+              <w:pStyle w:val="Compact"/>
+              <w:jc w:val="left"/>
+            </w:pPr>
+            <w:r>
+              <w:t xml:space="preserve">Weibull</w:t>
+            </w:r>
+          </w:p>
+        </w:tc>
+      </w:tr>
+      <w:tr>
+        <w:tc>
+          <w:tcPr/>
+          <w:p>
+            <w:pPr>
+              <w:pStyle w:val="Compact"/>
+              <w:jc w:val="left"/>
+            </w:pPr>
+            <w:r>
+              <w:t xml:space="preserve">Trump, Twitter, oil/Iran</w:t>
+            </w:r>
+          </w:p>
+        </w:tc>
+        <w:tc>
+          <w:tcPr/>
+          <w:p>
+            <w:pPr>
+              <w:pStyle w:val="Compact"/>
+              <w:jc w:val="left"/>
+            </w:pPr>
+            <w:r>
+              <w:t xml:space="preserve">1,448</w:t>
+            </w:r>
+          </w:p>
+        </w:tc>
+        <w:tc>
+          <w:tcPr/>
+          <w:p>
+            <w:pPr>
+              <w:pStyle w:val="Compact"/>
+              <w:jc w:val="left"/>
+            </w:pPr>
+            <w:r>
+              <w:t xml:space="preserve">57</w:t>
+            </w:r>
+          </w:p>
+        </w:tc>
+        <w:tc>
+          <w:tcPr/>
+          <w:p>
+            <w:pPr>
+              <w:pStyle w:val="Compact"/>
+              <w:jc w:val="left"/>
+            </w:pPr>
+            <w:r>
+              <w:t xml:space="preserve">62</w:t>
+            </w:r>
+          </w:p>
+        </w:tc>
+        <w:tc>
+          <w:tcPr/>
+          <w:p>
+            <w:pPr>
+              <w:pStyle w:val="Compact"/>
+              <w:jc w:val="left"/>
+            </w:pPr>
+            <w:r>
+              <w:t xml:space="preserve">0</w:t>
+            </w:r>
+          </w:p>
+        </w:tc>
+        <w:tc>
+          <w:tcPr/>
+          <w:p>
+            <w:pPr>
+              <w:pStyle w:val="Compact"/>
+              <w:jc w:val="left"/>
+            </w:pPr>
+            <w:r>
+              <w:t xml:space="preserve">Gamma</w:t>
+            </w:r>
+          </w:p>
+        </w:tc>
+      </w:tr>
+      <w:tr>
+        <w:tc>
+          <w:tcPr/>
+          <w:p>
+            <w:pPr>
+              <w:pStyle w:val="Compact"/>
+              <w:jc w:val="left"/>
+            </w:pPr>
+            <w:r>
+              <w:t xml:space="preserve">Trump, Twitter, tariff/trade</w:t>
+            </w:r>
+          </w:p>
+        </w:tc>
+        <w:tc>
+          <w:tcPr/>
+          <w:p>
+            <w:pPr>
+              <w:pStyle w:val="Compact"/>
+              <w:jc w:val="left"/>
+            </w:pPr>
+            <w:r>
+              <w:t xml:space="preserve">1,448</w:t>
+            </w:r>
+          </w:p>
+        </w:tc>
+        <w:tc>
+          <w:tcPr/>
+          <w:p>
+            <w:pPr>
+              <w:pStyle w:val="Compact"/>
+              <w:jc w:val="left"/>
+            </w:pPr>
+            <w:r>
+              <w:t xml:space="preserve">137</w:t>
+            </w:r>
+          </w:p>
+        </w:tc>
+        <w:tc>
+          <w:tcPr/>
+          <w:p>
+            <w:pPr>
+              <w:pStyle w:val="Compact"/>
+              <w:jc w:val="left"/>
+            </w:pPr>
+            <w:r>
+              <w:t xml:space="preserve">129</w:t>
+            </w:r>
+          </w:p>
+        </w:tc>
+        <w:tc>
+          <w:tcPr/>
+          <w:p>
+            <w:pPr>
+              <w:pStyle w:val="Compact"/>
+              <w:jc w:val="left"/>
+            </w:pPr>
+            <w:r>
+              <w:t xml:space="preserve">0</w:t>
+            </w:r>
+          </w:p>
+        </w:tc>
+        <w:tc>
+          <w:tcPr/>
+          <w:p>
+            <w:pPr>
+              <w:pStyle w:val="Compact"/>
+              <w:jc w:val="left"/>
+            </w:pPr>
+            <w:r>
+              <w:t xml:space="preserve">Gamma</w:t>
+            </w:r>
+          </w:p>
+        </w:tc>
+      </w:tr>
+      <w:tr>
+        <w:tc>
+          <w:tcPr/>
+          <w:p>
+            <w:pPr>
+              <w:pStyle w:val="Compact"/>
+              <w:jc w:val="left"/>
+            </w:pPr>
+            <w:r>
+              <w:t xml:space="preserve">Musk, Twitter 2012–17</w:t>
+            </w:r>
+          </w:p>
+        </w:tc>
+        <w:tc>
+          <w:tcPr/>
+          <w:p>
+            <w:pPr>
+              <w:pStyle w:val="Compact"/>
+              <w:jc w:val="left"/>
+            </w:pPr>
+            <w:r>
+              <w:t xml:space="preserve">1,779</w:t>
+            </w:r>
+          </w:p>
+        </w:tc>
+        <w:tc>
+          <w:tcPr/>
+          <w:p>
+            <w:pPr>
+              <w:pStyle w:val="Compact"/>
+              <w:jc w:val="left"/>
+            </w:pPr>
+            <w:r>
+              <w:t xml:space="preserve">238</w:t>
+            </w:r>
+          </w:p>
+        </w:tc>
+        <w:tc>
+          <w:tcPr/>
+          <w:p>
+            <w:pPr>
+              <w:pStyle w:val="Compact"/>
+              <w:jc w:val="left"/>
+            </w:pPr>
+            <w:r>
+              <w:t xml:space="preserve">249</w:t>
+            </w:r>
+          </w:p>
+        </w:tc>
+        <w:tc>
+          <w:tcPr/>
+          <w:p>
+            <w:pPr>
+              <w:pStyle w:val="Compact"/>
+              <w:jc w:val="left"/>
+            </w:pPr>
+            <w:r>
+              <w:t xml:space="preserve">0</w:t>
+            </w:r>
+          </w:p>
+        </w:tc>
+        <w:tc>
+          <w:tcPr/>
+          <w:p>
+            <w:pPr>
+              <w:pStyle w:val="Compact"/>
+              <w:jc w:val="left"/>
+            </w:pPr>
+            <w:r>
+              <w:t xml:space="preserve">Lognormal</w:t>
+            </w:r>
+          </w:p>
+        </w:tc>
+      </w:tr>
+      <w:tr>
+        <w:tc>
+          <w:tcPr/>
+          <w:p>
+            <w:pPr>
+              <w:pStyle w:val="Compact"/>
+              <w:jc w:val="left"/>
+            </w:pPr>
+            <w:r>
+              <w:t xml:space="preserve">Musk, Twitter 2016–17</w:t>
+            </w:r>
+          </w:p>
+        </w:tc>
+        <w:tc>
+          <w:tcPr/>
+          <w:p>
+            <w:pPr>
+              <w:pStyle w:val="Compact"/>
+              <w:jc w:val="left"/>
+            </w:pPr>
+            <w:r>
+              <w:t xml:space="preserve">638</w:t>
+            </w:r>
+          </w:p>
+        </w:tc>
+        <w:tc>
+          <w:tcPr/>
+          <w:p>
+            <w:pPr>
+              <w:pStyle w:val="Compact"/>
+              <w:jc w:val="left"/>
+            </w:pPr>
+            <w:r>
+              <w:t xml:space="preserve">59</w:t>
+            </w:r>
+          </w:p>
+        </w:tc>
+        <w:tc>
+          <w:tcPr/>
+          <w:p>
+            <w:pPr>
+              <w:pStyle w:val="Compact"/>
+              <w:jc w:val="left"/>
+            </w:pPr>
+            <w:r>
+              <w:t xml:space="preserve">66</w:t>
+            </w:r>
+          </w:p>
+        </w:tc>
+        <w:tc>
+          <w:tcPr/>
+          <w:p>
+            <w:pPr>
+              <w:pStyle w:val="Compact"/>
+              <w:jc w:val="left"/>
+            </w:pPr>
+            <w:r>
+              <w:t xml:space="preserve">0</w:t>
+            </w:r>
+          </w:p>
+        </w:tc>
+        <w:tc>
+          <w:tcPr/>
+          <w:p>
+            <w:pPr>
+              <w:pStyle w:val="Compact"/>
+              <w:jc w:val="left"/>
+            </w:pPr>
+            <w:r>
+              <w:t xml:space="preserve">Lognormal</w:t>
+            </w:r>
+          </w:p>
+        </w:tc>
+      </w:tr>
+    </w:tbl>
+    <w:p>
+      <w:pPr>
+        <w:pStyle w:val="BodyText"/>
+      </w:pPr>
+      <w:r>
+        <w:rPr>
+          <w:iCs/>
+          <w:i/>
+        </w:rPr>
+        <w:t xml:space="preserve">Table 0. Alternative models for the arrival of posts (ΔAIC relative to the best model in each row; Poisson ΔAIC 150 to 3,700 in all rows; descriptive, not pre-registered; RESULTS_ARRIVALS_MODELS.md).</w:t>
+      </w:r>
+    </w:p>
     <w:bookmarkEnd w:id="38"/>
     <w:bookmarkStart w:id="45" w:name="market-co-movement-during-the-closure"/>
     <w:p>
@@ -926,12 +1507,12 @@
         <w:tblLook w:firstRow="1" w:lastRow="0" w:firstColumn="0" w:lastColumn="0" w:noHBand="0" w:noVBand="0" w:val="0020"/>
         <w:jc w:val="start"/>
         <w:tblBorders>
-          <w:top w:val="single" w:sz="4" w:space="0" w:color="888888"/>
-          <w:left w:val="single" w:sz="4" w:space="0" w:color="888888"/>
-          <w:bottom w:val="single" w:sz="4" w:space="0" w:color="888888"/>
-          <w:right w:val="single" w:sz="4" w:space="0" w:color="888888"/>
-          <w:insideH w:val="single" w:sz="4" w:space="0" w:color="888888"/>
-          <w:insideV w:val="single" w:sz="4" w:space="0" w:color="888888"/>
+          <w:top w:val="single" w:sz="4" w:color="000000"/>
+          <w:left w:val="single" w:sz="4" w:color="000000"/>
+          <w:bottom w:val="single" w:sz="4" w:color="000000"/>
+          <w:right w:val="single" w:sz="4" w:color="000000"/>
+          <w:insideH w:val="single" w:sz="4" w:color="000000"/>
+          <w:insideV w:val="single" w:sz="4" w:color="000000"/>
         </w:tblBorders>
       </w:tblPr>
       <w:tblGrid>
@@ -949,15 +1530,9 @@
           <w:p>
             <w:pPr>
               <w:pStyle w:val="Compact"/>
-              <w:spacing w:line="240" w:lineRule="auto" w:after="40"/>
-              <w:jc w:val="left"/>
-            </w:pPr>
-            <w:r>
-              <w:rPr>
-                <w:rFonts w:ascii="Times New Roman" w:hAnsi="Times New Roman"/>
-                <w:b/>
-                <w:sz w:val="19"/>
-              </w:rPr>
+              <w:jc w:val="left"/>
+            </w:pPr>
+            <w:r>
               <w:t xml:space="preserve">Proposition</w:t>
             </w:r>
           </w:p>
@@ -967,15 +1542,9 @@
           <w:p>
             <w:pPr>
               <w:pStyle w:val="Compact"/>
-              <w:spacing w:line="240" w:lineRule="auto" w:after="40"/>
-              <w:jc w:val="left"/>
-            </w:pPr>
-            <w:r>
-              <w:rPr>
-                <w:rFonts w:ascii="Times New Roman" w:hAnsi="Times New Roman"/>
-                <w:b/>
-                <w:sz w:val="19"/>
-              </w:rPr>
+              <w:jc w:val="left"/>
+            </w:pPr>
+            <w:r>
               <w:t xml:space="preserve">Estimate</w:t>
             </w:r>
           </w:p>
@@ -985,15 +1554,9 @@
           <w:p>
             <w:pPr>
               <w:pStyle w:val="Compact"/>
-              <w:spacing w:line="240" w:lineRule="auto" w:after="40"/>
-              <w:jc w:val="left"/>
-            </w:pPr>
-            <w:r>
-              <w:rPr>
-                <w:rFonts w:ascii="Times New Roman" w:hAnsi="Times New Roman"/>
-                <w:b/>
-                <w:sz w:val="19"/>
-              </w:rPr>
+              <w:jc w:val="left"/>
+            </w:pPr>
+            <w:r>
               <w:t xml:space="preserve">One-sided p</w:t>
             </w:r>
           </w:p>
@@ -1003,15 +1566,9 @@
           <w:p>
             <w:pPr>
               <w:pStyle w:val="Compact"/>
-              <w:spacing w:line="240" w:lineRule="auto" w:after="40"/>
-              <w:jc w:val="left"/>
-            </w:pPr>
-            <w:r>
-              <w:rPr>
-                <w:rFonts w:ascii="Times New Roman" w:hAnsi="Times New Roman"/>
-                <w:b/>
-                <w:sz w:val="19"/>
-              </w:rPr>
+              <w:jc w:val="left"/>
+            </w:pPr>
+            <w:r>
               <w:t xml:space="preserve">Decision</w:t>
             </w:r>
           </w:p>
@@ -1023,14 +1580,9 @@
           <w:p>
             <w:pPr>
               <w:pStyle w:val="Compact"/>
-              <w:spacing w:line="240" w:lineRule="auto" w:after="40"/>
-              <w:jc w:val="left"/>
-            </w:pPr>
-            <w:r>
-              <w:rPr>
-                <w:rFonts w:ascii="Times New Roman" w:hAnsi="Times New Roman"/>
-                <w:sz w:val="19"/>
-              </w:rPr>
+              <w:jc w:val="left"/>
+            </w:pPr>
+            <w:r>
               <w:t xml:space="preserve">P1 novelty N_c</w:t>
             </w:r>
           </w:p>
@@ -1040,14 +1592,9 @@
           <w:p>
             <w:pPr>
               <w:pStyle w:val="Compact"/>
-              <w:spacing w:line="240" w:lineRule="auto" w:after="40"/>
-              <w:jc w:val="left"/>
-            </w:pPr>
-            <w:r>
-              <w:rPr>
-                <w:rFonts w:ascii="Times New Roman" w:hAnsi="Times New Roman"/>
-                <w:sz w:val="19"/>
-              </w:rPr>
+              <w:jc w:val="left"/>
+            </w:pPr>
+            <w:r>
               <w:t xml:space="preserve">+0.77 (SE 0.56)</w:t>
             </w:r>
           </w:p>
@@ -1057,14 +1604,9 @@
           <w:p>
             <w:pPr>
               <w:pStyle w:val="Compact"/>
-              <w:spacing w:line="240" w:lineRule="auto" w:after="40"/>
-              <w:jc w:val="left"/>
-            </w:pPr>
-            <w:r>
-              <w:rPr>
-                <w:rFonts w:ascii="Times New Roman" w:hAnsi="Times New Roman"/>
-                <w:sz w:val="19"/>
-              </w:rPr>
+              <w:jc w:val="left"/>
+            </w:pPr>
+            <w:r>
               <w:t xml:space="preserve">0.084</w:t>
             </w:r>
           </w:p>
@@ -1074,14 +1616,9 @@
           <w:p>
             <w:pPr>
               <w:pStyle w:val="Compact"/>
-              <w:spacing w:line="240" w:lineRule="auto" w:after="40"/>
-              <w:jc w:val="left"/>
-            </w:pPr>
-            <w:r>
-              <w:rPr>
-                <w:rFonts w:ascii="Times New Roman" w:hAnsi="Times New Roman"/>
-                <w:sz w:val="19"/>
-              </w:rPr>
+              <w:jc w:val="left"/>
+            </w:pPr>
+            <w:r>
               <w:t xml:space="preserve">Not supported; same sign in all four topics</w:t>
             </w:r>
           </w:p>
@@ -1093,14 +1630,9 @@
           <w:p>
             <w:pPr>
               <w:pStyle w:val="Compact"/>
-              <w:spacing w:line="240" w:lineRule="auto" w:after="40"/>
-              <w:jc w:val="left"/>
-            </w:pPr>
-            <w:r>
-              <w:rPr>
-                <w:rFonts w:ascii="Times New Roman" w:hAnsi="Times New Roman"/>
-                <w:sz w:val="19"/>
-              </w:rPr>
+              <w:jc w:val="left"/>
+            </w:pPr>
+            <w:r>
               <w:t xml:space="preserve">P1 replication, 2022–24 daily (n = 49)</w:t>
             </w:r>
           </w:p>
@@ -1110,14 +1642,9 @@
           <w:p>
             <w:pPr>
               <w:pStyle w:val="Compact"/>
-              <w:spacing w:line="240" w:lineRule="auto" w:after="40"/>
-              <w:jc w:val="left"/>
-            </w:pPr>
-            <w:r>
-              <w:rPr>
-                <w:rFonts w:ascii="Times New Roman" w:hAnsi="Times New Roman"/>
-                <w:sz w:val="19"/>
-              </w:rPr>
+              <w:jc w:val="left"/>
+            </w:pPr>
+            <w:r>
               <w:t xml:space="preserve">+0.26 (SE 0.37)</w:t>
             </w:r>
           </w:p>
@@ -1127,14 +1654,9 @@
           <w:p>
             <w:pPr>
               <w:pStyle w:val="Compact"/>
-              <w:spacing w:line="240" w:lineRule="auto" w:after="40"/>
-              <w:jc w:val="left"/>
-            </w:pPr>
-            <w:r>
-              <w:rPr>
-                <w:rFonts w:ascii="Times New Roman" w:hAnsi="Times New Roman"/>
-                <w:sz w:val="19"/>
-              </w:rPr>
+              <w:jc w:val="left"/>
+            </w:pPr>
+            <w:r>
               <w:t xml:space="preserve">0.24</w:t>
             </w:r>
           </w:p>
@@ -1144,14 +1666,9 @@
           <w:p>
             <w:pPr>
               <w:pStyle w:val="Compact"/>
-              <w:spacing w:line="240" w:lineRule="auto" w:after="40"/>
-              <w:jc w:val="left"/>
-            </w:pPr>
-            <w:r>
-              <w:rPr>
-                <w:rFonts w:ascii="Times New Roman" w:hAnsi="Times New Roman"/>
-                <w:sz w:val="19"/>
-              </w:rPr>
+              <w:jc w:val="left"/>
+            </w:pPr>
+            <w:r>
               <w:t xml:space="preserve">Same sign</w:t>
             </w:r>
           </w:p>
@@ -1163,14 +1680,9 @@
           <w:p>
             <w:pPr>
               <w:pStyle w:val="Compact"/>
-              <w:spacing w:line="240" w:lineRule="auto" w:after="40"/>
-              <w:jc w:val="left"/>
-            </w:pPr>
-            <w:r>
-              <w:rPr>
-                <w:rFonts w:ascii="Times New Roman" w:hAnsi="Times New Roman"/>
-                <w:sz w:val="19"/>
-              </w:rPr>
+              <w:jc w:val="left"/>
+            </w:pPr>
+            <w:r>
               <w:t xml:space="preserve">P1 robustness, TF-IDF novelty</w:t>
             </w:r>
           </w:p>
@@ -1180,14 +1692,9 @@
           <w:p>
             <w:pPr>
               <w:pStyle w:val="Compact"/>
-              <w:spacing w:line="240" w:lineRule="auto" w:after="40"/>
-              <w:jc w:val="left"/>
-            </w:pPr>
-            <w:r>
-              <w:rPr>
-                <w:rFonts w:ascii="Times New Roman" w:hAnsi="Times New Roman"/>
-                <w:sz w:val="19"/>
-              </w:rPr>
+              <w:jc w:val="left"/>
+            </w:pPr>
+            <w:r>
               <w:t xml:space="preserve">+0.52 (SE 0.36)</w:t>
             </w:r>
           </w:p>
@@ -1197,14 +1704,9 @@
           <w:p>
             <w:pPr>
               <w:pStyle w:val="Compact"/>
-              <w:spacing w:line="240" w:lineRule="auto" w:after="40"/>
-              <w:jc w:val="left"/>
-            </w:pPr>
-            <w:r>
-              <w:rPr>
-                <w:rFonts w:ascii="Times New Roman" w:hAnsi="Times New Roman"/>
-                <w:sz w:val="19"/>
-              </w:rPr>
+              <w:jc w:val="left"/>
+            </w:pPr>
+            <w:r>
               <w:t xml:space="preserve">0.073</w:t>
             </w:r>
           </w:p>
@@ -1214,14 +1716,9 @@
           <w:p>
             <w:pPr>
               <w:pStyle w:val="Compact"/>
-              <w:spacing w:line="240" w:lineRule="auto" w:after="40"/>
-              <w:jc w:val="left"/>
-            </w:pPr>
-            <w:r>
-              <w:rPr>
-                <w:rFonts w:ascii="Times New Roman" w:hAnsi="Times New Roman"/>
-                <w:sz w:val="19"/>
-              </w:rPr>
+              <w:jc w:val="left"/>
+            </w:pPr>
+            <w:r>
               <w:t xml:space="preserve">—</w:t>
             </w:r>
           </w:p>
@@ -1233,14 +1730,9 @@
           <w:p>
             <w:pPr>
               <w:pStyle w:val="Compact"/>
-              <w:spacing w:line="240" w:lineRule="auto" w:after="40"/>
-              <w:jc w:val="left"/>
-            </w:pPr>
-            <w:r>
-              <w:rPr>
-                <w:rFonts w:ascii="Times New Roman" w:hAnsi="Times New Roman"/>
-                <w:sz w:val="19"/>
-              </w:rPr>
+              <w:jc w:val="left"/>
+            </w:pPr>
+            <w:r>
               <w:t xml:space="preserve">P2 prior uncertainty U</w:t>
             </w:r>
           </w:p>
@@ -1250,14 +1742,9 @@
           <w:p>
             <w:pPr>
               <w:pStyle w:val="Compact"/>
-              <w:spacing w:line="240" w:lineRule="auto" w:after="40"/>
-              <w:jc w:val="left"/>
-            </w:pPr>
-            <w:r>
-              <w:rPr>
-                <w:rFonts w:ascii="Times New Roman" w:hAnsi="Times New Roman"/>
-                <w:sz w:val="19"/>
-              </w:rPr>
+              <w:jc w:val="left"/>
+            </w:pPr>
+            <w:r>
               <w:t xml:space="preserve">+0.29 (SE 0.20)</w:t>
             </w:r>
           </w:p>
@@ -1267,14 +1754,9 @@
           <w:p>
             <w:pPr>
               <w:pStyle w:val="Compact"/>
-              <w:spacing w:line="240" w:lineRule="auto" w:after="40"/>
-              <w:jc w:val="left"/>
-            </w:pPr>
-            <w:r>
-              <w:rPr>
-                <w:rFonts w:ascii="Times New Roman" w:hAnsi="Times New Roman"/>
-                <w:sz w:val="19"/>
-              </w:rPr>
+              <w:jc w:val="left"/>
+            </w:pPr>
+            <w:r>
               <w:t xml:space="preserve">0.072</w:t>
             </w:r>
           </w:p>
@@ -1284,14 +1766,9 @@
           <w:p>
             <w:pPr>
               <w:pStyle w:val="Compact"/>
-              <w:spacing w:line="240" w:lineRule="auto" w:after="40"/>
-              <w:jc w:val="left"/>
-            </w:pPr>
-            <w:r>
-              <w:rPr>
-                <w:rFonts w:ascii="Times New Roman" w:hAnsi="Times New Roman"/>
-                <w:sz w:val="19"/>
-              </w:rPr>
+              <w:jc w:val="left"/>
+            </w:pPr>
+            <w:r>
               <w:t xml:space="preserve">Not supported</w:t>
             </w:r>
           </w:p>
@@ -1303,14 +1780,9 @@
           <w:p>
             <w:pPr>
               <w:pStyle w:val="Compact"/>
-              <w:spacing w:line="240" w:lineRule="auto" w:after="40"/>
-              <w:jc w:val="left"/>
-            </w:pPr>
-            <w:r>
-              <w:rPr>
-                <w:rFonts w:ascii="Times New Roman" w:hAnsi="Times New Roman"/>
-                <w:sz w:val="19"/>
-              </w:rPr>
+              <w:jc w:val="left"/>
+            </w:pPr>
+            <w:r>
               <w:t xml:space="preserve">P3 N_c × U</w:t>
             </w:r>
           </w:p>
@@ -1320,14 +1792,9 @@
           <w:p>
             <w:pPr>
               <w:pStyle w:val="Compact"/>
-              <w:spacing w:line="240" w:lineRule="auto" w:after="40"/>
-              <w:jc w:val="left"/>
-            </w:pPr>
-            <w:r>
-              <w:rPr>
-                <w:rFonts w:ascii="Times New Roman" w:hAnsi="Times New Roman"/>
-                <w:sz w:val="19"/>
-              </w:rPr>
+              <w:jc w:val="left"/>
+            </w:pPr>
+            <w:r>
               <w:t xml:space="preserve">−0.08 (SE 1.52)</w:t>
             </w:r>
           </w:p>
@@ -1337,14 +1804,9 @@
           <w:p>
             <w:pPr>
               <w:pStyle w:val="Compact"/>
-              <w:spacing w:line="240" w:lineRule="auto" w:after="40"/>
-              <w:jc w:val="left"/>
-            </w:pPr>
-            <w:r>
-              <w:rPr>
-                <w:rFonts w:ascii="Times New Roman" w:hAnsi="Times New Roman"/>
-                <w:sz w:val="19"/>
-              </w:rPr>
+              <w:jc w:val="left"/>
+            </w:pPr>
+            <w:r>
               <w:t xml:space="preserve">0.52</w:t>
             </w:r>
           </w:p>
@@ -1354,14 +1816,9 @@
           <w:p>
             <w:pPr>
               <w:pStyle w:val="Compact"/>
-              <w:spacing w:line="240" w:lineRule="auto" w:after="40"/>
-              <w:jc w:val="left"/>
-            </w:pPr>
-            <w:r>
-              <w:rPr>
-                <w:rFonts w:ascii="Times New Roman" w:hAnsi="Times New Roman"/>
-                <w:sz w:val="19"/>
-              </w:rPr>
+              <w:jc w:val="left"/>
+            </w:pPr>
+            <w:r>
               <w:t xml:space="preserve">Not supported</w:t>
             </w:r>
           </w:p>
@@ -1373,14 +1830,9 @@
           <w:p>
             <w:pPr>
               <w:pStyle w:val="Compact"/>
-              <w:spacing w:line="240" w:lineRule="auto" w:after="40"/>
-              <w:jc w:val="left"/>
-            </w:pPr>
-            <w:r>
-              <w:rPr>
-                <w:rFonts w:ascii="Times New Roman" w:hAnsi="Times New Roman"/>
-                <w:sz w:val="19"/>
-              </w:rPr>
+              <w:jc w:val="left"/>
+            </w:pPr>
+            <w:r>
               <w:t xml:space="preserve">P4 mutual information, war</w:t>
             </w:r>
           </w:p>
@@ -1390,14 +1842,9 @@
           <w:p>
             <w:pPr>
               <w:pStyle w:val="Compact"/>
-              <w:spacing w:line="240" w:lineRule="auto" w:after="40"/>
-              <w:jc w:val="left"/>
-            </w:pPr>
-            <w:r>
-              <w:rPr>
-                <w:rFonts w:ascii="Times New Roman" w:hAnsi="Times New Roman"/>
-                <w:sz w:val="19"/>
-              </w:rPr>
+              <w:jc w:val="left"/>
+            </w:pPr>
+            <w:r>
               <w:t xml:space="preserve">0.0014 bits (null 0.0004)</w:t>
             </w:r>
           </w:p>
@@ -1407,14 +1854,9 @@
           <w:p>
             <w:pPr>
               <w:pStyle w:val="Compact"/>
-              <w:spacing w:line="240" w:lineRule="auto" w:after="40"/>
-              <w:jc w:val="left"/>
-            </w:pPr>
-            <w:r>
-              <w:rPr>
-                <w:rFonts w:ascii="Times New Roman" w:hAnsi="Times New Roman"/>
-                <w:sz w:val="19"/>
-              </w:rPr>
+              <w:jc w:val="left"/>
+            </w:pPr>
+            <w:r>
               <w:t xml:space="preserve">0.041</w:t>
             </w:r>
           </w:p>
@@ -1424,14 +1866,9 @@
           <w:p>
             <w:pPr>
               <w:pStyle w:val="Compact"/>
-              <w:spacing w:line="240" w:lineRule="auto" w:after="40"/>
-              <w:jc w:val="left"/>
-            </w:pPr>
-            <w:r>
-              <w:rPr>
-                <w:rFonts w:ascii="Times New Roman" w:hAnsi="Times New Roman"/>
-                <w:sz w:val="19"/>
-              </w:rPr>
+              <w:jc w:val="left"/>
+            </w:pPr>
+            <w:r>
               <w:t xml:space="preserve">Supported (marginal)</w:t>
             </w:r>
           </w:p>
@@ -1443,14 +1880,9 @@
           <w:p>
             <w:pPr>
               <w:pStyle w:val="Compact"/>
-              <w:spacing w:line="240" w:lineRule="auto" w:after="40"/>
-              <w:jc w:val="left"/>
-            </w:pPr>
-            <w:r>
-              <w:rPr>
-                <w:rFonts w:ascii="Times New Roman" w:hAnsi="Times New Roman"/>
-                <w:sz w:val="19"/>
-              </w:rPr>
+              <w:jc w:val="left"/>
+            </w:pPr>
+            <w:r>
               <w:t xml:space="preserve">P4 mutual information, pre-war</w:t>
             </w:r>
           </w:p>
@@ -1460,14 +1892,9 @@
           <w:p>
             <w:pPr>
               <w:pStyle w:val="Compact"/>
-              <w:spacing w:line="240" w:lineRule="auto" w:after="40"/>
-              <w:jc w:val="left"/>
-            </w:pPr>
-            <w:r>
-              <w:rPr>
-                <w:rFonts w:ascii="Times New Roman" w:hAnsi="Times New Roman"/>
-                <w:sz w:val="19"/>
-              </w:rPr>
+              <w:jc w:val="left"/>
+            </w:pPr>
+            <w:r>
               <w:t xml:space="preserve">0.0003 bits (null 0.0002)</w:t>
             </w:r>
           </w:p>
@@ -1477,14 +1904,9 @@
           <w:p>
             <w:pPr>
               <w:pStyle w:val="Compact"/>
-              <w:spacing w:line="240" w:lineRule="auto" w:after="40"/>
-              <w:jc w:val="left"/>
-            </w:pPr>
-            <w:r>
-              <w:rPr>
-                <w:rFonts w:ascii="Times New Roman" w:hAnsi="Times New Roman"/>
-                <w:sz w:val="19"/>
-              </w:rPr>
+              <w:jc w:val="left"/>
+            </w:pPr>
+            <w:r>
               <w:t xml:space="preserve">0.28</w:t>
             </w:r>
           </w:p>
@@ -1494,14 +1916,9 @@
           <w:p>
             <w:pPr>
               <w:pStyle w:val="Compact"/>
-              <w:spacing w:line="240" w:lineRule="auto" w:after="40"/>
-              <w:jc w:val="left"/>
-            </w:pPr>
-            <w:r>
-              <w:rPr>
-                <w:rFonts w:ascii="Times New Roman" w:hAnsi="Times New Roman"/>
-                <w:sz w:val="19"/>
-              </w:rPr>
+              <w:jc w:val="left"/>
+            </w:pPr>
+            <w:r>
               <w:t xml:space="preserve">Consistent</w:t>
             </w:r>
           </w:p>
@@ -1513,14 +1930,59 @@
           <w:p>
             <w:pPr>
               <w:pStyle w:val="Compact"/>
-              <w:spacing w:line="240" w:lineRule="auto" w:after="40"/>
-              <w:jc w:val="left"/>
-            </w:pPr>
-            <w:r>
-              <w:rPr>
-                <w:rFonts w:ascii="Times New Roman" w:hAnsi="Times New Roman"/>
-                <w:sz w:val="19"/>
-              </w:rPr>
+              <w:jc w:val="left"/>
+            </w:pPr>
+            <w:r>
+              <w:t xml:space="preserve">P7 timing surprisal S (pooled, n = 685)</w:t>
+            </w:r>
+          </w:p>
+        </w:tc>
+        <w:tc>
+          <w:tcPr/>
+          <w:p>
+            <w:pPr>
+              <w:pStyle w:val="Compact"/>
+              <w:jc w:val="left"/>
+            </w:pPr>
+            <w:r>
+              <w:t xml:space="preserve">+0.04 SD (SE 0.065)</w:t>
+            </w:r>
+          </w:p>
+        </w:tc>
+        <w:tc>
+          <w:tcPr/>
+          <w:p>
+            <w:pPr>
+              <w:pStyle w:val="Compact"/>
+              <w:jc w:val="left"/>
+            </w:pPr>
+            <w:r>
+              <w:t xml:space="preserve">0.27</w:t>
+            </w:r>
+          </w:p>
+        </w:tc>
+        <w:tc>
+          <w:tcPr/>
+          <w:p>
+            <w:pPr>
+              <w:pStyle w:val="Compact"/>
+              <w:jc w:val="left"/>
+            </w:pPr>
+            <w:r>
+              <w:t xml:space="preserve">Not supported</w:t>
+            </w:r>
+          </w:p>
+        </w:tc>
+      </w:tr>
+      <w:tr>
+        <w:tc>
+          <w:tcPr/>
+          <w:p>
+            <w:pPr>
+              <w:pStyle w:val="Compact"/>
+              <w:jc w:val="left"/>
+            </w:pPr>
+            <w:r>
               <w:t xml:space="preserve">P5 redundancy</w:t>
             </w:r>
           </w:p>
@@ -1530,14 +1992,9 @@
           <w:p>
             <w:pPr>
               <w:pStyle w:val="Compact"/>
-              <w:spacing w:line="240" w:lineRule="auto" w:after="40"/>
-              <w:jc w:val="left"/>
-            </w:pPr>
-            <w:r>
-              <w:rPr>
-                <w:rFonts w:ascii="Times New Roman" w:hAnsi="Times New Roman"/>
-                <w:sz w:val="19"/>
-              </w:rPr>
+              <w:jc w:val="left"/>
+            </w:pPr>
+            <w:r>
               <w:t xml:space="preserve">corr(N_c, same-topic posts in prior 24 h) −0.10</w:t>
             </w:r>
           </w:p>
@@ -1547,14 +2004,9 @@
           <w:p>
             <w:pPr>
               <w:pStyle w:val="Compact"/>
-              <w:spacing w:line="240" w:lineRule="auto" w:after="40"/>
-              <w:jc w:val="left"/>
-            </w:pPr>
-            <w:r>
-              <w:rPr>
-                <w:rFonts w:ascii="Times New Roman" w:hAnsi="Times New Roman"/>
-                <w:sz w:val="19"/>
-              </w:rPr>
+              <w:jc w:val="left"/>
+            </w:pPr>
+            <w:r>
               <w:t xml:space="preserve">—</w:t>
             </w:r>
           </w:p>
@@ -1564,14 +2016,9 @@
           <w:p>
             <w:pPr>
               <w:pStyle w:val="Compact"/>
-              <w:spacing w:line="240" w:lineRule="auto" w:after="40"/>
-              <w:jc w:val="left"/>
-            </w:pPr>
-            <w:r>
-              <w:rPr>
-                <w:rFonts w:ascii="Times New Roman" w:hAnsi="Times New Roman"/>
-                <w:sz w:val="19"/>
-              </w:rPr>
+              <w:jc w:val="left"/>
+            </w:pPr>
+            <w:r>
               <w:t xml:space="preserve">Direction as expected; uninformative</w:t>
             </w:r>
           </w:p>
@@ -1607,6 +2054,24 @@
           <w:iCs/>
           <w:i/>
         </w:rPr>
+        <w:t xml:space="preserve">Timing surprisal (P7).</w:t>
+      </w:r>
+      <w:r>
+        <w:t xml:space="preserve"> </w:t>
+      </w:r>
+      <w:r>
+        <w:t xml:space="preserve">The account’s second information channel is the time at which a post arrives. We computed, for each post, the surprisal of its waiting time under a lognormal predictive model fitted to the poster’s own gaps in the preceding 60 days, separately by trading-session bucket (ANALYSIS_PLAN_TIMING.md, registered before the measure was computed). Pooled over the three tick-level samples, a one-SD increase in timing surprisal is associated with 0.04 SD higher |z| (SE 0.065; one-sided p = 0.27; n = 685), with N_c, U, the preceding 30-minute |z|, the prior-hour post count, session and sample controlled. The estimates are +0.08 in the tariff tweets, −0.02 in the oil tweets and −0.01 in the 2026 posts (Holm p ≥ 0.60); a count-based surprisal, winsorizing, a log outcome, dropping bursts and dropping weekends give the same answer. Timing surprisal is nearly uncorrelated with the volatility preceding the post (Spearman 0.05), so the null is not a control artifact. The confidence interval (about −0.09 to +0.17 SD) excludes a medium effect but not a small one. P7 is not supported.</w:t>
+      </w:r>
+    </w:p>
+    <w:p>
+      <w:pPr>
+        <w:pStyle w:val="BodyText"/>
+      </w:pPr>
+      <w:r>
+        <w:rPr>
+          <w:iCs/>
+          <w:i/>
+        </w:rPr>
         <w:t xml:space="preserve">First source.</w:t>
       </w:r>
       <w:r>
@@ -1901,7 +2366,7 @@
         <w:pStyle w:val="FirstParagraph"/>
       </w:pPr>
       <w:r>
-        <w:t xml:space="preserve">The evidence supports four statements. First, platform speech by a head of state arrives as an overdispersed, bursty process whose timing follows volatile market hours. Second, during a period of high uncertainty about one physical state, oil co-moved with posts that humans label de-escalation (about +1.05% in 30 minutes) and, at about half the size, with posts that humans label escalation (+0.48%), and not with posts on topics lacking comparable uncertainty; the model’s labels had suggested a one-sided response because its escalation label is mostly wrong. Third, that co-movement is robust to rank-based and block inference and to standardization, yet at hourly resolution it cannot be separated from drift that precedes the post; at tick resolution, on human-labelled posts, the 30 minutes after the post exceed the 30 minutes before it by 0.48 points (p = 0.030). Fourth, variables that the information-theoretic account says should matter, novelty and prior uncertainty, have the predicted sign consistently in the 2026 sample but are not individually significant, and in an independent 2017–2021 sample they are not supported at all, while the information transferred from post class to return direction is detectably above chance during the closure only. Fifth, in the oil samples the sign of the directional response differed between the closed-strait and open-strait periods: with the strait closed, de-escalation moved oil; with it open, escalation did. We offered the proposition that this reflects the prior (P6), and the pre-registered test in the tariff tweets rejected it, so the difference remains an observation we cannot yet explain.</w:t>
+        <w:t xml:space="preserve">The evidence supports a small number of statements. First, platform speech by a head of state arrives as an overdispersed, bursty process whose timing follows volatile market hours. Second, during a period of high uncertainty about one physical state, oil co-moved with posts that humans label de-escalation (about +1.05% in 30 minutes) and, at about half the size, with posts that humans label escalation (+0.48%), and not with posts on topics lacking comparable uncertainty; the model’s labels had suggested a one-sided response because its escalation label is mostly wrong. Third, that co-movement is robust to rank-based and block inference and to standardization, yet at hourly resolution it cannot be separated from drift that precedes the post; at tick resolution, on human-labelled posts, the 30 minutes after the post exceed the 30 minutes before it by 0.48 points (p = 0.030). Fourth, variables that the information-theoretic account says should matter, novelty and prior uncertainty, have the predicted sign consistently in the 2026 sample but are not individually significant, and in an independent 2017–2021 sample they are not supported at all, while the information transferred from post class to return direction is detectably above chance during the closure only. Fifth, in the oil samples the sign of the directional response differed between the closed-strait and open-strait periods: with the strait closed, de-escalation moved oil; with it open, escalation did. We offered the proposition that this reflects the prior (P6), and the pre-registered test in the tariff tweets rejected it, so the difference remains an observation we cannot yet explain. Sixth, the timing of a post, as opposed to its content, carries no detectable additional information about the 30-minute reaction (P7). Seventh, posting is not Poisson in any series we examined; it is overdispersed and, in multi-year series, self-exciting, a pattern that Elon Musk’s account also shows. Taken together, the measurable implications of the information-theoretic account that held are the descriptive ones (mutual information in the closure sample, and prior uncertainty in the volatility-confounded tariff sample); those about novelty, interaction, state-dependent sign and timing did not.</w:t>
       </w:r>
     </w:p>
     <w:bookmarkEnd w:id="53"/>
@@ -2773,12 +3238,12 @@
         <w:tblLook w:firstRow="1" w:lastRow="0" w:firstColumn="0" w:lastColumn="0" w:noHBand="0" w:noVBand="0" w:val="0020"/>
         <w:jc w:val="start"/>
         <w:tblBorders>
-          <w:top w:val="single" w:sz="4" w:space="0" w:color="888888"/>
-          <w:left w:val="single" w:sz="4" w:space="0" w:color="888888"/>
-          <w:bottom w:val="single" w:sz="4" w:space="0" w:color="888888"/>
-          <w:right w:val="single" w:sz="4" w:space="0" w:color="888888"/>
-          <w:insideH w:val="single" w:sz="4" w:space="0" w:color="888888"/>
-          <w:insideV w:val="single" w:sz="4" w:space="0" w:color="888888"/>
+          <w:top w:val="single" w:sz="4" w:color="000000"/>
+          <w:left w:val="single" w:sz="4" w:color="000000"/>
+          <w:bottom w:val="single" w:sz="4" w:color="000000"/>
+          <w:right w:val="single" w:sz="4" w:color="000000"/>
+          <w:insideH w:val="single" w:sz="4" w:color="000000"/>
+          <w:insideV w:val="single" w:sz="4" w:color="000000"/>
         </w:tblBorders>
       </w:tblPr>
       <w:tblGrid>
@@ -2795,15 +3260,9 @@
           <w:p>
             <w:pPr>
               <w:pStyle w:val="Compact"/>
-              <w:spacing w:line="240" w:lineRule="auto" w:after="40"/>
-              <w:jc w:val="left"/>
-            </w:pPr>
-            <w:r>
-              <w:rPr>
-                <w:rFonts w:ascii="Times New Roman" w:hAnsi="Times New Roman"/>
-                <w:b/>
-                <w:sz w:val="19"/>
-              </w:rPr>
+              <w:jc w:val="left"/>
+            </w:pPr>
+            <w:r>
               <w:t xml:space="preserve">Block</w:t>
             </w:r>
           </w:p>
@@ -2813,15 +3272,9 @@
           <w:p>
             <w:pPr>
               <w:pStyle w:val="Compact"/>
-              <w:spacing w:line="240" w:lineRule="auto" w:after="40"/>
-              <w:jc w:val="left"/>
-            </w:pPr>
-            <w:r>
-              <w:rPr>
-                <w:rFonts w:ascii="Times New Roman" w:hAnsi="Times New Roman"/>
-                <w:b/>
-                <w:sz w:val="19"/>
-              </w:rPr>
+              <w:jc w:val="left"/>
+            </w:pPr>
+            <w:r>
               <w:t xml:space="preserve">Plan</w:t>
             </w:r>
           </w:p>
@@ -2831,15 +3284,9 @@
           <w:p>
             <w:pPr>
               <w:pStyle w:val="Compact"/>
-              <w:spacing w:line="240" w:lineRule="auto" w:after="40"/>
-              <w:jc w:val="left"/>
-            </w:pPr>
-            <w:r>
-              <w:rPr>
-                <w:rFonts w:ascii="Times New Roman" w:hAnsi="Times New Roman"/>
-                <w:b/>
-                <w:sz w:val="19"/>
-              </w:rPr>
+              <w:jc w:val="left"/>
+            </w:pPr>
+            <w:r>
               <w:t xml:space="preserve">Outcome</w:t>
             </w:r>
           </w:p>
@@ -2851,14 +3298,9 @@
           <w:p>
             <w:pPr>
               <w:pStyle w:val="Compact"/>
-              <w:spacing w:line="240" w:lineRule="auto" w:after="40"/>
-              <w:jc w:val="left"/>
-            </w:pPr>
-            <w:r>
-              <w:rPr>
-                <w:rFonts w:ascii="Times New Roman" w:hAnsi="Times New Roman"/>
-                <w:sz w:val="19"/>
-              </w:rPr>
+              <w:jc w:val="left"/>
+            </w:pPr>
+            <w:r>
               <w:t xml:space="preserve">Arrivals</w:t>
             </w:r>
           </w:p>
@@ -2868,14 +3310,9 @@
           <w:p>
             <w:pPr>
               <w:pStyle w:val="Compact"/>
-              <w:spacing w:line="240" w:lineRule="auto" w:after="40"/>
-              <w:jc w:val="left"/>
-            </w:pPr>
-            <w:r>
-              <w:rPr>
-                <w:rFonts w:ascii="Times New Roman" w:hAnsi="Times New Roman"/>
-                <w:sz w:val="19"/>
-              </w:rPr>
+              <w:jc w:val="left"/>
+            </w:pPr>
+            <w:r>
               <w:t xml:space="preserve">poisson_posts/ANALYSIS_PLAN.md</w:t>
             </w:r>
           </w:p>
@@ -2885,14 +3322,9 @@
           <w:p>
             <w:pPr>
               <w:pStyle w:val="Compact"/>
-              <w:spacing w:line="240" w:lineRule="auto" w:after="40"/>
-              <w:jc w:val="left"/>
-            </w:pPr>
-            <w:r>
-              <w:rPr>
-                <w:rFonts w:ascii="Times New Roman" w:hAnsi="Times New Roman"/>
-                <w:sz w:val="19"/>
-              </w:rPr>
+              <w:jc w:val="left"/>
+            </w:pPr>
+            <w:r>
               <w:t xml:space="preserve">Overdispersed; conditionally Poisson</w:t>
             </w:r>
           </w:p>
@@ -2904,14 +3336,9 @@
           <w:p>
             <w:pPr>
               <w:pStyle w:val="Compact"/>
-              <w:spacing w:line="240" w:lineRule="auto" w:after="40"/>
-              <w:jc w:val="left"/>
-            </w:pPr>
-            <w:r>
-              <w:rPr>
-                <w:rFonts w:ascii="Times New Roman" w:hAnsi="Times New Roman"/>
-                <w:sz w:val="19"/>
-              </w:rPr>
+              <w:jc w:val="left"/>
+            </w:pPr>
+            <w:r>
               <w:t xml:space="preserve">Weekly market tests</w:t>
             </w:r>
           </w:p>
@@ -2921,14 +3348,9 @@
           <w:p>
             <w:pPr>
               <w:pStyle w:val="Compact"/>
-              <w:spacing w:line="240" w:lineRule="auto" w:after="40"/>
-              <w:jc w:val="left"/>
-            </w:pPr>
-            <w:r>
-              <w:rPr>
-                <w:rFonts w:ascii="Times New Roman" w:hAnsi="Times New Roman"/>
-                <w:sz w:val="19"/>
-              </w:rPr>
+              <w:jc w:val="left"/>
+            </w:pPr>
+            <w:r>
               <w:t xml:space="preserve">ANALYSIS_PLAN_MARKETS.md</w:t>
             </w:r>
           </w:p>
@@ -2938,14 +3360,9 @@
           <w:p>
             <w:pPr>
               <w:pStyle w:val="Compact"/>
-              <w:spacing w:line="240" w:lineRule="auto" w:after="40"/>
-              <w:jc w:val="left"/>
-            </w:pPr>
-            <w:r>
-              <w:rPr>
-                <w:rFonts w:ascii="Times New Roman" w:hAnsi="Times New Roman"/>
-                <w:sz w:val="19"/>
-              </w:rPr>
+              <w:jc w:val="left"/>
+            </w:pPr>
+            <w:r>
               <w:t xml:space="preserve">Null</w:t>
             </w:r>
           </w:p>
@@ -2957,14 +3374,9 @@
           <w:p>
             <w:pPr>
               <w:pStyle w:val="Compact"/>
-              <w:spacing w:line="240" w:lineRule="auto" w:after="40"/>
-              <w:jc w:val="left"/>
-            </w:pPr>
-            <w:r>
-              <w:rPr>
-                <w:rFonts w:ascii="Times New Roman" w:hAnsi="Times New Roman"/>
-                <w:sz w:val="19"/>
-              </w:rPr>
+              <w:jc w:val="left"/>
+            </w:pPr>
+            <w:r>
               <w:t xml:space="preserve">Intraday core</w:t>
             </w:r>
           </w:p>
@@ -2974,14 +3386,9 @@
           <w:p>
             <w:pPr>
               <w:pStyle w:val="Compact"/>
-              <w:spacing w:line="240" w:lineRule="auto" w:after="40"/>
-              <w:jc w:val="left"/>
-            </w:pPr>
-            <w:r>
-              <w:rPr>
-                <w:rFonts w:ascii="Times New Roman" w:hAnsi="Times New Roman"/>
-                <w:sz w:val="19"/>
-              </w:rPr>
+              <w:jc w:val="left"/>
+            </w:pPr>
+            <w:r>
               <w:t xml:space="preserve">hf/ANALYSIS_PLAN.md (Amendment 1)</w:t>
             </w:r>
           </w:p>
@@ -2991,14 +3398,9 @@
           <w:p>
             <w:pPr>
               <w:pStyle w:val="Compact"/>
-              <w:spacing w:line="240" w:lineRule="auto" w:after="40"/>
-              <w:jc w:val="left"/>
-            </w:pPr>
-            <w:r>
-              <w:rPr>
-                <w:rFonts w:ascii="Times New Roman" w:hAnsi="Times New Roman"/>
-                <w:sz w:val="19"/>
-              </w:rPr>
+              <w:jc w:val="left"/>
+            </w:pPr>
+            <w:r>
               <w:t xml:space="preserve">De-escalation co-movement; none for escalation (exploratory after amendment)</w:t>
             </w:r>
           </w:p>
@@ -3010,14 +3412,9 @@
           <w:p>
             <w:pPr>
               <w:pStyle w:val="Compact"/>
-              <w:spacing w:line="240" w:lineRule="auto" w:after="40"/>
-              <w:jc w:val="left"/>
-            </w:pPr>
-            <w:r>
-              <w:rPr>
-                <w:rFonts w:ascii="Times New Roman" w:hAnsi="Times New Roman"/>
-                <w:sz w:val="19"/>
-              </w:rPr>
+              <w:jc w:val="left"/>
+            </w:pPr>
+            <w:r>
               <w:t xml:space="preserve">Instrumental variables</w:t>
             </w:r>
           </w:p>
@@ -3027,14 +3424,9 @@
           <w:p>
             <w:pPr>
               <w:pStyle w:val="Compact"/>
-              <w:spacing w:line="240" w:lineRule="auto" w:after="40"/>
-              <w:jc w:val="left"/>
-            </w:pPr>
-            <w:r>
-              <w:rPr>
-                <w:rFonts w:ascii="Times New Roman" w:hAnsi="Times New Roman"/>
-                <w:sz w:val="19"/>
-              </w:rPr>
+              <w:jc w:val="left"/>
+            </w:pPr>
+            <w:r>
               <w:t xml:space="preserve">ANALYSIS_PLAN_IV.md</w:t>
             </w:r>
           </w:p>
@@ -3044,14 +3436,9 @@
           <w:p>
             <w:pPr>
               <w:pStyle w:val="Compact"/>
-              <w:spacing w:line="240" w:lineRule="auto" w:after="40"/>
-              <w:jc w:val="left"/>
-            </w:pPr>
-            <w:r>
-              <w:rPr>
-                <w:rFonts w:ascii="Times New Roman" w:hAnsi="Times New Roman"/>
-                <w:sz w:val="19"/>
-              </w:rPr>
+              <w:jc w:val="left"/>
+            </w:pPr>
+            <w:r>
               <w:t xml:space="preserve">Weak first stage (F = 2.8)</w:t>
             </w:r>
           </w:p>
@@ -3063,14 +3450,9 @@
           <w:p>
             <w:pPr>
               <w:pStyle w:val="Compact"/>
-              <w:spacing w:line="240" w:lineRule="auto" w:after="40"/>
-              <w:jc w:val="left"/>
-            </w:pPr>
-            <w:r>
-              <w:rPr>
-                <w:rFonts w:ascii="Times New Roman" w:hAnsi="Times New Roman"/>
-                <w:sz w:val="19"/>
-              </w:rPr>
+              <w:jc w:val="left"/>
+            </w:pPr>
+            <w:r>
               <w:t xml:space="preserve">Extension</w:t>
             </w:r>
           </w:p>
@@ -3080,14 +3462,9 @@
           <w:p>
             <w:pPr>
               <w:pStyle w:val="Compact"/>
-              <w:spacing w:line="240" w:lineRule="auto" w:after="40"/>
-              <w:jc w:val="left"/>
-            </w:pPr>
-            <w:r>
-              <w:rPr>
-                <w:rFonts w:ascii="Times New Roman" w:hAnsi="Times New Roman"/>
-                <w:sz w:val="19"/>
-              </w:rPr>
+              <w:jc w:val="left"/>
+            </w:pPr>
+            <w:r>
               <w:t xml:space="preserve">ANALYSIS_PLAN_EXT.md</w:t>
             </w:r>
           </w:p>
@@ -3097,14 +3474,9 @@
           <w:p>
             <w:pPr>
               <w:pStyle w:val="Compact"/>
-              <w:spacing w:line="240" w:lineRule="auto" w:after="40"/>
-              <w:jc w:val="left"/>
-            </w:pPr>
-            <w:r>
-              <w:rPr>
-                <w:rFonts w:ascii="Times New Roman" w:hAnsi="Times New Roman"/>
-                <w:sz w:val="19"/>
-              </w:rPr>
+              <w:jc w:val="left"/>
+            </w:pPr>
+            <w:r>
               <w:t xml:space="preserve">Coder-robust; partial pre-war replication; reversal for other oil posts</w:t>
             </w:r>
           </w:p>
@@ -3116,14 +3488,9 @@
           <w:p>
             <w:pPr>
               <w:pStyle w:val="Compact"/>
-              <w:spacing w:line="240" w:lineRule="auto" w:after="40"/>
-              <w:jc w:val="left"/>
-            </w:pPr>
-            <w:r>
-              <w:rPr>
-                <w:rFonts w:ascii="Times New Roman" w:hAnsi="Times New Roman"/>
-                <w:sz w:val="19"/>
-              </w:rPr>
+              <w:jc w:val="left"/>
+            </w:pPr>
+            <w:r>
               <w:t xml:space="preserve">Binding constraint</w:t>
             </w:r>
           </w:p>
@@ -3133,14 +3500,9 @@
           <w:p>
             <w:pPr>
               <w:pStyle w:val="Compact"/>
-              <w:spacing w:line="240" w:lineRule="auto" w:after="40"/>
-              <w:jc w:val="left"/>
-            </w:pPr>
-            <w:r>
-              <w:rPr>
-                <w:rFonts w:ascii="Times New Roman" w:hAnsi="Times New Roman"/>
-                <w:sz w:val="19"/>
-              </w:rPr>
+              <w:jc w:val="left"/>
+            </w:pPr>
+            <w:r>
               <w:t xml:space="preserve">THEORY_AND_PAPER_PLAN.md</w:t>
             </w:r>
           </w:p>
@@ -3150,14 +3512,9 @@
           <w:p>
             <w:pPr>
               <w:pStyle w:val="Compact"/>
-              <w:spacing w:line="240" w:lineRule="auto" w:after="40"/>
-              <w:jc w:val="left"/>
-            </w:pPr>
-            <w:r>
-              <w:rPr>
-                <w:rFonts w:ascii="Times New Roman" w:hAnsi="Times New Roman"/>
-                <w:sz w:val="19"/>
-              </w:rPr>
+              <w:jc w:val="left"/>
+            </w:pPr>
+            <w:r>
               <w:t xml:space="preserve">Partly supported</w:t>
             </w:r>
           </w:p>
@@ -3169,14 +3526,9 @@
           <w:p>
             <w:pPr>
               <w:pStyle w:val="Compact"/>
-              <w:spacing w:line="240" w:lineRule="auto" w:after="40"/>
-              <w:jc w:val="left"/>
-            </w:pPr>
-            <w:r>
-              <w:rPr>
-                <w:rFonts w:ascii="Times New Roman" w:hAnsi="Times New Roman"/>
-                <w:sz w:val="19"/>
-              </w:rPr>
+              <w:jc w:val="left"/>
+            </w:pPr>
+            <w:r>
               <w:t xml:space="preserve">Salience</w:t>
             </w:r>
           </w:p>
@@ -3186,14 +3538,9 @@
           <w:p>
             <w:pPr>
               <w:pStyle w:val="Compact"/>
-              <w:spacing w:line="240" w:lineRule="auto" w:after="40"/>
-              <w:jc w:val="left"/>
-            </w:pPr>
-            <w:r>
-              <w:rPr>
-                <w:rFonts w:ascii="Times New Roman" w:hAnsi="Times New Roman"/>
-                <w:sz w:val="19"/>
-              </w:rPr>
+              <w:jc w:val="left"/>
+            </w:pPr>
+            <w:r>
               <w:t xml:space="preserve">THEORY_V2_SALIENCE.md</w:t>
             </w:r>
           </w:p>
@@ -3203,14 +3550,9 @@
           <w:p>
             <w:pPr>
               <w:pStyle w:val="Compact"/>
-              <w:spacing w:line="240" w:lineRule="auto" w:after="40"/>
-              <w:jc w:val="left"/>
-            </w:pPr>
-            <w:r>
-              <w:rPr>
-                <w:rFonts w:ascii="Times New Roman" w:hAnsi="Times New Roman"/>
-                <w:sz w:val="19"/>
-              </w:rPr>
+              <w:jc w:val="left"/>
+            </w:pPr>
+            <w:r>
               <w:t xml:space="preserve">Rejected</w:t>
             </w:r>
           </w:p>
@@ -3222,14 +3564,9 @@
           <w:p>
             <w:pPr>
               <w:pStyle w:val="Compact"/>
-              <w:spacing w:line="240" w:lineRule="auto" w:after="40"/>
-              <w:jc w:val="left"/>
-            </w:pPr>
-            <w:r>
-              <w:rPr>
-                <w:rFonts w:ascii="Times New Roman" w:hAnsi="Times New Roman"/>
-                <w:sz w:val="19"/>
-              </w:rPr>
+              <w:jc w:val="left"/>
+            </w:pPr>
+            <w:r>
               <w:t xml:space="preserve">Habituation</w:t>
             </w:r>
           </w:p>
@@ -3239,14 +3576,9 @@
           <w:p>
             <w:pPr>
               <w:pStyle w:val="Compact"/>
-              <w:spacing w:line="240" w:lineRule="auto" w:after="40"/>
-              <w:jc w:val="left"/>
-            </w:pPr>
-            <w:r>
-              <w:rPr>
-                <w:rFonts w:ascii="Times New Roman" w:hAnsi="Times New Roman"/>
-                <w:sz w:val="19"/>
-              </w:rPr>
+              <w:jc w:val="left"/>
+            </w:pPr>
+            <w:r>
               <w:t xml:space="preserve">THEORY_V3_HABITUATION.md</w:t>
             </w:r>
           </w:p>
@@ -3256,14 +3588,9 @@
           <w:p>
             <w:pPr>
               <w:pStyle w:val="Compact"/>
-              <w:spacing w:line="240" w:lineRule="auto" w:after="40"/>
-              <w:jc w:val="left"/>
-            </w:pPr>
-            <w:r>
-              <w:rPr>
-                <w:rFonts w:ascii="Times New Roman" w:hAnsi="Times New Roman"/>
-                <w:sz w:val="19"/>
-              </w:rPr>
+              <w:jc w:val="left"/>
+            </w:pPr>
+            <w:r>
               <w:t xml:space="preserve">Underpowered</w:t>
             </w:r>
           </w:p>
@@ -3275,14 +3602,9 @@
           <w:p>
             <w:pPr>
               <w:pStyle w:val="Compact"/>
-              <w:spacing w:line="240" w:lineRule="auto" w:after="40"/>
-              <w:jc w:val="left"/>
-            </w:pPr>
-            <w:r>
-              <w:rPr>
-                <w:rFonts w:ascii="Times New Roman" w:hAnsi="Times New Roman"/>
-                <w:sz w:val="19"/>
-              </w:rPr>
+              <w:jc w:val="left"/>
+            </w:pPr>
+            <w:r>
               <w:t xml:space="preserve">Content analysis</w:t>
             </w:r>
           </w:p>
@@ -3292,14 +3614,9 @@
           <w:p>
             <w:pPr>
               <w:pStyle w:val="Compact"/>
-              <w:spacing w:line="240" w:lineRule="auto" w:after="40"/>
-              <w:jc w:val="left"/>
-            </w:pPr>
-            <w:r>
-              <w:rPr>
-                <w:rFonts w:ascii="Times New Roman" w:hAnsi="Times New Roman"/>
-                <w:sz w:val="19"/>
-              </w:rPr>
+              <w:jc w:val="left"/>
+            </w:pPr>
+            <w:r>
               <w:t xml:space="preserve">ANALYSIS_PLAN_QUAL.md (Amendments 1–2)</w:t>
             </w:r>
           </w:p>
@@ -3309,14 +3626,9 @@
           <w:p>
             <w:pPr>
               <w:pStyle w:val="Compact"/>
-              <w:spacing w:line="240" w:lineRule="auto" w:after="40"/>
-              <w:jc w:val="left"/>
-            </w:pPr>
-            <w:r>
-              <w:rPr>
-                <w:rFonts w:ascii="Times New Roman" w:hAnsi="Times New Roman"/>
-                <w:sz w:val="19"/>
-              </w:rPr>
+              <w:jc w:val="left"/>
+            </w:pPr>
+            <w:r>
               <w:t xml:space="preserve">Five themes; four propositions</w:t>
             </w:r>
           </w:p>
@@ -3328,14 +3640,9 @@
           <w:p>
             <w:pPr>
               <w:pStyle w:val="Compact"/>
-              <w:spacing w:line="240" w:lineRule="auto" w:after="40"/>
-              <w:jc w:val="left"/>
-            </w:pPr>
-            <w:r>
-              <w:rPr>
-                <w:rFonts w:ascii="Times New Roman" w:hAnsi="Times New Roman"/>
-                <w:sz w:val="19"/>
-              </w:rPr>
+              <w:jc w:val="left"/>
+            </w:pPr>
+            <w:r>
               <w:t xml:space="preserve">Held-out tests of propositions</w:t>
             </w:r>
           </w:p>
@@ -3345,14 +3652,9 @@
           <w:p>
             <w:pPr>
               <w:pStyle w:val="Compact"/>
-              <w:spacing w:line="240" w:lineRule="auto" w:after="40"/>
-              <w:jc w:val="left"/>
-            </w:pPr>
-            <w:r>
-              <w:rPr>
-                <w:rFonts w:ascii="Times New Roman" w:hAnsi="Times New Roman"/>
-                <w:sz w:val="19"/>
-              </w:rPr>
+              <w:jc w:val="left"/>
+            </w:pPr>
+            <w:r>
               <w:t xml:space="preserve">ANALYSIS_PLAN_QUAL_TESTS.md</w:t>
             </w:r>
           </w:p>
@@ -3362,14 +3664,9 @@
           <w:p>
             <w:pPr>
               <w:pStyle w:val="Compact"/>
-              <w:spacing w:line="240" w:lineRule="auto" w:after="40"/>
-              <w:jc w:val="left"/>
-            </w:pPr>
-            <w:r>
-              <w:rPr>
-                <w:rFonts w:ascii="Times New Roman" w:hAnsi="Times New Roman"/>
-                <w:sz w:val="19"/>
-              </w:rPr>
+              <w:jc w:val="left"/>
+            </w:pPr>
+            <w:r>
               <w:t xml:space="preserve">Not supported</w:t>
             </w:r>
           </w:p>
@@ -3381,14 +3678,9 @@
           <w:p>
             <w:pPr>
               <w:pStyle w:val="Compact"/>
-              <w:spacing w:line="240" w:lineRule="auto" w:after="40"/>
-              <w:jc w:val="left"/>
-            </w:pPr>
-            <w:r>
-              <w:rPr>
-                <w:rFonts w:ascii="Times New Roman" w:hAnsi="Times New Roman"/>
-                <w:sz w:val="19"/>
-              </w:rPr>
+              <w:jc w:val="left"/>
+            </w:pPr>
+            <w:r>
               <w:t xml:space="preserve">Pre-trend control</w:t>
             </w:r>
           </w:p>
@@ -3398,14 +3690,9 @@
           <w:p>
             <w:pPr>
               <w:pStyle w:val="Compact"/>
-              <w:spacing w:line="240" w:lineRule="auto" w:after="40"/>
-              <w:jc w:val="left"/>
-            </w:pPr>
-            <w:r>
-              <w:rPr>
-                <w:rFonts w:ascii="Times New Roman" w:hAnsi="Times New Roman"/>
-                <w:sz w:val="19"/>
-              </w:rPr>
+              <w:jc w:val="left"/>
+            </w:pPr>
+            <w:r>
               <w:t xml:space="preserve">ANALYSIS_PLAN_PRETREND.md</w:t>
             </w:r>
           </w:p>
@@ -3415,14 +3702,9 @@
           <w:p>
             <w:pPr>
               <w:pStyle w:val="Compact"/>
-              <w:spacing w:line="240" w:lineRule="auto" w:after="40"/>
-              <w:jc w:val="left"/>
-            </w:pPr>
-            <w:r>
-              <w:rPr>
-                <w:rFonts w:ascii="Times New Roman" w:hAnsi="Times New Roman"/>
-                <w:sz w:val="19"/>
-              </w:rPr>
+              <w:jc w:val="left"/>
+            </w:pPr>
+            <w:r>
               <w:t xml:space="preserve">Estimate unchanged; control uninformative</w:t>
             </w:r>
           </w:p>
@@ -3434,14 +3716,9 @@
           <w:p>
             <w:pPr>
               <w:pStyle w:val="Compact"/>
-              <w:spacing w:line="240" w:lineRule="auto" w:after="40"/>
-              <w:jc w:val="left"/>
-            </w:pPr>
-            <w:r>
-              <w:rPr>
-                <w:rFonts w:ascii="Times New Roman" w:hAnsi="Times New Roman"/>
-                <w:sz w:val="19"/>
-              </w:rPr>
+              <w:jc w:val="left"/>
+            </w:pPr>
+            <w:r>
               <w:t xml:space="preserve">First source</w:t>
             </w:r>
           </w:p>
@@ -3451,14 +3728,9 @@
           <w:p>
             <w:pPr>
               <w:pStyle w:val="Compact"/>
-              <w:spacing w:line="240" w:lineRule="auto" w:after="40"/>
-              <w:jc w:val="left"/>
-            </w:pPr>
-            <w:r>
-              <w:rPr>
-                <w:rFonts w:ascii="Times New Roman" w:hAnsi="Times New Roman"/>
-                <w:sz w:val="19"/>
-              </w:rPr>
+              <w:jc w:val="left"/>
+            </w:pPr>
+            <w:r>
               <w:t xml:space="preserve">ANALYSIS_PLAN_WIRE.md</w:t>
             </w:r>
           </w:p>
@@ -3468,14 +3740,9 @@
           <w:p>
             <w:pPr>
               <w:pStyle w:val="Compact"/>
-              <w:spacing w:line="240" w:lineRule="auto" w:after="40"/>
-              <w:jc w:val="left"/>
-            </w:pPr>
-            <w:r>
-              <w:rPr>
-                <w:rFonts w:ascii="Times New Roman" w:hAnsi="Times New Roman"/>
-                <w:sz w:val="19"/>
-              </w:rPr>
+              <w:jc w:val="left"/>
+            </w:pPr>
+            <w:r>
               <w:t xml:space="preserve">Not supported (p = 0.176)</w:t>
             </w:r>
           </w:p>
@@ -3487,14 +3754,9 @@
           <w:p>
             <w:pPr>
               <w:pStyle w:val="Compact"/>
-              <w:spacing w:line="240" w:lineRule="auto" w:after="40"/>
-              <w:jc w:val="left"/>
-            </w:pPr>
-            <w:r>
-              <w:rPr>
-                <w:rFonts w:ascii="Times New Roman" w:hAnsi="Times New Roman"/>
-                <w:sz w:val="19"/>
-              </w:rPr>
+              <w:jc w:val="left"/>
+            </w:pPr>
+            <w:r>
               <w:t xml:space="preserve">Tick-level timing</w:t>
             </w:r>
           </w:p>
@@ -3504,14 +3766,9 @@
           <w:p>
             <w:pPr>
               <w:pStyle w:val="Compact"/>
-              <w:spacing w:line="240" w:lineRule="auto" w:after="40"/>
-              <w:jc w:val="left"/>
-            </w:pPr>
-            <w:r>
-              <w:rPr>
-                <w:rFonts w:ascii="Times New Roman" w:hAnsi="Times New Roman"/>
-                <w:sz w:val="19"/>
-              </w:rPr>
+              <w:jc w:val="left"/>
+            </w:pPr>
+            <w:r>
               <w:t xml:space="preserve">ANALYSIS_PLAN_5MIN.md</w:t>
             </w:r>
           </w:p>
@@ -3521,14 +3778,9 @@
           <w:p>
             <w:pPr>
               <w:pStyle w:val="Compact"/>
-              <w:spacing w:line="240" w:lineRule="auto" w:after="40"/>
-              <w:jc w:val="left"/>
-            </w:pPr>
-            <w:r>
-              <w:rPr>
-                <w:rFonts w:ascii="Times New Roman" w:hAnsi="Times New Roman"/>
-                <w:sz w:val="19"/>
-              </w:rPr>
+              <w:jc w:val="left"/>
+            </w:pPr>
+            <w:r>
               <w:t xml:space="preserve">H5a, H5b supported for de-escalation posts; H5c pending</w:t>
             </w:r>
           </w:p>
@@ -3540,14 +3792,9 @@
           <w:p>
             <w:pPr>
               <w:pStyle w:val="Compact"/>
-              <w:spacing w:line="240" w:lineRule="auto" w:after="40"/>
-              <w:jc w:val="left"/>
-            </w:pPr>
-            <w:r>
-              <w:rPr>
-                <w:rFonts w:ascii="Times New Roman" w:hAnsi="Times New Roman"/>
-                <w:sz w:val="19"/>
-              </w:rPr>
+              <w:jc w:val="left"/>
+            </w:pPr>
+            <w:r>
               <w:t xml:space="preserve">Twitter-era oil/Iran sample</w:t>
             </w:r>
           </w:p>
@@ -3557,14 +3804,9 @@
           <w:p>
             <w:pPr>
               <w:pStyle w:val="Compact"/>
-              <w:spacing w:line="240" w:lineRule="auto" w:after="40"/>
-              <w:jc w:val="left"/>
-            </w:pPr>
-            <w:r>
-              <w:rPr>
-                <w:rFonts w:ascii="Times New Roman" w:hAnsi="Times New Roman"/>
-                <w:sz w:val="19"/>
-              </w:rPr>
+              <w:jc w:val="left"/>
+            </w:pPr>
+            <w:r>
               <w:t xml:space="preserve">twitter/ANALYSIS_PLAN_TWITTER.md (Amendment 1)</w:t>
             </w:r>
           </w:p>
@@ -3574,14 +3816,9 @@
           <w:p>
             <w:pPr>
               <w:pStyle w:val="Compact"/>
-              <w:spacing w:line="240" w:lineRule="auto" w:after="40"/>
-              <w:jc w:val="left"/>
-            </w:pPr>
-            <w:r>
-              <w:rPr>
-                <w:rFonts w:ascii="Times New Roman" w:hAnsi="Times New Roman"/>
-                <w:sz w:val="19"/>
-              </w:rPr>
+              <w:jc w:val="left"/>
+            </w:pPr>
+            <w:r>
               <w:t xml:space="preserve">HI1–HI3 not supported (Holm p ≥ 0.45); H10 supported for escalation (p = 0.001), not for de-escalation</w:t>
             </w:r>
           </w:p>
@@ -3593,14 +3830,9 @@
           <w:p>
             <w:pPr>
               <w:pStyle w:val="Compact"/>
-              <w:spacing w:line="240" w:lineRule="auto" w:after="40"/>
-              <w:jc w:val="left"/>
-            </w:pPr>
-            <w:r>
-              <w:rPr>
-                <w:rFonts w:ascii="Times New Roman" w:hAnsi="Times New Roman"/>
-                <w:sz w:val="19"/>
-              </w:rPr>
+              <w:jc w:val="left"/>
+            </w:pPr>
+            <w:r>
               <w:t xml:space="preserve">Twitter-era tariff/trade sample</w:t>
             </w:r>
           </w:p>
@@ -3610,14 +3842,9 @@
           <w:p>
             <w:pPr>
               <w:pStyle w:val="Compact"/>
-              <w:spacing w:line="240" w:lineRule="auto" w:after="40"/>
-              <w:jc w:val="left"/>
-            </w:pPr>
-            <w:r>
-              <w:rPr>
-                <w:rFonts w:ascii="Times New Roman" w:hAnsi="Times New Roman"/>
-                <w:sz w:val="19"/>
-              </w:rPr>
+              <w:jc w:val="left"/>
+            </w:pPr>
+            <w:r>
               <w:t xml:space="preserve">twitter/ANALYSIS_PLAN_TARIFF.md (Amendment 1: P6/H12 state-dependent sign)</w:t>
             </w:r>
           </w:p>
@@ -3627,14 +3854,9 @@
           <w:p>
             <w:pPr>
               <w:pStyle w:val="Compact"/>
-              <w:spacing w:line="240" w:lineRule="auto" w:after="40"/>
-              <w:jc w:val="left"/>
-            </w:pPr>
-            <w:r>
-              <w:rPr>
-                <w:rFonts w:ascii="Times New Roman" w:hAnsi="Times New Roman"/>
-                <w:sz w:val="19"/>
-              </w:rPr>
+              <w:jc w:val="left"/>
+            </w:pPr>
+            <w:r>
               <w:t xml:space="preserve">HI2 supported (Holm p &lt; 0.001; volatility caveat); HI1, HI3 not supported; H10 supported (small); H12 not supported, opposite sign (β = −0.097)</w:t>
             </w:r>
           </w:p>
@@ -3646,14 +3868,9 @@
           <w:p>
             <w:pPr>
               <w:pStyle w:val="Compact"/>
-              <w:spacing w:line="240" w:lineRule="auto" w:after="40"/>
-              <w:jc w:val="left"/>
-            </w:pPr>
-            <w:r>
-              <w:rPr>
-                <w:rFonts w:ascii="Times New Roman" w:hAnsi="Times New Roman"/>
-                <w:sz w:val="19"/>
-              </w:rPr>
+              <w:jc w:val="left"/>
+            </w:pPr>
+            <w:r>
               <w:t xml:space="preserve">Human validation, H7 (human-labelled sample)</w:t>
             </w:r>
           </w:p>
@@ -3663,14 +3880,9 @@
           <w:p>
             <w:pPr>
               <w:pStyle w:val="Compact"/>
-              <w:spacing w:line="240" w:lineRule="auto" w:after="40"/>
-              <w:jc w:val="left"/>
-            </w:pPr>
-            <w:r>
-              <w:rPr>
-                <w:rFonts w:ascii="Times New Roman" w:hAnsi="Times New Roman"/>
-                <w:sz w:val="19"/>
-              </w:rPr>
+              <w:jc w:val="left"/>
+            </w:pPr>
+            <w:r>
               <w:t xml:space="preserve">ANALYSIS_PLAN_HUMAN.md (Amendments 1–2)</w:t>
             </w:r>
           </w:p>
@@ -3680,14 +3892,9 @@
           <w:p>
             <w:pPr>
               <w:pStyle w:val="Compact"/>
-              <w:spacing w:line="240" w:lineRule="auto" w:after="40"/>
-              <w:jc w:val="left"/>
-            </w:pPr>
-            <w:r>
-              <w:rPr>
-                <w:rFonts w:ascii="Times New Roman" w:hAnsi="Times New Roman"/>
-                <w:sz w:val="19"/>
-              </w:rPr>
+              <w:jc w:val="left"/>
+            </w:pPr>
+            <w:r>
               <w:t xml:space="preserve">H7a, H7b supported for de-escalation (p = 0.0002, 0.030); escalation +0.48% (p = 0.007)</w:t>
             </w:r>
           </w:p>
@@ -3699,14 +3906,9 @@
           <w:p>
             <w:pPr>
               <w:pStyle w:val="Compact"/>
-              <w:spacing w:line="240" w:lineRule="auto" w:after="40"/>
-              <w:jc w:val="left"/>
-            </w:pPr>
-            <w:r>
-              <w:rPr>
-                <w:rFonts w:ascii="Times New Roman" w:hAnsi="Times New Roman"/>
-                <w:sz w:val="19"/>
-              </w:rPr>
+              <w:jc w:val="left"/>
+            </w:pPr>
+            <w:r>
               <w:t xml:space="preserve">Human validation (round 2)</w:t>
             </w:r>
           </w:p>
@@ -3716,14 +3918,9 @@
           <w:p>
             <w:pPr>
               <w:pStyle w:val="Compact"/>
-              <w:spacing w:line="240" w:lineRule="auto" w:after="40"/>
-              <w:jc w:val="left"/>
-            </w:pPr>
-            <w:r>
-              <w:rPr>
-                <w:rFonts w:ascii="Times New Roman" w:hAnsi="Times New Roman"/>
-                <w:sz w:val="19"/>
-              </w:rPr>
+              <w:jc w:val="left"/>
+            </w:pPr>
+            <w:r>
               <w:t xml:space="preserve">ANALYSIS_PLAN_HUMAN.md (Amendment 1)</w:t>
             </w:r>
           </w:p>
@@ -3733,14 +3930,9 @@
           <w:p>
             <w:pPr>
               <w:pStyle w:val="Compact"/>
-              <w:spacing w:line="240" w:lineRule="auto" w:after="40"/>
-              <w:jc w:val="left"/>
-            </w:pPr>
-            <w:r>
-              <w:rPr>
-                <w:rFonts w:ascii="Times New Roman" w:hAnsi="Times New Roman"/>
-                <w:sz w:val="19"/>
-              </w:rPr>
+              <w:jc w:val="left"/>
+            </w:pPr>
+            <w:r>
               <w:t xml:space="preserve">Round 1 κ 0.43–0.56; round 2 (61 war-period posts, adjudicated) κ 0.29, H6a supported, H6c not supported</w:t>
             </w:r>
           </w:p>
@@ -3752,14 +3944,9 @@
           <w:p>
             <w:pPr>
               <w:pStyle w:val="Compact"/>
-              <w:spacing w:line="240" w:lineRule="auto" w:after="40"/>
-              <w:jc w:val="left"/>
-            </w:pPr>
-            <w:r>
-              <w:rPr>
-                <w:rFonts w:ascii="Times New Roman" w:hAnsi="Times New Roman"/>
-                <w:sz w:val="19"/>
-              </w:rPr>
+              <w:jc w:val="left"/>
+            </w:pPr>
+            <w:r>
               <w:t xml:space="preserve">Revision analyses</w:t>
             </w:r>
           </w:p>
@@ -3769,14 +3956,9 @@
           <w:p>
             <w:pPr>
               <w:pStyle w:val="Compact"/>
-              <w:spacing w:line="240" w:lineRule="auto" w:after="40"/>
-              <w:jc w:val="left"/>
-            </w:pPr>
-            <w:r>
-              <w:rPr>
-                <w:rFonts w:ascii="Times New Roman" w:hAnsi="Times New Roman"/>
-                <w:sz w:val="19"/>
-              </w:rPr>
+              <w:jc w:val="left"/>
+            </w:pPr>
+            <w:r>
               <w:t xml:space="preserve">ANALYSIS_PLAN_REVISION.md</w:t>
             </w:r>
           </w:p>
@@ -3786,14 +3968,9 @@
           <w:p>
             <w:pPr>
               <w:pStyle w:val="Compact"/>
-              <w:spacing w:line="240" w:lineRule="auto" w:after="40"/>
-              <w:jc w:val="left"/>
-            </w:pPr>
-            <w:r>
-              <w:rPr>
-                <w:rFonts w:ascii="Times New Roman" w:hAnsi="Times New Roman"/>
-                <w:sz w:val="19"/>
-              </w:rPr>
+              <w:jc w:val="left"/>
+            </w:pPr>
+            <w:r>
               <w:t xml:space="preserve">Revised primary not supported; robust inference supports; posting follows volatility</w:t>
             </w:r>
           </w:p>
@@ -3805,14 +3982,123 @@
           <w:p>
             <w:pPr>
               <w:pStyle w:val="Compact"/>
-              <w:spacing w:line="240" w:lineRule="auto" w:after="40"/>
-              <w:jc w:val="left"/>
-            </w:pPr>
-            <w:r>
-              <w:rPr>
-                <w:rFonts w:ascii="Times New Roman" w:hAnsi="Times New Roman"/>
-                <w:sz w:val="19"/>
-              </w:rPr>
+              <w:jc w:val="left"/>
+            </w:pPr>
+            <w:r>
+              <w:t xml:space="preserve">Timing surprisal (P7)</w:t>
+            </w:r>
+          </w:p>
+        </w:tc>
+        <w:tc>
+          <w:tcPr/>
+          <w:p>
+            <w:pPr>
+              <w:pStyle w:val="Compact"/>
+              <w:jc w:val="left"/>
+            </w:pPr>
+            <w:r>
+              <w:t xml:space="preserve">arrivals/ANALYSIS_PLAN_TIMING.md</w:t>
+            </w:r>
+          </w:p>
+        </w:tc>
+        <w:tc>
+          <w:tcPr/>
+          <w:p>
+            <w:pPr>
+              <w:pStyle w:val="Compact"/>
+              <w:jc w:val="left"/>
+            </w:pPr>
+            <w:r>
+              <w:t xml:space="preserve">Not supported (pooled β = +0.04 SD, p = 0.27; n = 685)</w:t>
+            </w:r>
+          </w:p>
+        </w:tc>
+      </w:tr>
+      <w:tr>
+        <w:tc>
+          <w:tcPr/>
+          <w:p>
+            <w:pPr>
+              <w:pStyle w:val="Compact"/>
+              <w:jc w:val="left"/>
+            </w:pPr>
+            <w:r>
+              <w:t xml:space="preserve">Arrival models and Musk account</w:t>
+            </w:r>
+          </w:p>
+        </w:tc>
+        <w:tc>
+          <w:tcPr/>
+          <w:p>
+            <w:pPr>
+              <w:pStyle w:val="Compact"/>
+              <w:jc w:val="left"/>
+            </w:pPr>
+            <w:r>
+              <w:t xml:space="preserve">none (descriptive; arrivals/RESULTS_ARRIVALS_MODELS.md)</w:t>
+            </w:r>
+          </w:p>
+        </w:tc>
+        <w:tc>
+          <w:tcPr/>
+          <w:p>
+            <w:pPr>
+              <w:pStyle w:val="Compact"/>
+              <w:jc w:val="left"/>
+            </w:pPr>
+            <w:r>
+              <w:t xml:space="preserve">Poisson rejected; NB ≈ Poisson–lognormal; dynamic NB-INGARCH best in multi-year series</w:t>
+            </w:r>
+          </w:p>
+        </w:tc>
+      </w:tr>
+      <w:tr>
+        <w:tc>
+          <w:tcPr/>
+          <w:p>
+            <w:pPr>
+              <w:pStyle w:val="Compact"/>
+              <w:jc w:val="left"/>
+            </w:pPr>
+            <w:r>
+              <w:t xml:space="preserve">Matched-account comparison (HA1–HA2)</w:t>
+            </w:r>
+          </w:p>
+        </w:tc>
+        <w:tc>
+          <w:tcPr/>
+          <w:p>
+            <w:pPr>
+              <w:pStyle w:val="Compact"/>
+              <w:jc w:val="left"/>
+            </w:pPr>
+            <w:r>
+              <w:t xml:space="preserve">arrivals/ANALYSIS_PLAN_ACCOUNTS.md</w:t>
+            </w:r>
+          </w:p>
+        </w:tc>
+        <w:tc>
+          <w:tcPr/>
+          <w:p>
+            <w:pPr>
+              <w:pStyle w:val="Compact"/>
+              <w:jc w:val="left"/>
+            </w:pPr>
+            <w:r>
+              <w:t xml:space="preserve">Registered, not run; data availability not established</w:t>
+            </w:r>
+          </w:p>
+        </w:tc>
+      </w:tr>
+      <w:tr>
+        <w:tc>
+          <w:tcPr/>
+          <w:p>
+            <w:pPr>
+              <w:pStyle w:val="Compact"/>
+              <w:jc w:val="left"/>
+            </w:pPr>
+            <w:r>
               <w:t xml:space="preserve">Information-theoretic hypotheses</w:t>
             </w:r>
           </w:p>
@@ -3822,14 +4108,9 @@
           <w:p>
             <w:pPr>
               <w:pStyle w:val="Compact"/>
-              <w:spacing w:line="240" w:lineRule="auto" w:after="40"/>
-              <w:jc w:val="left"/>
-            </w:pPr>
-            <w:r>
-              <w:rPr>
-                <w:rFonts w:ascii="Times New Roman" w:hAnsi="Times New Roman"/>
-                <w:sz w:val="19"/>
-              </w:rPr>
+              <w:jc w:val="left"/>
+            </w:pPr>
+            <w:r>
               <w:t xml:space="preserve">ANALYSIS_PLAN_INFO.md</w:t>
             </w:r>
           </w:p>
@@ -3839,14 +4120,9 @@
           <w:p>
             <w:pPr>
               <w:pStyle w:val="Compact"/>
-              <w:spacing w:line="240" w:lineRule="auto" w:after="40"/>
-              <w:jc w:val="left"/>
-            </w:pPr>
-            <w:r>
-              <w:rPr>
-                <w:rFonts w:ascii="Times New Roman" w:hAnsi="Times New Roman"/>
-                <w:sz w:val="19"/>
-              </w:rPr>
+              <w:jc w:val="left"/>
+            </w:pPr>
+            <w:r>
               <w:t xml:space="preserve">P1–P3 not supported (p = 0.08, 0.07, 0.52); P4 supported (p = 0.041)</w:t>
             </w:r>
           </w:p>

</xml_diff>

<commit_message>
Complete H5c/H8: placebo supports post-window move; pre-post drift also exceeds placebo
Co-Authored-By: Claude Sonnet 5.5 <noreply@anthropic.com>
Claude-Session: https://claude.ai/code/session_011aZmoPyuUT34TyBPwawaPZ
</commit_message>
<xml_diff>
--- a/misq_note/hf/MANUSCRIPT_MISQ_v2.docx
+++ b/misq_note/hf/MANUSCRIPT_MISQ_v2.docx
@@ -1482,6 +1482,24 @@
         <w:t xml:space="preserve">Before the war, de-escalation posts about Iran show the same sign at about a quarter of the size, significant only for posts on which both coders agree (−0.62%, n = 8, p = 0.008). For posts about Russia, Venezuela, and other oil-related geopolitics the pattern reverses: escalation raises oil (+0.46%, p = 0.013). Posts about monetary policy and non-tariff China matters show essentially no hourly reaction. After escalation posts, oil drifts upward over four to twelve hours (+0.71% at four hours, +1.36% at twelve; week-block CIs touch zero); this lies outside the pre-registered window and was not tested.</w:t>
       </w:r>
     </w:p>
+    <w:p>
+      <w:pPr>
+        <w:pStyle w:val="BodyText"/>
+      </w:pPr>
+      <w:r>
+        <w:rPr>
+          <w:bCs/>
+          <w:b/>
+        </w:rPr>
+        <w:t xml:space="preserve">Matched-hour placebo and pre-post drift.</w:t>
+      </w:r>
+      <w:r>
+        <w:t xml:space="preserve"> </w:t>
+      </w:r>
+      <w:r>
+        <w:t xml:space="preserve">To check that the co-movement is not an artefact of the hours in which posts happen to fall, we drew fake post times in the same clock hour on neighbouring days (with the same weekday status, at least two hours from any labelled post; 10,000 draws; ANALYSIS_PLAN_H5C_H8.md). On the adjudicated human-labelled posts (26 de-escalation, 14 escalation, after a three-hour cluster filter), the mean directional 30-minute return after the post is +0.62% for de-escalation and +0.53% for escalation, against placebo means of +0.05% and 95th percentiles of 0.22% and 0.26% (shares of placebo draws at least as large: below 0.0001 and 0.0003). The same test with model labels gives smaller but comparable results. The 30 minutes before the post also exceed the placebo for de-escalation (+0.57%, and +0.86% over the preceding hour; both below 0.0001) and, on the 30-minute window only, for escalation (+0.29%, p = 0.016). Tick counts in the half hour before a de-escalation post are 28% above those of comparable hours. We therefore describe the pre-post movement as drift larger than in comparable hours whose cause is not identified: it does not show leakage or the conduct of any party, and the market may be reacting to news that the post then repeats. Which of the three posting classes was reported first elsewhere makes no difference to the pre-post drift (30 events, p = 0.90).</w:t>
+      </w:r>
+    </w:p>
     <w:bookmarkEnd w:id="45"/>
     <w:bookmarkStart w:id="46" w:name="X2fa4eb6c5141e0b6310a0cbc31f8b523321249a"/>
     <w:p>
@@ -3781,7 +3799,45 @@
               <w:jc w:val="left"/>
             </w:pPr>
             <w:r>
-              <w:t xml:space="preserve">H5a, H5b supported for de-escalation posts; H5c pending</w:t>
+              <w:t xml:space="preserve">H5a, H5b supported for de-escalation posts</w:t>
+            </w:r>
+          </w:p>
+        </w:tc>
+      </w:tr>
+      <w:tr>
+        <w:tc>
+          <w:tcPr/>
+          <w:p>
+            <w:pPr>
+              <w:pStyle w:val="Compact"/>
+              <w:jc w:val="left"/>
+            </w:pPr>
+            <w:r>
+              <w:t xml:space="preserve">Matched-hour placebo (H5c) and anticipatory drift (H8)</w:t>
+            </w:r>
+          </w:p>
+        </w:tc>
+        <w:tc>
+          <w:tcPr/>
+          <w:p>
+            <w:pPr>
+              <w:pStyle w:val="Compact"/>
+              <w:jc w:val="left"/>
+            </w:pPr>
+            <w:r>
+              <w:t xml:space="preserve">ANALYSIS_PLAN_H5C_H8.md</w:t>
+            </w:r>
+          </w:p>
+        </w:tc>
+        <w:tc>
+          <w:tcPr/>
+          <w:p>
+            <w:pPr>
+              <w:pStyle w:val="Compact"/>
+              <w:jc w:val="left"/>
+            </w:pPr>
+            <w:r>
+              <w:t xml:space="preserve">H5c supported (de-escalation +0.62 vs placebo 95th pct 0.22; escalation +0.53 vs 0.26); H8a: pre-post drift also exceeds placebo for de-escalation (+0.57, +0.86) and partly for escalation; H8c: no difference by first source (p = 0.90); cause not identified</w:t>
             </w:r>
           </w:p>
         </w:tc>

</xml_diff>

<commit_message>
Manuscript v2: add event-explanation test, Section 4.9 (LLM releases), literature, ledger, limitations
Co-Authored-By: Claude Sonnet 5.5 <noreply@anthropic.com>
Claude-Session: https://claude.ai/code/session_011aZmoPyuUT34TyBPwawaPZ
</commit_message>
<xml_diff>
--- a/misq_note/hf/MANUSCRIPT_MISQ_v2.docx
+++ b/misq_note/hf/MANUSCRIPT_MISQ_v2.docx
@@ -2,7 +2,7 @@
 <file path=word/document.xml><?xml version="1.0" encoding="utf-8"?>
 <w:document xmlns:w="http://schemas.openxmlformats.org/wordprocessingml/2006/main" xmlns:m="http://schemas.openxmlformats.org/officeDocument/2006/math" xmlns:r="http://schemas.openxmlformats.org/officeDocument/2006/relationships" xmlns:o="urn:schemas-microsoft-com:office:office" xmlns:v="urn:schemas-microsoft-com:vml" xmlns:w10="urn:schemas-microsoft-com:office:word" xmlns:a="http://schemas.openxmlformats.org/drawingml/2006/main" xmlns:pic="http://schemas.openxmlformats.org/drawingml/2006/picture" xmlns:wp="http://schemas.openxmlformats.org/drawingml/2006/wordprocessingDrawing">
   <w:body>
-    <w:bookmarkStart w:id="65" w:name="Xd843f14cd1fee397f8d6847dbb12b7ac644a355"/>
+    <w:bookmarkStart w:id="66" w:name="Xd843f14cd1fee397f8d6847dbb12b7ac644a355"/>
     <w:p>
       <w:pPr>
         <w:pStyle w:val="Heading1"/>
@@ -592,7 +592,7 @@
     </w:p>
     <w:bookmarkEnd w:id="33"/>
     <w:bookmarkEnd w:id="34"/>
-    <w:bookmarkStart w:id="52" w:name="results"/>
+    <w:bookmarkStart w:id="53" w:name="results"/>
     <w:p>
       <w:pPr>
         <w:pStyle w:val="Heading2"/>
@@ -1268,6 +1268,24 @@
         <w:t xml:space="preserve">Table 0. Alternative models for the arrival of posts (ΔAIC relative to the best model in each row; Poisson ΔAIC 150 to 3,700 in all rows; descriptive, not pre-registered; RESULTS_ARRIVALS_MODELS.md).</w:t>
       </w:r>
     </w:p>
+    <w:p>
+      <w:pPr>
+        <w:pStyle w:val="BodyText"/>
+      </w:pPr>
+      <w:r>
+        <w:rPr>
+          <w:bCs/>
+          <w:b/>
+        </w:rPr>
+        <w:t xml:space="preserve">Do external events explain the over-dispersion?</w:t>
+      </w:r>
+      <w:r>
+        <w:t xml:space="preserve"> </w:t>
+      </w:r>
+      <w:r>
+        <w:t xml:space="preserve">If a head of state mostly reports external events and those events arrive as a Poisson process, posting would be over-dispersed only because each event spawns several posts. Richardson’s classic result is that the onsets of separate interstate wars are roughly Poisson at an annual scale (Richardson 1960; Clauset 2020), although it has been questioned (Houweling and Kuné 1984), and within a war, violent events are usually modelled as self-exciting (Lewis et al. 2012); a single war that has already begun supplies no such onsets at the daily scale of our data. We therefore tested the idea directly, in an exploratory analysis whose definitions were fixed before the event counts were downloaded (ANALYSIS_PLAN_EVENTS.md). We counted GDELT conflict events per day (Iran-involved conflict events, world conflict, riots, and US–China conflict events; Leetaru and Schrodt 2013) and added the previous day’s count and the average of the previous 2–7 days, together with total event volume, to a negative binomial model of daily posts. The event terms are statistically significant in all six pairings, but they remove only a small part of the dispersion: 9% (Truth Social, all posts), 11% (tariff tweets), 17–20% (all Twitter posts, with riot or world-conflict events) and about 22–25% (oil/Iran tweets; Truth Social Iran posts); in no pairing do they remove half. Calendar-week fixed effects, in contrast, remove 66% of the dispersion of all Twitter posts, so the over-dispersion mostly reflects a slowly moving rate that daily conflict counts do not capture. The event series are themselves far from Poisson (variance-to-mean ratios of about 550 and 900 for Iran-related conflict events, lag-1 autocorrelations of 0.85 and 0.96). The premise that the posts follow Poisson events fails at the daily scale. These counts reflect media coverage, which the posts also influence, so the tests do not identify causal direction, and block-bootstrap intervals rest on only 100 resamples.</w:t>
+      </w:r>
+    </w:p>
     <w:bookmarkEnd w:id="38"/>
     <w:bookmarkStart w:id="45" w:name="market-co-movement-during-the-closure"/>
     <w:p>
@@ -2360,8 +2378,70 @@
       </w:r>
     </w:p>
     <w:bookmarkEnd w:id="51"/>
+    <w:bookmarkStart w:id="52" w:name="Xf655f0ebd1e15d3db48b53f73279bc9929d44ce"/>
+    <w:p>
+      <w:pPr>
+        <w:pStyle w:val="Heading3"/>
+      </w:pPr>
+      <w:r>
+        <w:t xml:space="preserve">4.9 A probe beyond politics: other actors who time their own events</w:t>
+      </w:r>
+    </w:p>
+    <w:p>
+      <w:pPr>
+        <w:pStyle w:val="FirstParagraph"/>
+      </w:pPr>
+      <w:r>
+        <w:t xml:space="preserve">A head of state who announces a war and a company that releases a model both choose when the event happens. If the account generalizes, the arrival of such events should not be Poisson, and the market should react more strongly on event days. We probed both in an exploratory analysis registered before the data were parsed (ANALYSIS_PLAN_LLM_RELEASES.md; ANALYSIS_PLAN_LLM_STOCK.md). The source is Wikipedia’s list of large language models (fetched on 14 October 2026; 187 rows with at least a month, 126 with a full date, nearly all from 2025–2026); it is crowd-edited and includes models by notability, so the tests are descriptive.</w:t>
+      </w:r>
+    </w:p>
+    <w:p>
+      <w:pPr>
+        <w:pStyle w:val="BodyText"/>
+      </w:pPr>
+      <w:r>
+        <w:rPr>
+          <w:iCs/>
+          <w:i/>
+        </w:rPr>
+        <w:t xml:space="preserve">Arrival.</w:t>
+      </w:r>
+      <w:r>
+        <w:t xml:space="preserve"> </w:t>
+      </w:r>
+      <w:r>
+        <w:t xml:space="preserve">Monthly release counts rise steeply over 2018–2026, and with a log-trend they remain over-dispersed (Pearson χ²/df 1.7; negative-binomial α = 0.25; likelihood-ratio p = 0.0001); in the shorter 2024–2026 window the evidence is weaker with a quadratic trend (α = 0.10; one-sided p = 0.028). Of 125 releases with a full date since 2023, 4% fell on a weekend, against 29% expected under a homogeneous process (χ² = 62.1, 6 df; Holm p &lt; 10⁻¹⁰). Gaps between releases (119 gaps since 2024; coefficient of variation 1.55) are fitted best by a negative binomial; the memoryless geometric is worse by 22 AIC units. Individual developers release more regularly than a Poisson process (coefficients of variation 0.67 for Anthropic, 0.81 for OpenAI, 1.12 for Google DeepMind), so the clustering appears only after pooling. Release dates follow the business calendar, a clear departure from a Poisson process.</w:t>
+      </w:r>
+    </w:p>
+    <w:p>
+      <w:pPr>
+        <w:pStyle w:val="BodyText"/>
+      </w:pPr>
+      <w:r>
+        <w:rPr>
+          <w:iCs/>
+          <w:i/>
+        </w:rPr>
+        <w:t xml:space="preserve">Market reaction.</w:t>
+      </w:r>
+      <w:r>
+        <w:t xml:space="preserve"> </w:t>
+      </w:r>
+      <w:r>
+        <w:t xml:space="preserve">For the 31 releases by listed developers (Alphabet 9, Alibaba 8, Meta 4, Microsoft, Xiaomi and Tencent 3 each, Nvidia 1), the mean abnormal return over the release day and the next trading day, from a market model, is +0.40 percentage points (SE 0.68; Wilcoxon p = 0.76). The standardized absolute abnormal return is larger than in random two-day windows of the same firms (1.11 against 0.75; permutation p = 0.008; Holm p = 0.015). In other words, there is a magnitude effect without a direction. It shrinks by about 40% when three events likely to coincide with other news are removed (Gemini 2.0 on 5 February 2025, Qwen2.5 on 26–27 January 2025 and Llama 4 on 5–7 April 2025; the coincidences are our recollection, not checked here). Release times of day are not in the list, so daily windows were used; unlisted developers, about half of the 2025–2026 rows, are excluded by design; and a few firms contribute only 3–4 events each, with opposite signs across firms.</w:t>
+      </w:r>
+    </w:p>
+    <w:p>
+      <w:pPr>
+        <w:pStyle w:val="BodyText"/>
+      </w:pPr>
+      <w:r>
+        <w:t xml:space="preserve">Taken together with the war-period results, the two settings agree on one point, that timing is chosen by the actor and arrival is not Poisson. They do not agree on the market reaction: with the matched-hour placebo (Section 4.2) the posts show a directional move beyond fake times in comparable hours, whereas releases show larger absolute moves without a direction. Because the two statistics differ, and because we have no comparison group of externally caused events, we do not claim that self-caused events are a common class with a common market signature.</w:t>
+      </w:r>
+    </w:p>
     <w:bookmarkEnd w:id="52"/>
-    <w:bookmarkStart w:id="58" w:name="discussion"/>
+    <w:bookmarkEnd w:id="53"/>
+    <w:bookmarkStart w:id="59" w:name="discussion"/>
     <w:p>
       <w:pPr>
         <w:pStyle w:val="Heading2"/>
@@ -2370,7 +2450,7 @@
         <w:t xml:space="preserve">5. Discussion</w:t>
       </w:r>
     </w:p>
-    <w:bookmarkStart w:id="53" w:name="what-the-evidence-supports"/>
+    <w:bookmarkStart w:id="54" w:name="what-the-evidence-supports"/>
     <w:p>
       <w:pPr>
         <w:pStyle w:val="Heading3"/>
@@ -2384,11 +2464,11 @@
         <w:pStyle w:val="FirstParagraph"/>
       </w:pPr>
       <w:r>
-        <w:t xml:space="preserve">The evidence supports a small number of statements. First, platform speech by a head of state arrives as an overdispersed, bursty process whose timing follows volatile market hours. Second, during a period of high uncertainty about one physical state, oil co-moved with posts that humans label de-escalation (about +1.05% in 30 minutes) and, at about half the size, with posts that humans label escalation (+0.48%), and not with posts on topics lacking comparable uncertainty; the model’s labels had suggested a one-sided response because its escalation label is mostly wrong. Third, that co-movement is robust to rank-based and block inference and to standardization, yet at hourly resolution it cannot be separated from drift that precedes the post; at tick resolution, on human-labelled posts, the 30 minutes after the post exceed the 30 minutes before it by 0.48 points (p = 0.030). Fourth, variables that the information-theoretic account says should matter, novelty and prior uncertainty, have the predicted sign consistently in the 2026 sample but are not individually significant, and in an independent 2017–2021 sample they are not supported at all, while the information transferred from post class to return direction is detectably above chance during the closure only. Fifth, in the oil samples the sign of the directional response differed between the closed-strait and open-strait periods: with the strait closed, de-escalation moved oil; with it open, escalation did. We offered the proposition that this reflects the prior (P6), and the pre-registered test in the tariff tweets rejected it, so the difference remains an observation we cannot yet explain. Sixth, the timing of a post, as opposed to its content, carries no detectable additional information about the 30-minute reaction (P7). Seventh, posting is not Poisson in any series we examined; it is overdispersed and, in multi-year series, self-exciting, a pattern that Elon Musk’s account also shows. Taken together, the measurable implications of the information-theoretic account that held are the descriptive ones (mutual information in the closure sample, and prior uncertainty in the volatility-confounded tariff sample); those about novelty, interaction, state-dependent sign and timing did not.</w:t>
-      </w:r>
-    </w:p>
-    <w:bookmarkEnd w:id="53"/>
-    <w:bookmarkStart w:id="54" w:name="contributions"/>
+        <w:t xml:space="preserve">The evidence supports a small number of statements. First, platform speech by a head of state arrives as an overdispersed, bursty process whose timing follows volatile market hours. Second, during a period of high uncertainty about one physical state, oil co-moved with posts that humans label de-escalation (about +1.05% in 30 minutes) and, at about half the size, with posts that humans label escalation (+0.48%), and not with posts on topics lacking comparable uncertainty; the model’s labels had suggested a one-sided response because its escalation label is mostly wrong. Third, that co-movement is robust to rank-based and block inference and to standardization, yet at hourly resolution it cannot be separated from drift that precedes the post; at tick resolution, on human-labelled posts, the 30 minutes after the post exceed the 30 minutes before it by 0.48 points (p = 0.030). Fourth, variables that the information-theoretic account says should matter, novelty and prior uncertainty, have the predicted sign consistently in the 2026 sample but are not individually significant, and in an independent 2017–2021 sample they are not supported at all, while the information transferred from post class to return direction is detectably above chance during the closure only. Fifth, in the oil samples the sign of the directional response differed between the closed-strait and open-strait periods: with the strait closed, de-escalation moved oil; with it open, escalation did. We offered the proposition that this reflects the prior (P6), and the pre-registered test in the tariff tweets rejected it, so the difference remains an observation we cannot yet explain. Sixth, the timing of a post, as opposed to its content, carries no detectable additional information about the 30-minute reaction (P7). Seventh, posting is not Poisson in any series we examined; it is overdispersed and, in multi-year series, self-exciting, a pattern that Elon Musk’s account also shows. Taken together, the measurable implications of the information-theoretic account that held are the descriptive ones (mutual information in the closure sample, and prior uncertainty in the volatility-confounded tariff sample); those about novelty, interaction, state-dependent sign and timing did not. An exploratory probe of another actor who times his own events, LLM developers, found the same non-Poisson, calendar-bound arrival and larger absolute market moves on release days, without a direction (Section 4.9). Daily conflict events remove at most a quarter of the dispersion of posting, so an account in which posts merely report Poisson external events is not supported (Section 4.1).</w:t>
+      </w:r>
+    </w:p>
+    <w:bookmarkEnd w:id="54"/>
+    <w:bookmarkStart w:id="55" w:name="contributions"/>
     <w:p>
       <w:pPr>
         <w:pStyle w:val="Heading3"/>
@@ -2421,8 +2501,8 @@
         <w:t xml:space="preserve">A third contribution is methodological. The design (written plans before estimation, independent model coders blind to outcomes, explicit power calculations, dated amendments, pre-registered placebos, and independent timing checks) allowed us to report that the headline result is robust in some respects and not in others, and that three mechanisms and two content-analytic propositions could not be confirmed. It also caught a misclassification that would have produced a false headline.</w:t>
       </w:r>
     </w:p>
-    <w:bookmarkEnd w:id="54"/>
-    <w:bookmarkStart w:id="55" w:name="implications-for-practice"/>
+    <w:bookmarkEnd w:id="55"/>
+    <w:bookmarkStart w:id="56" w:name="implications-for-practice"/>
     <w:p>
       <w:pPr>
         <w:pStyle w:val="Heading3"/>
@@ -2439,8 +2519,8 @@
         <w:t xml:space="preserve">For analysts who monitor executive feeds, the account suggests weighting a message by its novelty relative to recent messages and by the current uncertainty about the state it concerns, and ignoring re-posts and links. For platform operators and regulators, the account highlights that when a platform is the first channel for decisions, the information advantage in the interval before secondary coverage is concentrated at the platform; we make no claim about any trading behavior.</w:t>
       </w:r>
     </w:p>
-    <w:bookmarkEnd w:id="55"/>
-    <w:bookmarkStart w:id="56" w:name="limitations"/>
+    <w:bookmarkEnd w:id="56"/>
+    <w:bookmarkStart w:id="57" w:name="limitations"/>
     <w:p>
       <w:pPr>
         <w:pStyle w:val="Heading3"/>
@@ -2454,11 +2534,11 @@
         <w:pStyle w:val="FirstParagraph"/>
       </w:pPr>
       <w:r>
-        <w:t xml:space="preserve">The coders are model instances, and the human validation (Section 4.6) shows only moderate agreement with them (κ = 0.43 and 0.56 against the human consensus; 0.51 between the humans), with de-escalation precision of about one half; the two instances are copies of one model and agree with each other (κ = 0.74) far more than with either human. Every model-labelled result is therefore conditional on a labelling that is not validated. Posting times are endogenous: posts follow volatile hours, and all 20 triangulated cases show other drivers; neither the momentum control nor the first-source classification resolves simultaneity, and the latter is itself an upper bound. Hourly bars cannot separate the post from the preceding hour. The tick analysis can, but it uses a CFD rather than exchange futures, 33 de-escalation events, and one asset; the matched-hour placebo is pending. Prior uncertainty is proxied by relative volatility and novelty by redundancy relative to the account’s own recent posts, neither of which is the market’s information set; weak measures of both would lower power. The war-period result rests on 33 events, two of which supply half of the mean. The 2017–2021 sample adds a second period but not a second sender; it uses model labels only (human labelling is pending), loses 31% of events to closed markets, and its two novelty measures disagree; the tariff sample loses 35% of events to closed markets, relies on model labels that humans accept for only about half of the model-agreed signals, and its supported uncertainty result is confounded with volatility clustering. The sample contains one conflict and one administration. We tested four sets of mechanisms and confirmed none; we cannot exclude that a different formulation would succeed. The plans are not registered with an independent registry, and several were written after related results had been seen.</w:t>
-      </w:r>
-    </w:p>
-    <w:bookmarkEnd w:id="56"/>
-    <w:bookmarkStart w:id="57" w:name="future-research"/>
+        <w:t xml:space="preserve">The tests of Sections 4.1 and 4.9 (arrival models, event explanation, LLM releases) were run after the main results were seen and are exploratory; the event counts come from a media-based database that the posts themselves influence, the release list is crowd-edited, and the 31 listed-developer releases give little power. The coders are model instances, and the human validation (Section 4.6) shows only moderate agreement with them (κ = 0.43 and 0.56 against the human consensus; 0.51 between the humans), with de-escalation precision of about one half; the two instances are copies of one model and agree with each other (κ = 0.74) far more than with either human. Every model-labelled result is therefore conditional on a labelling that is not validated. Posting times are endogenous: posts follow volatile hours, and all 20 triangulated cases show other drivers; neither the momentum control nor the first-source classification resolves simultaneity, and the latter is itself an upper bound. Hourly bars cannot separate the post from the preceding hour. The tick analysis can, but it uses a CFD rather than exchange futures, 33 de-escalation events, and one asset; the matched-hour placebo is pending. Prior uncertainty is proxied by relative volatility and novelty by redundancy relative to the account’s own recent posts, neither of which is the market’s information set; weak measures of both would lower power. The war-period result rests on 33 events, two of which supply half of the mean. The 2017–2021 sample adds a second period but not a second sender; it uses model labels only (human labelling is pending), loses 31% of events to closed markets, and its two novelty measures disagree; the tariff sample loses 35% of events to closed markets, relies on model labels that humans accept for only about half of the model-agreed signals, and its supported uncertainty result is confounded with volatility clustering. The sample contains one conflict and one administration. We tested four sets of mechanisms and confirmed none; we cannot exclude that a different formulation would succeed. The plans are not registered with an independent registry, and several were written after related results had been seen.</w:t>
+      </w:r>
+    </w:p>
+    <w:bookmarkEnd w:id="57"/>
+    <w:bookmarkStart w:id="58" w:name="future-research"/>
     <w:p>
       <w:pPr>
         <w:pStyle w:val="Heading3"/>
@@ -2472,12 +2552,12 @@
         <w:pStyle w:val="FirstParagraph"/>
       </w:pPr>
       <w:r>
-        <w:t xml:space="preserve">The most informative next steps are extension of the tick-level design to several assets and to exchange futures, with a completed placebo; a continuous measure of physical constraint (tanker transits, insurance spreads, term-structure) as a measure of prior uncertainty; prospective collection, under the protocol we registered, of counterparty denials and concurrent news; and a sample large enough to test redundancy (roughly 480 to 560 signal posts for the habituation effect).</w:t>
-      </w:r>
-    </w:p>
-    <w:bookmarkEnd w:id="57"/>
+        <w:t xml:space="preserve">The most informative next steps are a pre-registered comparison of dispersion and self-excitation between accounts of people who use posts to influence others and matched ordinary accounts (ANALYSIS_PLAN_ACCOUNTS.md; registered, not run, because suitable data have not been established), a comparison group of externally caused events for the self-timed-event probe, release times of day for tick-level analysis of releases, and extension of the tick-level design to several assets and to exchange futures, with a completed placebo; a continuous measure of physical constraint (tanker transits, insurance spreads, term-structure) as a measure of prior uncertainty; prospective collection, under the protocol we registered, of counterparty denials and concurrent news; and a sample large enough to test redundancy (roughly 480 to 560 signal posts for the habituation effect).</w:t>
+      </w:r>
+    </w:p>
     <w:bookmarkEnd w:id="58"/>
-    <w:bookmarkStart w:id="59" w:name="conclusion"/>
+    <w:bookmarkEnd w:id="59"/>
+    <w:bookmarkStart w:id="60" w:name="conclusion"/>
     <w:p>
       <w:pPr>
         <w:pStyle w:val="Heading2"/>
@@ -2501,8 +2581,8 @@
         </w:pict>
       </w:r>
     </w:p>
-    <w:bookmarkEnd w:id="59"/>
-    <w:bookmarkStart w:id="60" w:name="declarations-to-be-completed"/>
+    <w:bookmarkEnd w:id="60"/>
+    <w:bookmarkStart w:id="61" w:name="declarations-to-be-completed"/>
     <w:p>
       <w:pPr>
         <w:pStyle w:val="Heading2"/>
@@ -2547,8 +2627,8 @@
         <w:t xml:space="preserve">Code, pre-registration files, coder outputs, and results are in the project repository; the post archive and market data come from public sources [add repository DOI].</w:t>
       </w:r>
     </w:p>
-    <w:bookmarkEnd w:id="60"/>
-    <w:bookmarkStart w:id="61" w:name="references"/>
+    <w:bookmarkEnd w:id="61"/>
+    <w:bookmarkStart w:id="62" w:name="references"/>
     <w:p>
       <w:pPr>
         <w:pStyle w:val="Heading2"/>
@@ -2813,6 +2893,45 @@
         <w:pStyle w:val="BodyText"/>
       </w:pPr>
       <w:r>
+        <w:t xml:space="preserve">Clauset, A. 2020.</w:t>
+      </w:r>
+      <w:r>
+        <w:t xml:space="preserve"> </w:t>
+      </w:r>
+      <w:r>
+        <w:t xml:space="preserve">“</w:t>
+      </w:r>
+      <w:r>
+        <w:t xml:space="preserve">On the Frequency and Severity of Interstate Wars,</w:t>
+      </w:r>
+      <w:r>
+        <w:t xml:space="preserve">”</w:t>
+      </w:r>
+      <w:r>
+        <w:t xml:space="preserve"> </w:t>
+      </w:r>
+      <w:r>
+        <w:t xml:space="preserve">in</w:t>
+      </w:r>
+      <w:r>
+        <w:t xml:space="preserve"> </w:t>
+      </w:r>
+      <w:r>
+        <w:rPr>
+          <w:iCs/>
+          <w:i/>
+        </w:rPr>
+        <w:t xml:space="preserve">Lewis Fry Richardson: His Intellectual Legacy and Influence in the Social Sciences</w:t>
+      </w:r>
+      <w:r>
+        <w:t xml:space="preserve">, N. J. Gleditsch (ed.), Cham: Springer, pp. 113–127. [verify]</w:t>
+      </w:r>
+    </w:p>
+    <w:p>
+      <w:pPr>
+        <w:pStyle w:val="BodyText"/>
+      </w:pPr>
+      <w:r>
         <w:t xml:space="preserve">Cohen, J. 1960.</w:t>
       </w:r>
       <w:r>
@@ -3007,6 +3126,42 @@
         <w:pStyle w:val="BodyText"/>
       </w:pPr>
       <w:r>
+        <w:t xml:space="preserve">Houweling, H. W., and Kuné, J. B. 1984.</w:t>
+      </w:r>
+      <w:r>
+        <w:t xml:space="preserve"> </w:t>
+      </w:r>
+      <w:r>
+        <w:t xml:space="preserve">“</w:t>
+      </w:r>
+      <w:r>
+        <w:t xml:space="preserve">Do Outbreaks of War Follow a Poisson-Process?,</w:t>
+      </w:r>
+      <w:r>
+        <w:t xml:space="preserve">”</w:t>
+      </w:r>
+      <w:r>
+        <w:t xml:space="preserve"> </w:t>
+      </w:r>
+      <w:r>
+        <w:rPr>
+          <w:iCs/>
+          <w:i/>
+        </w:rPr>
+        <w:t xml:space="preserve">Journal of Conflict Resolution</w:t>
+      </w:r>
+      <w:r>
+        <w:t xml:space="preserve"> </w:t>
+      </w:r>
+      <w:r>
+        <w:t xml:space="preserve">(28:1), pp. 51–61. [verify]</w:t>
+      </w:r>
+    </w:p>
+    <w:p>
+      <w:pPr>
+        <w:pStyle w:val="BodyText"/>
+      </w:pPr>
+      <w:r>
         <w:t xml:space="preserve">Kamenica, E., and Gentzkow, M. 2011.</w:t>
       </w:r>
       <w:r>
@@ -3079,6 +3234,68 @@
         <w:pStyle w:val="BodyText"/>
       </w:pPr>
       <w:r>
+        <w:t xml:space="preserve">Leetaru, K., and Schrodt, P. A. 2013.</w:t>
+      </w:r>
+      <w:r>
+        <w:t xml:space="preserve"> </w:t>
+      </w:r>
+      <w:r>
+        <w:t xml:space="preserve">“</w:t>
+      </w:r>
+      <w:r>
+        <w:t xml:space="preserve">GDELT: Global Database of Events, Language, and Tone,</w:t>
+      </w:r>
+      <w:r>
+        <w:t xml:space="preserve">”</w:t>
+      </w:r>
+      <w:r>
+        <w:t xml:space="preserve"> </w:t>
+      </w:r>
+      <w:r>
+        <w:t xml:space="preserve">paper presented at the International Studies Association Annual Convention. [verify]</w:t>
+      </w:r>
+    </w:p>
+    <w:p>
+      <w:pPr>
+        <w:pStyle w:val="BodyText"/>
+      </w:pPr>
+      <w:r>
+        <w:t xml:space="preserve">Lewis, E., Mohler, G., Brantingham, P. J., and Bertozzi, A. L. 2012.</w:t>
+      </w:r>
+      <w:r>
+        <w:t xml:space="preserve"> </w:t>
+      </w:r>
+      <w:r>
+        <w:t xml:space="preserve">“</w:t>
+      </w:r>
+      <w:r>
+        <w:t xml:space="preserve">Self-Exciting Point Process Models of Civilian Deaths in Iraq,</w:t>
+      </w:r>
+      <w:r>
+        <w:t xml:space="preserve">”</w:t>
+      </w:r>
+      <w:r>
+        <w:t xml:space="preserve"> </w:t>
+      </w:r>
+      <w:r>
+        <w:rPr>
+          <w:iCs/>
+          <w:i/>
+        </w:rPr>
+        <w:t xml:space="preserve">Security Journal</w:t>
+      </w:r>
+      <w:r>
+        <w:t xml:space="preserve"> </w:t>
+      </w:r>
+      <w:r>
+        <w:t xml:space="preserve">(25:3), pp. 244–264. [verify]</w:t>
+      </w:r>
+    </w:p>
+    <w:p>
+      <w:pPr>
+        <w:pStyle w:val="BodyText"/>
+      </w:pPr>
+      <w:r>
         <w:t xml:space="preserve">Nosek, B. A., Ebersole, C. R., DeHaven, A. C., and Mellor, D. T. 2018.</w:t>
       </w:r>
       <w:r>
@@ -3115,6 +3332,27 @@
         <w:pStyle w:val="BodyText"/>
       </w:pPr>
       <w:r>
+        <w:t xml:space="preserve">Richardson, L. F. 1960.</w:t>
+      </w:r>
+      <w:r>
+        <w:t xml:space="preserve"> </w:t>
+      </w:r>
+      <w:r>
+        <w:rPr>
+          <w:iCs/>
+          <w:i/>
+        </w:rPr>
+        <w:t xml:space="preserve">Statistics of Deadly Quarrels</w:t>
+      </w:r>
+      <w:r>
+        <w:t xml:space="preserve">. Pittsburgh: Boxwood Press. [verify]</w:t>
+      </w:r>
+    </w:p>
+    <w:p>
+      <w:pPr>
+        <w:pStyle w:val="BodyText"/>
+      </w:pPr>
+      <w:r>
         <w:t xml:space="preserve">Searle, J. R. 1969.</w:t>
       </w:r>
       <w:r>
@@ -3239,8 +3477,8 @@
         <w:t xml:space="preserve">(62:3), pp. 1139–1168.</w:t>
       </w:r>
     </w:p>
-    <w:bookmarkEnd w:id="61"/>
-    <w:bookmarkStart w:id="62" w:name="appendix-a.-pre-registration-ledger"/>
+    <w:bookmarkEnd w:id="62"/>
+    <w:bookmarkStart w:id="63" w:name="appendix-a.-pre-registration-ledger"/>
     <w:p>
       <w:pPr>
         <w:pStyle w:val="Heading2"/>
@@ -4117,31 +4355,31 @@
               <w:jc w:val="left"/>
             </w:pPr>
             <w:r>
-              <w:t xml:space="preserve">Matched-account comparison (HA1–HA2)</w:t>
-            </w:r>
-          </w:p>
-        </w:tc>
-        <w:tc>
-          <w:tcPr/>
-          <w:p>
-            <w:pPr>
-              <w:pStyle w:val="Compact"/>
-              <w:jc w:val="left"/>
-            </w:pPr>
-            <w:r>
-              <w:t xml:space="preserve">arrivals/ANALYSIS_PLAN_ACCOUNTS.md</w:t>
-            </w:r>
-          </w:p>
-        </w:tc>
-        <w:tc>
-          <w:tcPr/>
-          <w:p>
-            <w:pPr>
-              <w:pStyle w:val="Compact"/>
-              <w:jc w:val="left"/>
-            </w:pPr>
-            <w:r>
-              <w:t xml:space="preserve">Registered, not run; data availability not established</w:t>
+              <w:t xml:space="preserve">Event explanation of dispersion</w:t>
+            </w:r>
+          </w:p>
+        </w:tc>
+        <w:tc>
+          <w:tcPr/>
+          <w:p>
+            <w:pPr>
+              <w:pStyle w:val="Compact"/>
+              <w:jc w:val="left"/>
+            </w:pPr>
+            <w:r>
+              <w:t xml:space="preserve">arrivals/ANALYSIS_PLAN_EVENTS.md (exploratory)</w:t>
+            </w:r>
+          </w:p>
+        </w:tc>
+        <w:tc>
+          <w:tcPr/>
+          <w:p>
+            <w:pPr>
+              <w:pStyle w:val="Compact"/>
+              <w:jc w:val="left"/>
+            </w:pPr>
+            <w:r>
+              <w:t xml:space="preserve">Lagged GDELT conflict events significant in all six pairings but remove 9–25% of NB dispersion (never ≥ 50%); event series not Poisson; Calendar-week effects remove 66% (all Twitter)</w:t>
             </w:r>
           </w:p>
         </w:tc>
@@ -4155,6 +4393,120 @@
               <w:jc w:val="left"/>
             </w:pPr>
             <w:r>
+              <w:t xml:space="preserve">LLM release arrival</w:t>
+            </w:r>
+          </w:p>
+        </w:tc>
+        <w:tc>
+          <w:tcPr/>
+          <w:p>
+            <w:pPr>
+              <w:pStyle w:val="Compact"/>
+              <w:jc w:val="left"/>
+            </w:pPr>
+            <w:r>
+              <w:t xml:space="preserve">arrivals/ANALYSIS_PLAN_LLM_RELEASES.md (exploratory)</w:t>
+            </w:r>
+          </w:p>
+        </w:tc>
+        <w:tc>
+          <w:tcPr/>
+          <w:p>
+            <w:pPr>
+              <w:pStyle w:val="Compact"/>
+              <w:jc w:val="left"/>
+            </w:pPr>
+            <w:r>
+              <w:t xml:space="preserve">Over-dispersed after trend (LR p = 0.0001); weekend share 4% vs 29% expected; geometric gaps rejected</w:t>
+            </w:r>
+          </w:p>
+        </w:tc>
+      </w:tr>
+      <w:tr>
+        <w:tc>
+          <w:tcPr/>
+          <w:p>
+            <w:pPr>
+              <w:pStyle w:val="Compact"/>
+              <w:jc w:val="left"/>
+            </w:pPr>
+            <w:r>
+              <w:t xml:space="preserve">LLM release stock reaction</w:t>
+            </w:r>
+          </w:p>
+        </w:tc>
+        <w:tc>
+          <w:tcPr/>
+          <w:p>
+            <w:pPr>
+              <w:pStyle w:val="Compact"/>
+              <w:jc w:val="left"/>
+            </w:pPr>
+            <w:r>
+              <w:t xml:space="preserve">arrivals/ANALYSIS_PLAN_LLM_STOCK.md (exploratory)</w:t>
+            </w:r>
+          </w:p>
+        </w:tc>
+        <w:tc>
+          <w:tcPr/>
+          <w:p>
+            <w:pPr>
+              <w:pStyle w:val="Compact"/>
+              <w:jc w:val="left"/>
+            </w:pPr>
+            <w:r>
+              <w:t xml:space="preserve">Direction not supported (+0.40 pp, p = 0.55); magnitude larger than random windows (p = 0.008; Holm 0.015); n = 31</w:t>
+            </w:r>
+          </w:p>
+        </w:tc>
+      </w:tr>
+      <w:tr>
+        <w:tc>
+          <w:tcPr/>
+          <w:p>
+            <w:pPr>
+              <w:pStyle w:val="Compact"/>
+              <w:jc w:val="left"/>
+            </w:pPr>
+            <w:r>
+              <w:t xml:space="preserve">Matched-account comparison (HA1–HA2)</w:t>
+            </w:r>
+          </w:p>
+        </w:tc>
+        <w:tc>
+          <w:tcPr/>
+          <w:p>
+            <w:pPr>
+              <w:pStyle w:val="Compact"/>
+              <w:jc w:val="left"/>
+            </w:pPr>
+            <w:r>
+              <w:t xml:space="preserve">arrivals/ANALYSIS_PLAN_ACCOUNTS.md</w:t>
+            </w:r>
+          </w:p>
+        </w:tc>
+        <w:tc>
+          <w:tcPr/>
+          <w:p>
+            <w:pPr>
+              <w:pStyle w:val="Compact"/>
+              <w:jc w:val="left"/>
+            </w:pPr>
+            <w:r>
+              <w:t xml:space="preserve">Registered, not run; data availability not established</w:t>
+            </w:r>
+          </w:p>
+        </w:tc>
+      </w:tr>
+      <w:tr>
+        <w:tc>
+          <w:tcPr/>
+          <w:p>
+            <w:pPr>
+              <w:pStyle w:val="Compact"/>
+              <w:jc w:val="left"/>
+            </w:pPr>
+            <w:r>
               <w:t xml:space="preserve">Information-theoretic hypotheses</w:t>
             </w:r>
           </w:p>
@@ -4185,8 +4537,8 @@
         </w:tc>
       </w:tr>
     </w:tbl>
-    <w:bookmarkEnd w:id="62"/>
-    <w:bookmarkStart w:id="63" w:name="appendix-b.-coding-protocol"/>
+    <w:bookmarkEnd w:id="63"/>
+    <w:bookmarkStart w:id="64" w:name="appendix-b.-coding-protocol"/>
     <w:p>
       <w:pPr>
         <w:pStyle w:val="Heading2"/>
@@ -4203,8 +4555,8 @@
         <w:t xml:space="preserve">[Summary of direction and type definitions, blind-coding instructions, the primary-label rule, reconciliation of content-analysis codebooks, the model and prompt provenance, and a reference to the repository files.]</w:t>
       </w:r>
     </w:p>
-    <w:bookmarkEnd w:id="63"/>
-    <w:bookmarkStart w:id="64" w:name="appendix-c.-human-validation"/>
+    <w:bookmarkEnd w:id="64"/>
+    <w:bookmarkStart w:id="65" w:name="appendix-c.-human-validation"/>
     <w:p>
       <w:pPr>
         <w:pStyle w:val="Heading2"/>
@@ -4221,8 +4573,8 @@
         <w:t xml:space="preserve">Two human coders coded 150 posts independently from text only (war-period 67, pre-war Iran 23, other oil-geopolitics 60). Four-class kappa: human–human 0.51; model 1–model 2 0.74; human consensus (97 posts) with model 1 0.43 and with model 2 0.56 (three-class 0.48 and 0.59). De-escalation precision against the consensus is 0.52 (model 1) and 0.54 (model 2); recall 0.77 and 0.88. Of the 12 posts in the tick-level de-escalation sample that fall in the round-1 human sample, the human consensus is de-escalation for 3, escalation for 2, other for 1, and absent for 6. In round 2 (all 61 war-period signal posts, codebook v2, κ between humans 0.69, 13 disagreements adjudicated), the final human labels are 25 de-escalation, 11 escalation, 12 mixed, and 13 other; the model agrees at κ = 0.29. On the 25 human-labelled de-escalation posts the 30-minute directional return is +1.03% (p = 0.0015) and its excess over the preceding 30 minutes +0.35% (p = 0.082). Details are in RESULTS_HUMAN.md and RESULTS_HUMAN61.md.</w:t>
       </w:r>
     </w:p>
-    <w:bookmarkEnd w:id="64"/>
     <w:bookmarkEnd w:id="65"/>
+    <w:bookmarkEnd w:id="66"/>
     <w:sectPr>
       <w:pgMar w:bottom="1440" w:left="1440" w:right="1440" w:top="1440"/>
     </w:sectPr>

</xml_diff>

<commit_message>
Manuscript v2: move exploratory arrival, event and LLM analyses to Appendix D
Co-Authored-By: Claude Sonnet 5.5 <noreply@anthropic.com>
Claude-Session: https://claude.ai/code/session_011aZmoPyuUT34TyBPwawaPZ
</commit_message>
<xml_diff>
--- a/misq_note/hf/MANUSCRIPT_MISQ_v2.docx
+++ b/misq_note/hf/MANUSCRIPT_MISQ_v2.docx
@@ -2,7 +2,7 @@
 <file path=word/document.xml><?xml version="1.0" encoding="utf-8"?>
 <w:document xmlns:w="http://schemas.openxmlformats.org/wordprocessingml/2006/main" xmlns:m="http://schemas.openxmlformats.org/officeDocument/2006/math" xmlns:r="http://schemas.openxmlformats.org/officeDocument/2006/relationships" xmlns:o="urn:schemas-microsoft-com:office:office" xmlns:v="urn:schemas-microsoft-com:vml" xmlns:w10="urn:schemas-microsoft-com:office:word" xmlns:a="http://schemas.openxmlformats.org/drawingml/2006/main" xmlns:pic="http://schemas.openxmlformats.org/drawingml/2006/picture" xmlns:wp="http://schemas.openxmlformats.org/drawingml/2006/wordprocessingDrawing">
   <w:body>
-    <w:bookmarkStart w:id="66" w:name="Xd843f14cd1fee397f8d6847dbb12b7ac644a355"/>
+    <w:bookmarkStart w:id="69" w:name="Xd843f14cd1fee397f8d6847dbb12b7ac644a355"/>
     <w:p>
       <w:pPr>
         <w:pStyle w:val="Heading1"/>
@@ -592,7 +592,7 @@
     </w:p>
     <w:bookmarkEnd w:id="33"/>
     <w:bookmarkEnd w:id="34"/>
-    <w:bookmarkStart w:id="53" w:name="results"/>
+    <w:bookmarkStart w:id="52" w:name="results"/>
     <w:p>
       <w:pPr>
         <w:pStyle w:val="Heading2"/>
@@ -698,592 +698,7 @@
         <w:pStyle w:val="BodyText"/>
       </w:pPr>
       <w:r>
-        <w:rPr>
-          <w:bCs/>
-          <w:b/>
-        </w:rPr>
-        <w:t xml:space="preserve">Alternative arrival models and other accounts.</w:t>
-      </w:r>
-      <w:r>
-        <w:t xml:space="preserve"> </w:t>
-      </w:r>
-      <w:r>
-        <w:t xml:space="preserve">Poisson is not the only candidate, and the negative binomial (a Poisson–Gamma mixture) is a particular one. Table 0 compares daily-count models by AIC for the Truth Social series, for the 2017–2021 Twitter series (all original tweets and the two topic subsets of Sections 4.7–4.8), and for Elon Musk’s account as a second influential poster (a public third-party extract of 3,218 tweets, 2012–2017, whose completeness and time zone we could not verify). A homogeneous Poisson process is rejected everywhere (ΔAIC 150 to 3,700). The negative binomial and a Poisson–lognormal mixture fit equally well (differences within about 13 AIC units), so the data do not support choosing a gamma over a lognormal mixing distribution. In the multi-year Twitter series a dynamic model, a negative-binomial INGARCH(1,1) in which today’s rate depends on yesterday’s count and rate, is far better than every static mixture (ΔAIC 57 to 626); the 227-day Truth Social series is too short for this and the static negative binomial suffices. Waiting times follow no power law (Pareto is worst in every series); the best form is Weibull for all of Trump’s tweets, gamma for the topic subsets, and lognormal for Truth Social and Musk (CV 1.7 to 2.5). Musk’s account shows the same qualitative pattern as the president’s. We read this as evidence that human posting is bursty and self-exciting, not as evidence that the pattern is specific to people whose words carry weight: we have no comparison with ordinary accounts. A pre-registered comparison with matched ordinary accounts is specified (ANALYSIS_PLAN_ACCOUNTS.md) but has not been run, because we have not established that data of sufficient quality exist.</w:t>
-      </w:r>
-    </w:p>
-    <w:tbl>
-      <w:tblPr>
-        <w:tblStyle w:val="Table"/>
-        <w:tblW w:type="pct" w:w="5000"/>
-        <w:tblLook w:firstRow="1" w:lastRow="0" w:firstColumn="0" w:lastColumn="0" w:noHBand="0" w:noVBand="0" w:val="0020"/>
-        <w:jc w:val="start"/>
-        <w:tblBorders>
-          <w:top w:val="single" w:sz="4" w:color="000000"/>
-          <w:left w:val="single" w:sz="4" w:color="000000"/>
-          <w:bottom w:val="single" w:sz="4" w:color="000000"/>
-          <w:right w:val="single" w:sz="4" w:color="000000"/>
-          <w:insideH w:val="single" w:sz="4" w:color="000000"/>
-          <w:insideV w:val="single" w:sz="4" w:color="000000"/>
-        </w:tblBorders>
-      </w:tblPr>
-      <w:tblGrid>
-        <w:gridCol w:w="1320"/>
-        <w:gridCol w:w="1320"/>
-        <w:gridCol w:w="1320"/>
-        <w:gridCol w:w="1320"/>
-        <w:gridCol w:w="1320"/>
-        <w:gridCol w:w="1320"/>
-      </w:tblGrid>
-      <w:tr>
-        <w:trPr>
-          <w:tblHeader w:val="true"/>
-        </w:trPr>
-        <w:tc>
-          <w:tcPr/>
-          <w:p>
-            <w:pPr>
-              <w:pStyle w:val="Compact"/>
-              <w:jc w:val="left"/>
-            </w:pPr>
-            <w:r>
-              <w:t xml:space="preserve">Series</w:t>
-            </w:r>
-          </w:p>
-        </w:tc>
-        <w:tc>
-          <w:tcPr/>
-          <w:p>
-            <w:pPr>
-              <w:pStyle w:val="Compact"/>
-              <w:jc w:val="left"/>
-            </w:pPr>
-            <w:r>
-              <w:t xml:space="preserve">Days</w:t>
-            </w:r>
-          </w:p>
-        </w:tc>
-        <w:tc>
-          <w:tcPr/>
-          <w:p>
-            <w:pPr>
-              <w:pStyle w:val="Compact"/>
-              <w:jc w:val="left"/>
-            </w:pPr>
-            <w:r>
-              <w:t xml:space="preserve">Static NB (ΔAIC)</w:t>
-            </w:r>
-          </w:p>
-        </w:tc>
-        <w:tc>
-          <w:tcPr/>
-          <w:p>
-            <w:pPr>
-              <w:pStyle w:val="Compact"/>
-              <w:jc w:val="left"/>
-            </w:pPr>
-            <w:r>
-              <w:t xml:space="preserve">Poisson–lognormal (ΔAIC)</w:t>
-            </w:r>
-          </w:p>
-        </w:tc>
-        <w:tc>
-          <w:tcPr/>
-          <w:p>
-            <w:pPr>
-              <w:pStyle w:val="Compact"/>
-              <w:jc w:val="left"/>
-            </w:pPr>
-            <w:r>
-              <w:t xml:space="preserve">NB-INGARCH (ΔAIC)</w:t>
-            </w:r>
-          </w:p>
-        </w:tc>
-        <w:tc>
-          <w:tcPr/>
-          <w:p>
-            <w:pPr>
-              <w:pStyle w:val="Compact"/>
-              <w:jc w:val="left"/>
-            </w:pPr>
-            <w:r>
-              <w:t xml:space="preserve">Best waiting-time model</w:t>
-            </w:r>
-          </w:p>
-        </w:tc>
-      </w:tr>
-      <w:tr>
-        <w:tc>
-          <w:tcPr/>
-          <w:p>
-            <w:pPr>
-              <w:pStyle w:val="Compact"/>
-              <w:jc w:val="left"/>
-            </w:pPr>
-            <w:r>
-              <w:t xml:space="preserve">Trump, Truth Social 2026</w:t>
-            </w:r>
-          </w:p>
-        </w:tc>
-        <w:tc>
-          <w:tcPr/>
-          <w:p>
-            <w:pPr>
-              <w:pStyle w:val="Compact"/>
-              <w:jc w:val="left"/>
-            </w:pPr>
-            <w:r>
-              <w:t xml:space="preserve">227</w:t>
-            </w:r>
-          </w:p>
-        </w:tc>
-        <w:tc>
-          <w:tcPr/>
-          <w:p>
-            <w:pPr>
-              <w:pStyle w:val="Compact"/>
-              <w:jc w:val="left"/>
-            </w:pPr>
-            <w:r>
-              <w:t xml:space="preserve">0</w:t>
-            </w:r>
-          </w:p>
-        </w:tc>
-        <w:tc>
-          <w:tcPr/>
-          <w:p>
-            <w:pPr>
-              <w:pStyle w:val="Compact"/>
-              <w:jc w:val="left"/>
-            </w:pPr>
-            <w:r>
-              <w:t xml:space="preserve">1</w:t>
-            </w:r>
-          </w:p>
-        </w:tc>
-        <w:tc>
-          <w:tcPr/>
-          <w:p>
-            <w:pPr>
-              <w:pStyle w:val="Compact"/>
-              <w:jc w:val="left"/>
-            </w:pPr>
-            <w:r>
-              <w:t xml:space="preserve">0 (collapses to NB)</w:t>
-            </w:r>
-          </w:p>
-        </w:tc>
-        <w:tc>
-          <w:tcPr/>
-          <w:p>
-            <w:pPr>
-              <w:pStyle w:val="Compact"/>
-              <w:jc w:val="left"/>
-            </w:pPr>
-            <w:r>
-              <w:t xml:space="preserve">Lognormal</w:t>
-            </w:r>
-          </w:p>
-        </w:tc>
-      </w:tr>
-      <w:tr>
-        <w:tc>
-          <w:tcPr/>
-          <w:p>
-            <w:pPr>
-              <w:pStyle w:val="Compact"/>
-              <w:jc w:val="left"/>
-            </w:pPr>
-            <w:r>
-              <w:t xml:space="preserve">Trump, Twitter, all original</w:t>
-            </w:r>
-          </w:p>
-        </w:tc>
-        <w:tc>
-          <w:tcPr/>
-          <w:p>
-            <w:pPr>
-              <w:pStyle w:val="Compact"/>
-              <w:jc w:val="left"/>
-            </w:pPr>
-            <w:r>
-              <w:t xml:space="preserve">1,448</w:t>
-            </w:r>
-          </w:p>
-        </w:tc>
-        <w:tc>
-          <w:tcPr/>
-          <w:p>
-            <w:pPr>
-              <w:pStyle w:val="Compact"/>
-              <w:jc w:val="left"/>
-            </w:pPr>
-            <w:r>
-              <w:t xml:space="preserve">626</w:t>
-            </w:r>
-          </w:p>
-        </w:tc>
-        <w:tc>
-          <w:tcPr/>
-          <w:p>
-            <w:pPr>
-              <w:pStyle w:val="Compact"/>
-              <w:jc w:val="left"/>
-            </w:pPr>
-            <w:r>
-              <w:t xml:space="preserve">639</w:t>
-            </w:r>
-          </w:p>
-        </w:tc>
-        <w:tc>
-          <w:tcPr/>
-          <w:p>
-            <w:pPr>
-              <w:pStyle w:val="Compact"/>
-              <w:jc w:val="left"/>
-            </w:pPr>
-            <w:r>
-              <w:t xml:space="preserve">0</w:t>
-            </w:r>
-          </w:p>
-        </w:tc>
-        <w:tc>
-          <w:tcPr/>
-          <w:p>
-            <w:pPr>
-              <w:pStyle w:val="Compact"/>
-              <w:jc w:val="left"/>
-            </w:pPr>
-            <w:r>
-              <w:t xml:space="preserve">Weibull</w:t>
-            </w:r>
-          </w:p>
-        </w:tc>
-      </w:tr>
-      <w:tr>
-        <w:tc>
-          <w:tcPr/>
-          <w:p>
-            <w:pPr>
-              <w:pStyle w:val="Compact"/>
-              <w:jc w:val="left"/>
-            </w:pPr>
-            <w:r>
-              <w:t xml:space="preserve">Trump, Twitter, oil/Iran</w:t>
-            </w:r>
-          </w:p>
-        </w:tc>
-        <w:tc>
-          <w:tcPr/>
-          <w:p>
-            <w:pPr>
-              <w:pStyle w:val="Compact"/>
-              <w:jc w:val="left"/>
-            </w:pPr>
-            <w:r>
-              <w:t xml:space="preserve">1,448</w:t>
-            </w:r>
-          </w:p>
-        </w:tc>
-        <w:tc>
-          <w:tcPr/>
-          <w:p>
-            <w:pPr>
-              <w:pStyle w:val="Compact"/>
-              <w:jc w:val="left"/>
-            </w:pPr>
-            <w:r>
-              <w:t xml:space="preserve">57</w:t>
-            </w:r>
-          </w:p>
-        </w:tc>
-        <w:tc>
-          <w:tcPr/>
-          <w:p>
-            <w:pPr>
-              <w:pStyle w:val="Compact"/>
-              <w:jc w:val="left"/>
-            </w:pPr>
-            <w:r>
-              <w:t xml:space="preserve">62</w:t>
-            </w:r>
-          </w:p>
-        </w:tc>
-        <w:tc>
-          <w:tcPr/>
-          <w:p>
-            <w:pPr>
-              <w:pStyle w:val="Compact"/>
-              <w:jc w:val="left"/>
-            </w:pPr>
-            <w:r>
-              <w:t xml:space="preserve">0</w:t>
-            </w:r>
-          </w:p>
-        </w:tc>
-        <w:tc>
-          <w:tcPr/>
-          <w:p>
-            <w:pPr>
-              <w:pStyle w:val="Compact"/>
-              <w:jc w:val="left"/>
-            </w:pPr>
-            <w:r>
-              <w:t xml:space="preserve">Gamma</w:t>
-            </w:r>
-          </w:p>
-        </w:tc>
-      </w:tr>
-      <w:tr>
-        <w:tc>
-          <w:tcPr/>
-          <w:p>
-            <w:pPr>
-              <w:pStyle w:val="Compact"/>
-              <w:jc w:val="left"/>
-            </w:pPr>
-            <w:r>
-              <w:t xml:space="preserve">Trump, Twitter, tariff/trade</w:t>
-            </w:r>
-          </w:p>
-        </w:tc>
-        <w:tc>
-          <w:tcPr/>
-          <w:p>
-            <w:pPr>
-              <w:pStyle w:val="Compact"/>
-              <w:jc w:val="left"/>
-            </w:pPr>
-            <w:r>
-              <w:t xml:space="preserve">1,448</w:t>
-            </w:r>
-          </w:p>
-        </w:tc>
-        <w:tc>
-          <w:tcPr/>
-          <w:p>
-            <w:pPr>
-              <w:pStyle w:val="Compact"/>
-              <w:jc w:val="left"/>
-            </w:pPr>
-            <w:r>
-              <w:t xml:space="preserve">137</w:t>
-            </w:r>
-          </w:p>
-        </w:tc>
-        <w:tc>
-          <w:tcPr/>
-          <w:p>
-            <w:pPr>
-              <w:pStyle w:val="Compact"/>
-              <w:jc w:val="left"/>
-            </w:pPr>
-            <w:r>
-              <w:t xml:space="preserve">129</w:t>
-            </w:r>
-          </w:p>
-        </w:tc>
-        <w:tc>
-          <w:tcPr/>
-          <w:p>
-            <w:pPr>
-              <w:pStyle w:val="Compact"/>
-              <w:jc w:val="left"/>
-            </w:pPr>
-            <w:r>
-              <w:t xml:space="preserve">0</w:t>
-            </w:r>
-          </w:p>
-        </w:tc>
-        <w:tc>
-          <w:tcPr/>
-          <w:p>
-            <w:pPr>
-              <w:pStyle w:val="Compact"/>
-              <w:jc w:val="left"/>
-            </w:pPr>
-            <w:r>
-              <w:t xml:space="preserve">Gamma</w:t>
-            </w:r>
-          </w:p>
-        </w:tc>
-      </w:tr>
-      <w:tr>
-        <w:tc>
-          <w:tcPr/>
-          <w:p>
-            <w:pPr>
-              <w:pStyle w:val="Compact"/>
-              <w:jc w:val="left"/>
-            </w:pPr>
-            <w:r>
-              <w:t xml:space="preserve">Musk, Twitter 2012–17</w:t>
-            </w:r>
-          </w:p>
-        </w:tc>
-        <w:tc>
-          <w:tcPr/>
-          <w:p>
-            <w:pPr>
-              <w:pStyle w:val="Compact"/>
-              <w:jc w:val="left"/>
-            </w:pPr>
-            <w:r>
-              <w:t xml:space="preserve">1,779</w:t>
-            </w:r>
-          </w:p>
-        </w:tc>
-        <w:tc>
-          <w:tcPr/>
-          <w:p>
-            <w:pPr>
-              <w:pStyle w:val="Compact"/>
-              <w:jc w:val="left"/>
-            </w:pPr>
-            <w:r>
-              <w:t xml:space="preserve">238</w:t>
-            </w:r>
-          </w:p>
-        </w:tc>
-        <w:tc>
-          <w:tcPr/>
-          <w:p>
-            <w:pPr>
-              <w:pStyle w:val="Compact"/>
-              <w:jc w:val="left"/>
-            </w:pPr>
-            <w:r>
-              <w:t xml:space="preserve">249</w:t>
-            </w:r>
-          </w:p>
-        </w:tc>
-        <w:tc>
-          <w:tcPr/>
-          <w:p>
-            <w:pPr>
-              <w:pStyle w:val="Compact"/>
-              <w:jc w:val="left"/>
-            </w:pPr>
-            <w:r>
-              <w:t xml:space="preserve">0</w:t>
-            </w:r>
-          </w:p>
-        </w:tc>
-        <w:tc>
-          <w:tcPr/>
-          <w:p>
-            <w:pPr>
-              <w:pStyle w:val="Compact"/>
-              <w:jc w:val="left"/>
-            </w:pPr>
-            <w:r>
-              <w:t xml:space="preserve">Lognormal</w:t>
-            </w:r>
-          </w:p>
-        </w:tc>
-      </w:tr>
-      <w:tr>
-        <w:tc>
-          <w:tcPr/>
-          <w:p>
-            <w:pPr>
-              <w:pStyle w:val="Compact"/>
-              <w:jc w:val="left"/>
-            </w:pPr>
-            <w:r>
-              <w:t xml:space="preserve">Musk, Twitter 2016–17</w:t>
-            </w:r>
-          </w:p>
-        </w:tc>
-        <w:tc>
-          <w:tcPr/>
-          <w:p>
-            <w:pPr>
-              <w:pStyle w:val="Compact"/>
-              <w:jc w:val="left"/>
-            </w:pPr>
-            <w:r>
-              <w:t xml:space="preserve">638</w:t>
-            </w:r>
-          </w:p>
-        </w:tc>
-        <w:tc>
-          <w:tcPr/>
-          <w:p>
-            <w:pPr>
-              <w:pStyle w:val="Compact"/>
-              <w:jc w:val="left"/>
-            </w:pPr>
-            <w:r>
-              <w:t xml:space="preserve">59</w:t>
-            </w:r>
-          </w:p>
-        </w:tc>
-        <w:tc>
-          <w:tcPr/>
-          <w:p>
-            <w:pPr>
-              <w:pStyle w:val="Compact"/>
-              <w:jc w:val="left"/>
-            </w:pPr>
-            <w:r>
-              <w:t xml:space="preserve">66</w:t>
-            </w:r>
-          </w:p>
-        </w:tc>
-        <w:tc>
-          <w:tcPr/>
-          <w:p>
-            <w:pPr>
-              <w:pStyle w:val="Compact"/>
-              <w:jc w:val="left"/>
-            </w:pPr>
-            <w:r>
-              <w:t xml:space="preserve">0</w:t>
-            </w:r>
-          </w:p>
-        </w:tc>
-        <w:tc>
-          <w:tcPr/>
-          <w:p>
-            <w:pPr>
-              <w:pStyle w:val="Compact"/>
-              <w:jc w:val="left"/>
-            </w:pPr>
-            <w:r>
-              <w:t xml:space="preserve">Lognormal</w:t>
-            </w:r>
-          </w:p>
-        </w:tc>
-      </w:tr>
-    </w:tbl>
-    <w:p>
-      <w:pPr>
-        <w:pStyle w:val="BodyText"/>
-      </w:pPr>
-      <w:r>
-        <w:rPr>
-          <w:iCs/>
-          <w:i/>
-        </w:rPr>
-        <w:t xml:space="preserve">Table 0. Alternative models for the arrival of posts (ΔAIC relative to the best model in each row; Poisson ΔAIC 150 to 3,700 in all rows; descriptive, not pre-registered; RESULTS_ARRIVALS_MODELS.md).</w:t>
-      </w:r>
-    </w:p>
-    <w:p>
-      <w:pPr>
-        <w:pStyle w:val="BodyText"/>
-      </w:pPr>
-      <w:r>
-        <w:rPr>
-          <w:bCs/>
-          <w:b/>
-        </w:rPr>
-        <w:t xml:space="preserve">Do external events explain the over-dispersion?</w:t>
-      </w:r>
-      <w:r>
-        <w:t xml:space="preserve"> </w:t>
-      </w:r>
-      <w:r>
-        <w:t xml:space="preserve">If a head of state mostly reports external events and those events arrive as a Poisson process, posting would be over-dispersed only because each event spawns several posts. Richardson’s classic result is that the onsets of separate interstate wars are roughly Poisson at an annual scale (Richardson 1960; Clauset 2020), although it has been questioned (Houweling and Kuné 1984), and within a war, violent events are usually modelled as self-exciting (Lewis et al. 2012); a single war that has already begun supplies no such onsets at the daily scale of our data. We therefore tested the idea directly, in an exploratory analysis whose definitions were fixed before the event counts were downloaded (ANALYSIS_PLAN_EVENTS.md). We counted GDELT conflict events per day (Iran-involved conflict events, world conflict, riots, and US–China conflict events; Leetaru and Schrodt 2013) and added the previous day’s count and the average of the previous 2–7 days, together with total event volume, to a negative binomial model of daily posts. The event terms are statistically significant in all six pairings, but they remove only a small part of the dispersion: 9% (Truth Social, all posts), 11% (tariff tweets), 17–20% (all Twitter posts, with riot or world-conflict events) and about 22–25% (oil/Iran tweets; Truth Social Iran posts); in no pairing do they remove half. Calendar-week fixed effects, in contrast, remove 66% of the dispersion of all Twitter posts, so the over-dispersion mostly reflects a slowly moving rate that daily conflict counts do not capture. The event series are themselves far from Poisson (variance-to-mean ratios of about 550 and 900 for Iran-related conflict events, lag-1 autocorrelations of 0.85 and 0.96). The premise that the posts follow Poisson events fails at the daily scale. These counts reflect media coverage, which the posts also influence, so the tests do not identify causal direction, and block-bootstrap intervals rest on only 100 resamples.</w:t>
+        <w:t xml:space="preserve">A homogeneous Poisson process is rejected in every series we examined, including Elon Musk’s account and the 2017–2021 Twitter series. A dynamic negative-binomial model with self-excitation fits the multi-year series best, and daily conflict events from GDELT remove at most a quarter of the dispersion, so the idea that posts merely report Poisson external events is not supported. These exploratory comparisons, which were run after the main results were seen, are reported in Appendix D.</w:t>
       </w:r>
     </w:p>
     <w:bookmarkEnd w:id="38"/>
@@ -2378,13 +1793,23 @@
       </w:r>
     </w:p>
     <w:bookmarkEnd w:id="51"/>
-    <w:bookmarkStart w:id="52" w:name="Xf655f0ebd1e15d3db48b53f73279bc9929d44ce"/>
+    <w:bookmarkEnd w:id="52"/>
+    <w:bookmarkStart w:id="58" w:name="discussion"/>
+    <w:p>
+      <w:pPr>
+        <w:pStyle w:val="Heading2"/>
+      </w:pPr>
+      <w:r>
+        <w:t xml:space="preserve">5. Discussion</w:t>
+      </w:r>
+    </w:p>
+    <w:bookmarkStart w:id="53" w:name="what-the-evidence-supports"/>
     <w:p>
       <w:pPr>
         <w:pStyle w:val="Heading3"/>
       </w:pPr>
       <w:r>
-        <w:t xml:space="preserve">4.9 A probe beyond politics: other actors who time their own events</w:t>
+        <w:t xml:space="preserve">5.1 What the evidence supports</w:t>
       </w:r>
     </w:p>
     <w:p>
@@ -2392,71 +1817,17 @@
         <w:pStyle w:val="FirstParagraph"/>
       </w:pPr>
       <w:r>
-        <w:t xml:space="preserve">A head of state who announces a war and a company that releases a model both choose when the event happens. If the account generalizes, the arrival of such events should not be Poisson, and the market should react more strongly on event days. We probed both in an exploratory analysis registered before the data were parsed (ANALYSIS_PLAN_LLM_RELEASES.md; ANALYSIS_PLAN_LLM_STOCK.md). The source is Wikipedia’s list of large language models (fetched on 14 October 2026; 187 rows with at least a month, 126 with a full date, nearly all from 2025–2026); it is crowd-edited and includes models by notability, so the tests are descriptive.</w:t>
-      </w:r>
-    </w:p>
-    <w:p>
-      <w:pPr>
-        <w:pStyle w:val="BodyText"/>
-      </w:pPr>
-      <w:r>
-        <w:rPr>
-          <w:iCs/>
-          <w:i/>
-        </w:rPr>
-        <w:t xml:space="preserve">Arrival.</w:t>
-      </w:r>
-      <w:r>
-        <w:t xml:space="preserve"> </w:t>
-      </w:r>
-      <w:r>
-        <w:t xml:space="preserve">Monthly release counts rise steeply over 2018–2026, and with a log-trend they remain over-dispersed (Pearson χ²/df 1.7; negative-binomial α = 0.25; likelihood-ratio p = 0.0001); in the shorter 2024–2026 window the evidence is weaker with a quadratic trend (α = 0.10; one-sided p = 0.028). Of 125 releases with a full date since 2023, 4% fell on a weekend, against 29% expected under a homogeneous process (χ² = 62.1, 6 df; Holm p &lt; 10⁻¹⁰). Gaps between releases (119 gaps since 2024; coefficient of variation 1.55) are fitted best by a negative binomial; the memoryless geometric is worse by 22 AIC units. Individual developers release more regularly than a Poisson process (coefficients of variation 0.67 for Anthropic, 0.81 for OpenAI, 1.12 for Google DeepMind), so the clustering appears only after pooling. Release dates follow the business calendar, a clear departure from a Poisson process.</w:t>
-      </w:r>
-    </w:p>
-    <w:p>
-      <w:pPr>
-        <w:pStyle w:val="BodyText"/>
-      </w:pPr>
-      <w:r>
-        <w:rPr>
-          <w:iCs/>
-          <w:i/>
-        </w:rPr>
-        <w:t xml:space="preserve">Market reaction.</w:t>
-      </w:r>
-      <w:r>
-        <w:t xml:space="preserve"> </w:t>
-      </w:r>
-      <w:r>
-        <w:t xml:space="preserve">For the 31 releases by listed developers (Alphabet 9, Alibaba 8, Meta 4, Microsoft, Xiaomi and Tencent 3 each, Nvidia 1), the mean abnormal return over the release day and the next trading day, from a market model, is +0.40 percentage points (SE 0.68; Wilcoxon p = 0.76). The standardized absolute abnormal return is larger than in random two-day windows of the same firms (1.11 against 0.75; permutation p = 0.008; Holm p = 0.015). In other words, there is a magnitude effect without a direction. It shrinks by about 40% when three events likely to coincide with other news are removed (Gemini 2.0 on 5 February 2025, Qwen2.5 on 26–27 January 2025 and Llama 4 on 5–7 April 2025; the coincidences are our recollection, not checked here). Release times of day are not in the list, so daily windows were used; unlisted developers, about half of the 2025–2026 rows, are excluded by design; and a few firms contribute only 3–4 events each, with opposite signs across firms.</w:t>
-      </w:r>
-    </w:p>
-    <w:p>
-      <w:pPr>
-        <w:pStyle w:val="BodyText"/>
-      </w:pPr>
-      <w:r>
-        <w:t xml:space="preserve">Taken together with the war-period results, the two settings agree on one point, that timing is chosen by the actor and arrival is not Poisson. They do not agree on the market reaction: with the matched-hour placebo (Section 4.2) the posts show a directional move beyond fake times in comparable hours, whereas releases show larger absolute moves without a direction. Because the two statistics differ, and because we have no comparison group of externally caused events, we do not claim that self-caused events are a common class with a common market signature.</w:t>
-      </w:r>
-    </w:p>
-    <w:bookmarkEnd w:id="52"/>
+        <w:t xml:space="preserve">The evidence supports a small number of statements. First, platform speech by a head of state arrives as an overdispersed, bursty process whose timing follows volatile market hours. Second, during a period of high uncertainty about one physical state, oil co-moved with posts that humans label de-escalation (about +1.05% in 30 minutes) and, at about half the size, with posts that humans label escalation (+0.48%), and not with posts on topics lacking comparable uncertainty; the model’s labels had suggested a one-sided response because its escalation label is mostly wrong. Third, that co-movement is robust to rank-based and block inference and to standardization, yet at hourly resolution it cannot be separated from drift that precedes the post; at tick resolution, on human-labelled posts, the 30 minutes after the post exceed the 30 minutes before it by 0.48 points (p = 0.030). Fourth, variables that the information-theoretic account says should matter, novelty and prior uncertainty, have the predicted sign consistently in the 2026 sample but are not individually significant, and in an independent 2017–2021 sample they are not supported at all, while the information transferred from post class to return direction is detectably above chance during the closure only. Fifth, in the oil samples the sign of the directional response differed between the closed-strait and open-strait periods: with the strait closed, de-escalation moved oil; with it open, escalation did. We offered the proposition that this reflects the prior (P6), and the pre-registered test in the tariff tweets rejected it, so the difference remains an observation we cannot yet explain. Sixth, the timing of a post, as opposed to its content, carries no detectable additional information about the 30-minute reaction (P7). Seventh, posting is not Poisson in any series we examined; it is overdispersed and, in multi-year series, self-exciting, a pattern that Elon Musk’s account also shows. Taken together, the measurable implications of the information-theoretic account that held are the descriptive ones (mutual information in the closure sample, and prior uncertainty in the volatility-confounded tariff sample); those about novelty, interaction, state-dependent sign and timing did not. An exploratory probe of another actor who times his own events, LLM developers, found the same non-Poisson, calendar-bound arrival and larger absolute market moves on release days, without a direction (Appendix D.3). Daily conflict events remove at most a quarter of the dispersion of posting, so an account in which posts merely report Poisson external events is not supported (Appendix D.2).</w:t>
+      </w:r>
+    </w:p>
     <w:bookmarkEnd w:id="53"/>
-    <w:bookmarkStart w:id="59" w:name="discussion"/>
-    <w:p>
-      <w:pPr>
-        <w:pStyle w:val="Heading2"/>
-      </w:pPr>
-      <w:r>
-        <w:t xml:space="preserve">5. Discussion</w:t>
-      </w:r>
-    </w:p>
-    <w:bookmarkStart w:id="54" w:name="what-the-evidence-supports"/>
+    <w:bookmarkStart w:id="54" w:name="contributions"/>
     <w:p>
       <w:pPr>
         <w:pStyle w:val="Heading3"/>
       </w:pPr>
       <w:r>
-        <w:t xml:space="preserve">5.1 What the evidence supports</w:t>
+        <w:t xml:space="preserve">5.2 Contributions</w:t>
       </w:r>
     </w:p>
     <w:p>
@@ -2464,17 +1835,33 @@
         <w:pStyle w:val="FirstParagraph"/>
       </w:pPr>
       <w:r>
-        <w:t xml:space="preserve">The evidence supports a small number of statements. First, platform speech by a head of state arrives as an overdispersed, bursty process whose timing follows volatile market hours. Second, during a period of high uncertainty about one physical state, oil co-moved with posts that humans label de-escalation (about +1.05% in 30 minutes) and, at about half the size, with posts that humans label escalation (+0.48%), and not with posts on topics lacking comparable uncertainty; the model’s labels had suggested a one-sided response because its escalation label is mostly wrong. Third, that co-movement is robust to rank-based and block inference and to standardization, yet at hourly resolution it cannot be separated from drift that precedes the post; at tick resolution, on human-labelled posts, the 30 minutes after the post exceed the 30 minutes before it by 0.48 points (p = 0.030). Fourth, variables that the information-theoretic account says should matter, novelty and prior uncertainty, have the predicted sign consistently in the 2026 sample but are not individually significant, and in an independent 2017–2021 sample they are not supported at all, while the information transferred from post class to return direction is detectably above chance during the closure only. Fifth, in the oil samples the sign of the directional response differed between the closed-strait and open-strait periods: with the strait closed, de-escalation moved oil; with it open, escalation did. We offered the proposition that this reflects the prior (P6), and the pre-registered test in the tariff tweets rejected it, so the difference remains an observation we cannot yet explain. Sixth, the timing of a post, as opposed to its content, carries no detectable additional information about the 30-minute reaction (P7). Seventh, posting is not Poisson in any series we examined; it is overdispersed and, in multi-year series, self-exciting, a pattern that Elon Musk’s account also shows. Taken together, the measurable implications of the information-theoretic account that held are the descriptive ones (mutual information in the closure sample, and prior uncertainty in the volatility-confounded tariff sample); those about novelty, interaction, state-dependent sign and timing did not. An exploratory probe of another actor who times his own events, LLM developers, found the same non-Poisson, calendar-bound arrival and larger absolute market moves on release days, without a direction (Section 4.9). Daily conflict events remove at most a quarter of the dispersion of posting, so an account in which posts merely report Poisson external events is not supported (Section 4.1).</w:t>
+        <w:t xml:space="preserve">The paper’s main contribution is a framework. By expressing the determinants of a post’s market impact in a common currency (surprisal, prior entropy, channel reliability, redundancy), the account generates comparable propositions out of what had been separate stories about attention, habituation, and credibility, and it explains why a topic with high prior uncertainty (the closed strait) shows the response while topics without it (monetary policy, non-tariff China matters) do not. It also locates the platform’s role: it lowers the cost of messages, which raises their number and the share that is redundant, and it removes intermediaries, which makes reliability the receiver’s problem.</w:t>
+      </w:r>
+    </w:p>
+    <w:p>
+      <w:pPr>
+        <w:pStyle w:val="BodyText"/>
+      </w:pPr>
+      <w:r>
+        <w:t xml:space="preserve">A second contribution concerns the source side. A Poisson–Gamma structure with a rate that responds to the environment implies that posting times are informative and not exogenous, so event studies of executive posts that treat them as random overstate their identification. We show this directly with the hazard of posting.</w:t>
+      </w:r>
+    </w:p>
+    <w:p>
+      <w:pPr>
+        <w:pStyle w:val="BodyText"/>
+      </w:pPr>
+      <w:r>
+        <w:t xml:space="preserve">A third contribution is methodological. The design (written plans before estimation, independent model coders blind to outcomes, explicit power calculations, dated amendments, pre-registered placebos, and independent timing checks) allowed us to report that the headline result is robust in some respects and not in others, and that three mechanisms and two content-analytic propositions could not be confirmed. It also caught a misclassification that would have produced a false headline.</w:t>
       </w:r>
     </w:p>
     <w:bookmarkEnd w:id="54"/>
-    <w:bookmarkStart w:id="55" w:name="contributions"/>
+    <w:bookmarkStart w:id="55" w:name="implications-for-practice"/>
     <w:p>
       <w:pPr>
         <w:pStyle w:val="Heading3"/>
       </w:pPr>
       <w:r>
-        <w:t xml:space="preserve">5.2 Contributions</w:t>
+        <w:t xml:space="preserve">5.3 Implications for practice</w:t>
       </w:r>
     </w:p>
     <w:p>
@@ -2482,33 +1869,17 @@
         <w:pStyle w:val="FirstParagraph"/>
       </w:pPr>
       <w:r>
-        <w:t xml:space="preserve">The paper’s main contribution is a framework. By expressing the determinants of a post’s market impact in a common currency (surprisal, prior entropy, channel reliability, redundancy), the account generates comparable propositions out of what had been separate stories about attention, habituation, and credibility, and it explains why a topic with high prior uncertainty (the closed strait) shows the response while topics without it (monetary policy, non-tariff China matters) do not. It also locates the platform’s role: it lowers the cost of messages, which raises their number and the share that is redundant, and it removes intermediaries, which makes reliability the receiver’s problem.</w:t>
-      </w:r>
-    </w:p>
-    <w:p>
-      <w:pPr>
-        <w:pStyle w:val="BodyText"/>
-      </w:pPr>
-      <w:r>
-        <w:t xml:space="preserve">A second contribution concerns the source side. A Poisson–Gamma structure with a rate that responds to the environment implies that posting times are informative and not exogenous, so event studies of executive posts that treat them as random overstate their identification. We show this directly with the hazard of posting.</w:t>
-      </w:r>
-    </w:p>
-    <w:p>
-      <w:pPr>
-        <w:pStyle w:val="BodyText"/>
-      </w:pPr>
-      <w:r>
-        <w:t xml:space="preserve">A third contribution is methodological. The design (written plans before estimation, independent model coders blind to outcomes, explicit power calculations, dated amendments, pre-registered placebos, and independent timing checks) allowed us to report that the headline result is robust in some respects and not in others, and that three mechanisms and two content-analytic propositions could not be confirmed. It also caught a misclassification that would have produced a false headline.</w:t>
+        <w:t xml:space="preserve">For analysts who monitor executive feeds, the account suggests weighting a message by its novelty relative to recent messages and by the current uncertainty about the state it concerns, and ignoring re-posts and links. For platform operators and regulators, the account highlights that when a platform is the first channel for decisions, the information advantage in the interval before secondary coverage is concentrated at the platform; we make no claim about any trading behavior.</w:t>
       </w:r>
     </w:p>
     <w:bookmarkEnd w:id="55"/>
-    <w:bookmarkStart w:id="56" w:name="implications-for-practice"/>
+    <w:bookmarkStart w:id="56" w:name="limitations"/>
     <w:p>
       <w:pPr>
         <w:pStyle w:val="Heading3"/>
       </w:pPr>
       <w:r>
-        <w:t xml:space="preserve">5.3 Implications for practice</w:t>
+        <w:t xml:space="preserve">5.4 Limitations</w:t>
       </w:r>
     </w:p>
     <w:p>
@@ -2516,17 +1887,17 @@
         <w:pStyle w:val="FirstParagraph"/>
       </w:pPr>
       <w:r>
-        <w:t xml:space="preserve">For analysts who monitor executive feeds, the account suggests weighting a message by its novelty relative to recent messages and by the current uncertainty about the state it concerns, and ignoring re-posts and links. For platform operators and regulators, the account highlights that when a platform is the first channel for decisions, the information advantage in the interval before secondary coverage is concentrated at the platform; we make no claim about any trading behavior.</w:t>
+        <w:t xml:space="preserve">The tests of Appendix D (arrival models, event explanation, LLM releases) were run after the main results were seen and are exploratory; the event counts come from a media-based database that the posts themselves influence, the release list is crowd-edited, and the 31 listed-developer releases give little power. The coders are model instances, and the human validation (Section 4.6) shows only moderate agreement with them (κ = 0.43 and 0.56 against the human consensus; 0.51 between the humans), with de-escalation precision of about one half; the two instances are copies of one model and agree with each other (κ = 0.74) far more than with either human. Every model-labelled result is therefore conditional on a labelling that is not validated. Posting times are endogenous: posts follow volatile hours, and all 20 triangulated cases show other drivers; neither the momentum control nor the first-source classification resolves simultaneity, and the latter is itself an upper bound. Hourly bars cannot separate the post from the preceding hour. The tick analysis can, but it uses a CFD rather than exchange futures, 33 de-escalation events, and one asset; the matched-hour placebo is pending. Prior uncertainty is proxied by relative volatility and novelty by redundancy relative to the account’s own recent posts, neither of which is the market’s information set; weak measures of both would lower power. The war-period result rests on 33 events, two of which supply half of the mean. The 2017–2021 sample adds a second period but not a second sender; it uses model labels only (human labelling is pending), loses 31% of events to closed markets, and its two novelty measures disagree; the tariff sample loses 35% of events to closed markets, relies on model labels that humans accept for only about half of the model-agreed signals, and its supported uncertainty result is confounded with volatility clustering. The sample contains one conflict and one administration. We tested four sets of mechanisms and confirmed none; we cannot exclude that a different formulation would succeed. The plans are not registered with an independent registry, and several were written after related results had been seen.</w:t>
       </w:r>
     </w:p>
     <w:bookmarkEnd w:id="56"/>
-    <w:bookmarkStart w:id="57" w:name="limitations"/>
+    <w:bookmarkStart w:id="57" w:name="future-research"/>
     <w:p>
       <w:pPr>
         <w:pStyle w:val="Heading3"/>
       </w:pPr>
       <w:r>
-        <w:t xml:space="preserve">5.4 Limitations</w:t>
+        <w:t xml:space="preserve">5.5 Future research</w:t>
       </w:r>
     </w:p>
     <w:p>
@@ -2534,30 +1905,12 @@
         <w:pStyle w:val="FirstParagraph"/>
       </w:pPr>
       <w:r>
-        <w:t xml:space="preserve">The tests of Sections 4.1 and 4.9 (arrival models, event explanation, LLM releases) were run after the main results were seen and are exploratory; the event counts come from a media-based database that the posts themselves influence, the release list is crowd-edited, and the 31 listed-developer releases give little power. The coders are model instances, and the human validation (Section 4.6) shows only moderate agreement with them (κ = 0.43 and 0.56 against the human consensus; 0.51 between the humans), with de-escalation precision of about one half; the two instances are copies of one model and agree with each other (κ = 0.74) far more than with either human. Every model-labelled result is therefore conditional on a labelling that is not validated. Posting times are endogenous: posts follow volatile hours, and all 20 triangulated cases show other drivers; neither the momentum control nor the first-source classification resolves simultaneity, and the latter is itself an upper bound. Hourly bars cannot separate the post from the preceding hour. The tick analysis can, but it uses a CFD rather than exchange futures, 33 de-escalation events, and one asset; the matched-hour placebo is pending. Prior uncertainty is proxied by relative volatility and novelty by redundancy relative to the account’s own recent posts, neither of which is the market’s information set; weak measures of both would lower power. The war-period result rests on 33 events, two of which supply half of the mean. The 2017–2021 sample adds a second period but not a second sender; it uses model labels only (human labelling is pending), loses 31% of events to closed markets, and its two novelty measures disagree; the tariff sample loses 35% of events to closed markets, relies on model labels that humans accept for only about half of the model-agreed signals, and its supported uncertainty result is confounded with volatility clustering. The sample contains one conflict and one administration. We tested four sets of mechanisms and confirmed none; we cannot exclude that a different formulation would succeed. The plans are not registered with an independent registry, and several were written after related results had been seen.</w:t>
+        <w:t xml:space="preserve">The most informative next steps are a pre-registered comparison of dispersion and self-excitation between accounts of people who use posts to influence others and matched ordinary accounts (ANALYSIS_PLAN_ACCOUNTS.md; registered, not run, because suitable data have not been established), a comparison group of externally caused events for the self-timed-event probe, release times of day for tick-level analysis of releases, and extension of the tick-level design to several assets and to exchange futures, with a completed placebo; a continuous measure of physical constraint (tanker transits, insurance spreads, term-structure) as a measure of prior uncertainty; prospective collection, under the protocol we registered, of counterparty denials and concurrent news; and a sample large enough to test redundancy (roughly 480 to 560 signal posts for the habituation effect).</w:t>
       </w:r>
     </w:p>
     <w:bookmarkEnd w:id="57"/>
-    <w:bookmarkStart w:id="58" w:name="future-research"/>
-    <w:p>
-      <w:pPr>
-        <w:pStyle w:val="Heading3"/>
-      </w:pPr>
-      <w:r>
-        <w:t xml:space="preserve">5.5 Future research</w:t>
-      </w:r>
-    </w:p>
-    <w:p>
-      <w:pPr>
-        <w:pStyle w:val="FirstParagraph"/>
-      </w:pPr>
-      <w:r>
-        <w:t xml:space="preserve">The most informative next steps are a pre-registered comparison of dispersion and self-excitation between accounts of people who use posts to influence others and matched ordinary accounts (ANALYSIS_PLAN_ACCOUNTS.md; registered, not run, because suitable data have not been established), a comparison group of externally caused events for the self-timed-event probe, release times of day for tick-level analysis of releases, and extension of the tick-level design to several assets and to exchange futures, with a completed placebo; a continuous measure of physical constraint (tanker transits, insurance spreads, term-structure) as a measure of prior uncertainty; prospective collection, under the protocol we registered, of counterparty denials and concurrent news; and a sample large enough to test redundancy (roughly 480 to 560 signal posts for the habituation effect).</w:t>
-      </w:r>
-    </w:p>
     <w:bookmarkEnd w:id="58"/>
-    <w:bookmarkEnd w:id="59"/>
-    <w:bookmarkStart w:id="60" w:name="conclusion"/>
+    <w:bookmarkStart w:id="59" w:name="conclusion"/>
     <w:p>
       <w:pPr>
         <w:pStyle w:val="Heading2"/>
@@ -2581,8 +1934,8 @@
         </w:pict>
       </w:r>
     </w:p>
-    <w:bookmarkEnd w:id="60"/>
-    <w:bookmarkStart w:id="61" w:name="declarations-to-be-completed"/>
+    <w:bookmarkEnd w:id="59"/>
+    <w:bookmarkStart w:id="60" w:name="declarations-to-be-completed"/>
     <w:p>
       <w:pPr>
         <w:pStyle w:val="Heading2"/>
@@ -2627,8 +1980,8 @@
         <w:t xml:space="preserve">Code, pre-registration files, coder outputs, and results are in the project repository; the post archive and market data come from public sources [add repository DOI].</w:t>
       </w:r>
     </w:p>
-    <w:bookmarkEnd w:id="61"/>
-    <w:bookmarkStart w:id="62" w:name="references"/>
+    <w:bookmarkEnd w:id="60"/>
+    <w:bookmarkStart w:id="61" w:name="references"/>
     <w:p>
       <w:pPr>
         <w:pStyle w:val="Heading2"/>
@@ -3477,8 +2830,8 @@
         <w:t xml:space="preserve">(62:3), pp. 1139–1168.</w:t>
       </w:r>
     </w:p>
-    <w:bookmarkEnd w:id="62"/>
-    <w:bookmarkStart w:id="63" w:name="appendix-a.-pre-registration-ledger"/>
+    <w:bookmarkEnd w:id="61"/>
+    <w:bookmarkStart w:id="62" w:name="appendix-a.-pre-registration-ledger"/>
     <w:p>
       <w:pPr>
         <w:pStyle w:val="Heading2"/>
@@ -4537,14 +3890,32 @@
         </w:tc>
       </w:tr>
     </w:tbl>
+    <w:bookmarkEnd w:id="62"/>
+    <w:bookmarkStart w:id="63" w:name="appendix-b.-coding-protocol"/>
+    <w:p>
+      <w:pPr>
+        <w:pStyle w:val="Heading2"/>
+      </w:pPr>
+      <w:r>
+        <w:t xml:space="preserve">Appendix B. Coding protocol</w:t>
+      </w:r>
+    </w:p>
+    <w:p>
+      <w:pPr>
+        <w:pStyle w:val="FirstParagraph"/>
+      </w:pPr>
+      <w:r>
+        <w:t xml:space="preserve">[Summary of direction and type definitions, blind-coding instructions, the primary-label rule, reconciliation of content-analysis codebooks, the model and prompt provenance, and a reference to the repository files.]</w:t>
+      </w:r>
+    </w:p>
     <w:bookmarkEnd w:id="63"/>
-    <w:bookmarkStart w:id="64" w:name="appendix-b.-coding-protocol"/>
+    <w:bookmarkStart w:id="64" w:name="appendix-c.-human-validation"/>
     <w:p>
       <w:pPr>
         <w:pStyle w:val="Heading2"/>
       </w:pPr>
       <w:r>
-        <w:t xml:space="preserve">Appendix B. Coding protocol</w:t>
+        <w:t xml:space="preserve">Appendix C. Human validation</w:t>
       </w:r>
     </w:p>
     <w:p>
@@ -4552,17 +3923,17 @@
         <w:pStyle w:val="FirstParagraph"/>
       </w:pPr>
       <w:r>
-        <w:t xml:space="preserve">[Summary of direction and type definitions, blind-coding instructions, the primary-label rule, reconciliation of content-analysis codebooks, the model and prompt provenance, and a reference to the repository files.]</w:t>
+        <w:t xml:space="preserve">Two human coders coded 150 posts independently from text only (war-period 67, pre-war Iran 23, other oil-geopolitics 60). Four-class kappa: human–human 0.51; model 1–model 2 0.74; human consensus (97 posts) with model 1 0.43 and with model 2 0.56 (three-class 0.48 and 0.59). De-escalation precision against the consensus is 0.52 (model 1) and 0.54 (model 2); recall 0.77 and 0.88. Of the 12 posts in the tick-level de-escalation sample that fall in the round-1 human sample, the human consensus is de-escalation for 3, escalation for 2, other for 1, and absent for 6. In round 2 (all 61 war-period signal posts, codebook v2, κ between humans 0.69, 13 disagreements adjudicated), the final human labels are 25 de-escalation, 11 escalation, 12 mixed, and 13 other; the model agrees at κ = 0.29. On the 25 human-labelled de-escalation posts the 30-minute directional return is +1.03% (p = 0.0015) and its excess over the preceding 30 minutes +0.35% (p = 0.082). Details are in RESULTS_HUMAN.md and RESULTS_HUMAN61.md.</w:t>
       </w:r>
     </w:p>
     <w:bookmarkEnd w:id="64"/>
-    <w:bookmarkStart w:id="65" w:name="appendix-c.-human-validation"/>
+    <w:bookmarkStart w:id="68" w:name="Xb7c8b0c006d32ef17360e7965bd4f74c3382ab2"/>
     <w:p>
       <w:pPr>
         <w:pStyle w:val="Heading2"/>
       </w:pPr>
       <w:r>
-        <w:t xml:space="preserve">Appendix C. Human validation</w:t>
+        <w:t xml:space="preserve">Appendix D. Exploratory analyses of arrival and of other self-timed events</w:t>
       </w:r>
     </w:p>
     <w:p>
@@ -4570,11 +3941,666 @@
         <w:pStyle w:val="FirstParagraph"/>
       </w:pPr>
       <w:r>
-        <w:t xml:space="preserve">Two human coders coded 150 posts independently from text only (war-period 67, pre-war Iran 23, other oil-geopolitics 60). Four-class kappa: human–human 0.51; model 1–model 2 0.74; human consensus (97 posts) with model 1 0.43 and with model 2 0.56 (three-class 0.48 and 0.59). De-escalation precision against the consensus is 0.52 (model 1) and 0.54 (model 2); recall 0.77 and 0.88. Of the 12 posts in the tick-level de-escalation sample that fall in the round-1 human sample, the human consensus is de-escalation for 3, escalation for 2, other for 1, and absent for 6. In round 2 (all 61 war-period signal posts, codebook v2, κ between humans 0.69, 13 disagreements adjudicated), the final human labels are 25 de-escalation, 11 escalation, 12 mixed, and 13 other; the model agrees at κ = 0.29. On the 25 human-labelled de-escalation posts the 30-minute directional return is +1.03% (p = 0.0015) and its excess over the preceding 30 minutes +0.35% (p = 0.082). Details are in RESULTS_HUMAN.md and RESULTS_HUMAN61.md.</w:t>
+        <w:t xml:space="preserve">These analyses were run after the main results were seen. Their definitions were fixed in dated plans before the relevant data were downloaded or parsed (Appendix A), but none is confirmatory.</w:t>
+      </w:r>
+    </w:p>
+    <w:bookmarkStart w:id="65" w:name="X6171eebe8d9ea22583180863955c2a5cf5a73ac"/>
+    <w:p>
+      <w:pPr>
+        <w:pStyle w:val="Heading3"/>
+      </w:pPr>
+      <w:r>
+        <w:t xml:space="preserve">D.1 Alternative arrival models and a second account</w:t>
+      </w:r>
+    </w:p>
+    <w:p>
+      <w:pPr>
+        <w:pStyle w:val="FirstParagraph"/>
+      </w:pPr>
+      <w:r>
+        <w:t xml:space="preserve">Poisson is not the only candidate, and the negative binomial (a Poisson–Gamma mixture) is a particular one. Table D1 compares daily-count models by AIC for the Truth Social series, for the 2017–2021 Twitter series (all original tweets and the two topic subsets of Sections 4.7–4.8), and for Elon Musk’s account as a second influential poster (a public third-party extract of 3,218 tweets, 2012–2017, whose completeness and time zone we could not verify). A homogeneous Poisson process is rejected everywhere (ΔAIC 150 to 3,700). The negative binomial and a Poisson–lognormal mixture fit equally well (differences within about 13 AIC units), so the data do not support choosing a gamma over a lognormal mixing distribution. In the multi-year Twitter series a dynamic model, a negative-binomial INGARCH(1,1) in which today’s rate depends on yesterday’s count and rate, is far better than every static mixture (ΔAIC 57 to 626); the 227-day Truth Social series is too short for this and the static negative binomial suffices. Waiting times follow no power law (Pareto is worst in every series); the best form is Weibull for all of Trump’s tweets, gamma for the topic subsets, and lognormal for Truth Social and Musk (CV 1.7 to 2.5). Musk’s account shows the same qualitative pattern as the president’s. We read this as evidence that human posting is bursty and self-exciting, not as evidence that the pattern is specific to people whose words carry weight: we have no comparison with ordinary accounts. A pre-registered comparison with matched ordinary accounts is specified (ANALYSIS_PLAN_ACCOUNTS.md) but has not been run, because we have not established that data of sufficient quality exist.</w:t>
+      </w:r>
+    </w:p>
+    <w:tbl>
+      <w:tblPr>
+        <w:tblStyle w:val="Table"/>
+        <w:tblW w:type="pct" w:w="5000"/>
+        <w:tblLook w:firstRow="1" w:lastRow="0" w:firstColumn="0" w:lastColumn="0" w:noHBand="0" w:noVBand="0" w:val="0020"/>
+        <w:jc w:val="start"/>
+        <w:tblBorders>
+          <w:top w:val="single" w:sz="4" w:color="000000"/>
+          <w:left w:val="single" w:sz="4" w:color="000000"/>
+          <w:bottom w:val="single" w:sz="4" w:color="000000"/>
+          <w:right w:val="single" w:sz="4" w:color="000000"/>
+          <w:insideH w:val="single" w:sz="4" w:color="000000"/>
+          <w:insideV w:val="single" w:sz="4" w:color="000000"/>
+        </w:tblBorders>
+      </w:tblPr>
+      <w:tblGrid>
+        <w:gridCol w:w="1320"/>
+        <w:gridCol w:w="1320"/>
+        <w:gridCol w:w="1320"/>
+        <w:gridCol w:w="1320"/>
+        <w:gridCol w:w="1320"/>
+        <w:gridCol w:w="1320"/>
+      </w:tblGrid>
+      <w:tr>
+        <w:trPr>
+          <w:tblHeader w:val="true"/>
+        </w:trPr>
+        <w:tc>
+          <w:tcPr/>
+          <w:p>
+            <w:pPr>
+              <w:pStyle w:val="Compact"/>
+              <w:jc w:val="left"/>
+            </w:pPr>
+            <w:r>
+              <w:t xml:space="preserve">Series</w:t>
+            </w:r>
+          </w:p>
+        </w:tc>
+        <w:tc>
+          <w:tcPr/>
+          <w:p>
+            <w:pPr>
+              <w:pStyle w:val="Compact"/>
+              <w:jc w:val="left"/>
+            </w:pPr>
+            <w:r>
+              <w:t xml:space="preserve">Days</w:t>
+            </w:r>
+          </w:p>
+        </w:tc>
+        <w:tc>
+          <w:tcPr/>
+          <w:p>
+            <w:pPr>
+              <w:pStyle w:val="Compact"/>
+              <w:jc w:val="left"/>
+            </w:pPr>
+            <w:r>
+              <w:t xml:space="preserve">Static NB (ΔAIC)</w:t>
+            </w:r>
+          </w:p>
+        </w:tc>
+        <w:tc>
+          <w:tcPr/>
+          <w:p>
+            <w:pPr>
+              <w:pStyle w:val="Compact"/>
+              <w:jc w:val="left"/>
+            </w:pPr>
+            <w:r>
+              <w:t xml:space="preserve">Poisson–lognormal (ΔAIC)</w:t>
+            </w:r>
+          </w:p>
+        </w:tc>
+        <w:tc>
+          <w:tcPr/>
+          <w:p>
+            <w:pPr>
+              <w:pStyle w:val="Compact"/>
+              <w:jc w:val="left"/>
+            </w:pPr>
+            <w:r>
+              <w:t xml:space="preserve">NB-INGARCH (ΔAIC)</w:t>
+            </w:r>
+          </w:p>
+        </w:tc>
+        <w:tc>
+          <w:tcPr/>
+          <w:p>
+            <w:pPr>
+              <w:pStyle w:val="Compact"/>
+              <w:jc w:val="left"/>
+            </w:pPr>
+            <w:r>
+              <w:t xml:space="preserve">Best waiting-time model</w:t>
+            </w:r>
+          </w:p>
+        </w:tc>
+      </w:tr>
+      <w:tr>
+        <w:tc>
+          <w:tcPr/>
+          <w:p>
+            <w:pPr>
+              <w:pStyle w:val="Compact"/>
+              <w:jc w:val="left"/>
+            </w:pPr>
+            <w:r>
+              <w:t xml:space="preserve">Trump, Truth Social 2026</w:t>
+            </w:r>
+          </w:p>
+        </w:tc>
+        <w:tc>
+          <w:tcPr/>
+          <w:p>
+            <w:pPr>
+              <w:pStyle w:val="Compact"/>
+              <w:jc w:val="left"/>
+            </w:pPr>
+            <w:r>
+              <w:t xml:space="preserve">227</w:t>
+            </w:r>
+          </w:p>
+        </w:tc>
+        <w:tc>
+          <w:tcPr/>
+          <w:p>
+            <w:pPr>
+              <w:pStyle w:val="Compact"/>
+              <w:jc w:val="left"/>
+            </w:pPr>
+            <w:r>
+              <w:t xml:space="preserve">0</w:t>
+            </w:r>
+          </w:p>
+        </w:tc>
+        <w:tc>
+          <w:tcPr/>
+          <w:p>
+            <w:pPr>
+              <w:pStyle w:val="Compact"/>
+              <w:jc w:val="left"/>
+            </w:pPr>
+            <w:r>
+              <w:t xml:space="preserve">1</w:t>
+            </w:r>
+          </w:p>
+        </w:tc>
+        <w:tc>
+          <w:tcPr/>
+          <w:p>
+            <w:pPr>
+              <w:pStyle w:val="Compact"/>
+              <w:jc w:val="left"/>
+            </w:pPr>
+            <w:r>
+              <w:t xml:space="preserve">0 (collapses to NB)</w:t>
+            </w:r>
+          </w:p>
+        </w:tc>
+        <w:tc>
+          <w:tcPr/>
+          <w:p>
+            <w:pPr>
+              <w:pStyle w:val="Compact"/>
+              <w:jc w:val="left"/>
+            </w:pPr>
+            <w:r>
+              <w:t xml:space="preserve">Lognormal</w:t>
+            </w:r>
+          </w:p>
+        </w:tc>
+      </w:tr>
+      <w:tr>
+        <w:tc>
+          <w:tcPr/>
+          <w:p>
+            <w:pPr>
+              <w:pStyle w:val="Compact"/>
+              <w:jc w:val="left"/>
+            </w:pPr>
+            <w:r>
+              <w:t xml:space="preserve">Trump, Twitter, all original</w:t>
+            </w:r>
+          </w:p>
+        </w:tc>
+        <w:tc>
+          <w:tcPr/>
+          <w:p>
+            <w:pPr>
+              <w:pStyle w:val="Compact"/>
+              <w:jc w:val="left"/>
+            </w:pPr>
+            <w:r>
+              <w:t xml:space="preserve">1,448</w:t>
+            </w:r>
+          </w:p>
+        </w:tc>
+        <w:tc>
+          <w:tcPr/>
+          <w:p>
+            <w:pPr>
+              <w:pStyle w:val="Compact"/>
+              <w:jc w:val="left"/>
+            </w:pPr>
+            <w:r>
+              <w:t xml:space="preserve">626</w:t>
+            </w:r>
+          </w:p>
+        </w:tc>
+        <w:tc>
+          <w:tcPr/>
+          <w:p>
+            <w:pPr>
+              <w:pStyle w:val="Compact"/>
+              <w:jc w:val="left"/>
+            </w:pPr>
+            <w:r>
+              <w:t xml:space="preserve">639</w:t>
+            </w:r>
+          </w:p>
+        </w:tc>
+        <w:tc>
+          <w:tcPr/>
+          <w:p>
+            <w:pPr>
+              <w:pStyle w:val="Compact"/>
+              <w:jc w:val="left"/>
+            </w:pPr>
+            <w:r>
+              <w:t xml:space="preserve">0</w:t>
+            </w:r>
+          </w:p>
+        </w:tc>
+        <w:tc>
+          <w:tcPr/>
+          <w:p>
+            <w:pPr>
+              <w:pStyle w:val="Compact"/>
+              <w:jc w:val="left"/>
+            </w:pPr>
+            <w:r>
+              <w:t xml:space="preserve">Weibull</w:t>
+            </w:r>
+          </w:p>
+        </w:tc>
+      </w:tr>
+      <w:tr>
+        <w:tc>
+          <w:tcPr/>
+          <w:p>
+            <w:pPr>
+              <w:pStyle w:val="Compact"/>
+              <w:jc w:val="left"/>
+            </w:pPr>
+            <w:r>
+              <w:t xml:space="preserve">Trump, Twitter, oil/Iran</w:t>
+            </w:r>
+          </w:p>
+        </w:tc>
+        <w:tc>
+          <w:tcPr/>
+          <w:p>
+            <w:pPr>
+              <w:pStyle w:val="Compact"/>
+              <w:jc w:val="left"/>
+            </w:pPr>
+            <w:r>
+              <w:t xml:space="preserve">1,448</w:t>
+            </w:r>
+          </w:p>
+        </w:tc>
+        <w:tc>
+          <w:tcPr/>
+          <w:p>
+            <w:pPr>
+              <w:pStyle w:val="Compact"/>
+              <w:jc w:val="left"/>
+            </w:pPr>
+            <w:r>
+              <w:t xml:space="preserve">57</w:t>
+            </w:r>
+          </w:p>
+        </w:tc>
+        <w:tc>
+          <w:tcPr/>
+          <w:p>
+            <w:pPr>
+              <w:pStyle w:val="Compact"/>
+              <w:jc w:val="left"/>
+            </w:pPr>
+            <w:r>
+              <w:t xml:space="preserve">62</w:t>
+            </w:r>
+          </w:p>
+        </w:tc>
+        <w:tc>
+          <w:tcPr/>
+          <w:p>
+            <w:pPr>
+              <w:pStyle w:val="Compact"/>
+              <w:jc w:val="left"/>
+            </w:pPr>
+            <w:r>
+              <w:t xml:space="preserve">0</w:t>
+            </w:r>
+          </w:p>
+        </w:tc>
+        <w:tc>
+          <w:tcPr/>
+          <w:p>
+            <w:pPr>
+              <w:pStyle w:val="Compact"/>
+              <w:jc w:val="left"/>
+            </w:pPr>
+            <w:r>
+              <w:t xml:space="preserve">Gamma</w:t>
+            </w:r>
+          </w:p>
+        </w:tc>
+      </w:tr>
+      <w:tr>
+        <w:tc>
+          <w:tcPr/>
+          <w:p>
+            <w:pPr>
+              <w:pStyle w:val="Compact"/>
+              <w:jc w:val="left"/>
+            </w:pPr>
+            <w:r>
+              <w:t xml:space="preserve">Trump, Twitter, tariff/trade</w:t>
+            </w:r>
+          </w:p>
+        </w:tc>
+        <w:tc>
+          <w:tcPr/>
+          <w:p>
+            <w:pPr>
+              <w:pStyle w:val="Compact"/>
+              <w:jc w:val="left"/>
+            </w:pPr>
+            <w:r>
+              <w:t xml:space="preserve">1,448</w:t>
+            </w:r>
+          </w:p>
+        </w:tc>
+        <w:tc>
+          <w:tcPr/>
+          <w:p>
+            <w:pPr>
+              <w:pStyle w:val="Compact"/>
+              <w:jc w:val="left"/>
+            </w:pPr>
+            <w:r>
+              <w:t xml:space="preserve">137</w:t>
+            </w:r>
+          </w:p>
+        </w:tc>
+        <w:tc>
+          <w:tcPr/>
+          <w:p>
+            <w:pPr>
+              <w:pStyle w:val="Compact"/>
+              <w:jc w:val="left"/>
+            </w:pPr>
+            <w:r>
+              <w:t xml:space="preserve">129</w:t>
+            </w:r>
+          </w:p>
+        </w:tc>
+        <w:tc>
+          <w:tcPr/>
+          <w:p>
+            <w:pPr>
+              <w:pStyle w:val="Compact"/>
+              <w:jc w:val="left"/>
+            </w:pPr>
+            <w:r>
+              <w:t xml:space="preserve">0</w:t>
+            </w:r>
+          </w:p>
+        </w:tc>
+        <w:tc>
+          <w:tcPr/>
+          <w:p>
+            <w:pPr>
+              <w:pStyle w:val="Compact"/>
+              <w:jc w:val="left"/>
+            </w:pPr>
+            <w:r>
+              <w:t xml:space="preserve">Gamma</w:t>
+            </w:r>
+          </w:p>
+        </w:tc>
+      </w:tr>
+      <w:tr>
+        <w:tc>
+          <w:tcPr/>
+          <w:p>
+            <w:pPr>
+              <w:pStyle w:val="Compact"/>
+              <w:jc w:val="left"/>
+            </w:pPr>
+            <w:r>
+              <w:t xml:space="preserve">Musk, Twitter 2012–17</w:t>
+            </w:r>
+          </w:p>
+        </w:tc>
+        <w:tc>
+          <w:tcPr/>
+          <w:p>
+            <w:pPr>
+              <w:pStyle w:val="Compact"/>
+              <w:jc w:val="left"/>
+            </w:pPr>
+            <w:r>
+              <w:t xml:space="preserve">1,779</w:t>
+            </w:r>
+          </w:p>
+        </w:tc>
+        <w:tc>
+          <w:tcPr/>
+          <w:p>
+            <w:pPr>
+              <w:pStyle w:val="Compact"/>
+              <w:jc w:val="left"/>
+            </w:pPr>
+            <w:r>
+              <w:t xml:space="preserve">238</w:t>
+            </w:r>
+          </w:p>
+        </w:tc>
+        <w:tc>
+          <w:tcPr/>
+          <w:p>
+            <w:pPr>
+              <w:pStyle w:val="Compact"/>
+              <w:jc w:val="left"/>
+            </w:pPr>
+            <w:r>
+              <w:t xml:space="preserve">249</w:t>
+            </w:r>
+          </w:p>
+        </w:tc>
+        <w:tc>
+          <w:tcPr/>
+          <w:p>
+            <w:pPr>
+              <w:pStyle w:val="Compact"/>
+              <w:jc w:val="left"/>
+            </w:pPr>
+            <w:r>
+              <w:t xml:space="preserve">0</w:t>
+            </w:r>
+          </w:p>
+        </w:tc>
+        <w:tc>
+          <w:tcPr/>
+          <w:p>
+            <w:pPr>
+              <w:pStyle w:val="Compact"/>
+              <w:jc w:val="left"/>
+            </w:pPr>
+            <w:r>
+              <w:t xml:space="preserve">Lognormal</w:t>
+            </w:r>
+          </w:p>
+        </w:tc>
+      </w:tr>
+      <w:tr>
+        <w:tc>
+          <w:tcPr/>
+          <w:p>
+            <w:pPr>
+              <w:pStyle w:val="Compact"/>
+              <w:jc w:val="left"/>
+            </w:pPr>
+            <w:r>
+              <w:t xml:space="preserve">Musk, Twitter 2016–17</w:t>
+            </w:r>
+          </w:p>
+        </w:tc>
+        <w:tc>
+          <w:tcPr/>
+          <w:p>
+            <w:pPr>
+              <w:pStyle w:val="Compact"/>
+              <w:jc w:val="left"/>
+            </w:pPr>
+            <w:r>
+              <w:t xml:space="preserve">638</w:t>
+            </w:r>
+          </w:p>
+        </w:tc>
+        <w:tc>
+          <w:tcPr/>
+          <w:p>
+            <w:pPr>
+              <w:pStyle w:val="Compact"/>
+              <w:jc w:val="left"/>
+            </w:pPr>
+            <w:r>
+              <w:t xml:space="preserve">59</w:t>
+            </w:r>
+          </w:p>
+        </w:tc>
+        <w:tc>
+          <w:tcPr/>
+          <w:p>
+            <w:pPr>
+              <w:pStyle w:val="Compact"/>
+              <w:jc w:val="left"/>
+            </w:pPr>
+            <w:r>
+              <w:t xml:space="preserve">66</w:t>
+            </w:r>
+          </w:p>
+        </w:tc>
+        <w:tc>
+          <w:tcPr/>
+          <w:p>
+            <w:pPr>
+              <w:pStyle w:val="Compact"/>
+              <w:jc w:val="left"/>
+            </w:pPr>
+            <w:r>
+              <w:t xml:space="preserve">0</w:t>
+            </w:r>
+          </w:p>
+        </w:tc>
+        <w:tc>
+          <w:tcPr/>
+          <w:p>
+            <w:pPr>
+              <w:pStyle w:val="Compact"/>
+              <w:jc w:val="left"/>
+            </w:pPr>
+            <w:r>
+              <w:t xml:space="preserve">Lognormal</w:t>
+            </w:r>
+          </w:p>
+        </w:tc>
+      </w:tr>
+    </w:tbl>
+    <w:p>
+      <w:pPr>
+        <w:pStyle w:val="BodyText"/>
+      </w:pPr>
+      <w:r>
+        <w:rPr>
+          <w:iCs/>
+          <w:i/>
+        </w:rPr>
+        <w:t xml:space="preserve">Table D1. Alternative models for the arrival of posts (ΔAIC relative to the best model in each row; Poisson ΔAIC 150 to 3,700 in all rows; descriptive, not pre-registered; RESULTS_ARRIVALS_MODELS.md).</w:t>
       </w:r>
     </w:p>
     <w:bookmarkEnd w:id="65"/>
+    <w:bookmarkStart w:id="66" w:name="X5e738fe1f5b19649f986969470de7b656adee10"/>
+    <w:p>
+      <w:pPr>
+        <w:pStyle w:val="Heading3"/>
+      </w:pPr>
+      <w:r>
+        <w:t xml:space="preserve">D.2 Do external events explain the over-dispersion?</w:t>
+      </w:r>
+    </w:p>
+    <w:p>
+      <w:pPr>
+        <w:pStyle w:val="FirstParagraph"/>
+      </w:pPr>
+      <w:r>
+        <w:t xml:space="preserve">If a head of state mostly reports external events and those events arrive as a Poisson process, posting would be over-dispersed only because each event spawns several posts. Richardson’s classic result is that the onsets of separate interstate wars are roughly Poisson at an annual scale (Richardson 1960; Clauset 2020), although it has been questioned (Houweling and Kuné 1984), and within a war, violent events are usually modelled as self-exciting (Lewis et al. 2012); a single war that has already begun supplies no such onsets at the daily scale of our data. We therefore tested the idea directly, in an exploratory analysis whose definitions were fixed before the event counts were downloaded (ANALYSIS_PLAN_EVENTS.md). We counted GDELT conflict events per day (Iran-involved conflict events, world conflict, riots, and US–China conflict events; Leetaru and Schrodt 2013) and added the previous day’s count and the average of the previous 2–7 days, together with total event volume, to a negative binomial model of daily posts. The event terms are statistically significant in all six pairings, but they remove only a small part of the dispersion: 9% (Truth Social, all posts), 11% (tariff tweets), 17–20% (all Twitter posts, with riot or world-conflict events) and about 22–25% (oil/Iran tweets; Truth Social Iran posts); in no pairing do they remove half. Calendar-week fixed effects, in contrast, remove 66% of the dispersion of all Twitter posts, so the over-dispersion mostly reflects a slowly moving rate that daily conflict counts do not capture. The event series are themselves far from Poisson (variance-to-mean ratios of about 550 and 900 for Iran-related conflict events, lag-1 autocorrelations of 0.85 and 0.96). The premise that the posts follow Poisson events fails at the daily scale. These counts reflect media coverage, which the posts also influence, so the tests do not identify causal direction, and block-bootstrap intervals rest on only 100 resamples.</w:t>
+      </w:r>
+    </w:p>
     <w:bookmarkEnd w:id="66"/>
+    <w:bookmarkStart w:id="67" w:name="Xd3a713f58492b0b3fdf582419ce0614c038e780"/>
+    <w:p>
+      <w:pPr>
+        <w:pStyle w:val="Heading3"/>
+      </w:pPr>
+      <w:r>
+        <w:t xml:space="preserve">D.3 A probe beyond politics: other actors who time their own events</w:t>
+      </w:r>
+    </w:p>
+    <w:p>
+      <w:pPr>
+        <w:pStyle w:val="FirstParagraph"/>
+      </w:pPr>
+      <w:r>
+        <w:t xml:space="preserve">A head of state who announces a war and a company that releases a model both choose when the event happens. If the account generalizes, the arrival of such events should not be Poisson, and the market should react more strongly on event days. We probed both in an exploratory analysis registered before the data were parsed (ANALYSIS_PLAN_LLM_RELEASES.md; ANALYSIS_PLAN_LLM_STOCK.md). The source is Wikipedia’s list of large language models (fetched on 14 October 2026; 187 rows with at least a month, 126 with a full date, nearly all from 2025–2026); it is crowd-edited and includes models by notability, so the tests are descriptive.</w:t>
+      </w:r>
+    </w:p>
+    <w:p>
+      <w:pPr>
+        <w:pStyle w:val="BodyText"/>
+      </w:pPr>
+      <w:r>
+        <w:rPr>
+          <w:iCs/>
+          <w:i/>
+        </w:rPr>
+        <w:t xml:space="preserve">Arrival.</w:t>
+      </w:r>
+      <w:r>
+        <w:t xml:space="preserve"> </w:t>
+      </w:r>
+      <w:r>
+        <w:t xml:space="preserve">Monthly release counts rise steeply over 2018–2026, and with a log-trend they remain over-dispersed (Pearson χ²/df 1.7; negative-binomial α = 0.25; likelihood-ratio p = 0.0001); in the shorter 2024–2026 window the evidence is weaker with a quadratic trend (α = 0.10; one-sided p = 0.028). Of 125 releases with a full date since 2023, 4% fell on a weekend, against 29% expected under a homogeneous process (χ² = 62.1, 6 df; Holm p &lt; 10⁻¹⁰). Gaps between releases (119 gaps since 2024; coefficient of variation 1.55) are fitted best by a negative binomial; the memoryless geometric is worse by 22 AIC units. Individual developers release more regularly than a Poisson process (coefficients of variation 0.67 for Anthropic, 0.81 for OpenAI, 1.12 for Google DeepMind), so the clustering appears only after pooling. Release dates follow the business calendar, a clear departure from a Poisson process.</w:t>
+      </w:r>
+    </w:p>
+    <w:p>
+      <w:pPr>
+        <w:pStyle w:val="BodyText"/>
+      </w:pPr>
+      <w:r>
+        <w:rPr>
+          <w:iCs/>
+          <w:i/>
+        </w:rPr>
+        <w:t xml:space="preserve">Market reaction.</w:t>
+      </w:r>
+      <w:r>
+        <w:t xml:space="preserve"> </w:t>
+      </w:r>
+      <w:r>
+        <w:t xml:space="preserve">For the 31 releases by listed developers (Alphabet 9, Alibaba 8, Meta 4, Microsoft, Xiaomi and Tencent 3 each, Nvidia 1), the mean abnormal return over the release day and the next trading day, from a market model, is +0.40 percentage points (SE 0.68; Wilcoxon p = 0.76). The standardized absolute abnormal return is larger than in random two-day windows of the same firms (1.11 against 0.75; permutation p = 0.008; Holm p = 0.015). In other words, there is a magnitude effect without a direction. It shrinks by about 40% when three events likely to coincide with other news are removed (Gemini 2.0 on 5 February 2025, Qwen2.5 on 26–27 January 2025 and Llama 4 on 5–7 April 2025; the coincidences are our recollection, not checked here). Release times of day are not in the list, so daily windows were used; unlisted developers, about half of the 2025–2026 rows, are excluded by design; and a few firms contribute only 3–4 events each, with opposite signs across firms.</w:t>
+      </w:r>
+    </w:p>
+    <w:p>
+      <w:pPr>
+        <w:pStyle w:val="BodyText"/>
+      </w:pPr>
+      <w:r>
+        <w:t xml:space="preserve">Taken together with the war-period results, the two settings agree on one point, that timing is chosen by the actor and arrival is not Poisson. They do not agree on the market reaction: with the matched-hour placebo (Section 4.2) the posts show a directional move beyond fake times in comparable hours, whereas releases show larger absolute moves without a direction. Because the two statistics differ, and because we have no comparison group of externally caused events, we do not claim that self-caused events are a common class with a common market signature.</w:t>
+      </w:r>
+    </w:p>
+    <w:bookmarkEnd w:id="67"/>
+    <w:bookmarkEnd w:id="68"/>
+    <w:bookmarkEnd w:id="69"/>
     <w:sectPr>
       <w:pgMar w:bottom="1440" w:left="1440" w:right="1440" w:top="1440"/>
     </w:sectPr>

</xml_diff>

<commit_message>
Fix Ge, Kurov, Wolfe (2019) reference
Co-Authored-By: Claude Sonnet 5.5 <noreply@anthropic.com>
Claude-Session: https://claude.ai/code/session_011aZmoPyuUT34TyBPwawaPZ
</commit_message>
<xml_diff>
--- a/misq_note/hf/MANUSCRIPT_MISQ_v2.docx
+++ b/misq_note/hf/MANUSCRIPT_MISQ_v2.docx
@@ -103,7 +103,7 @@
         <w:pStyle w:val="BodyText"/>
       </w:pPr>
       <w:r>
-        <w:t xml:space="preserve">Research on social media and markets has mostly asked whether platform content predicts prices (Bollen et al. 2011; for the news-media precursor, Tetlock 2007), and the closest work on presidential communication studies tweets and firm values or intraday reactions (Born et al. 2017; Ge et al. [verify]). Explanations typically invoke attention (Barber and Odean 2008), rational inattention (Sims 2003), or the distinction between words and actions in central-bank communication (Gürkaynak et al. 2005). Those accounts name factors but offer no common currency in which they can be compared.</w:t>
+        <w:t xml:space="preserve">Research on social media and markets has mostly asked whether platform content predicts prices (Bollen et al. 2011; for the news-media precursor, Tetlock 2007), and the closest work on presidential communication studies tweets and firm values or intraday reactions (Born et al. 2017; Ge et al. 2019). Explanations typically invoke attention (Barber and Odean 2008), rational inattention (Sims 2003), or the distinction between words and actions in central-bank communication (Gürkaynak et al. 2005). Those accounts name factors but offer no common currency in which they can be compared.</w:t>
       </w:r>
     </w:p>
     <w:p>
@@ -2381,7 +2381,7 @@
         <w:pStyle w:val="BodyText"/>
       </w:pPr>
       <w:r>
-        <w:t xml:space="preserve">Ge, Q., Kurov, A., and Wolfe, M. H. [year].</w:t>
+        <w:t xml:space="preserve">Ge, Q., Kurov, A., and Wolfe, M. H. 2019.</w:t>
       </w:r>
       <w:r>
         <w:t xml:space="preserve"> </w:t>
@@ -2390,7 +2390,7 @@
         <w:t xml:space="preserve">“</w:t>
       </w:r>
       <w:r>
-        <w:t xml:space="preserve">Stock Market Reactions to Presidential Social Media Usage: Evidence from Company-Specific Tweets,</w:t>
+        <w:t xml:space="preserve">Do Investors Care About Presidential Company-Specific Tweets?,</w:t>
       </w:r>
       <w:r>
         <w:t xml:space="preserve">”</w:t>
@@ -2399,7 +2399,17 @@
         <w:t xml:space="preserve"> </w:t>
       </w:r>
       <w:r>
-        <w:t xml:space="preserve">[journal, volume, pages] [verify].</w:t>
+        <w:rPr>
+          <w:iCs/>
+          <w:i/>
+        </w:rPr>
+        <w:t xml:space="preserve">Journal of Financial Research</w:t>
+      </w:r>
+      <w:r>
+        <w:t xml:space="preserve"> </w:t>
+      </w:r>
+      <w:r>
+        <w:t xml:space="preserve">(42:2), pp. 213–242, https://doi.org/10.1111/jfir.12177.</w:t>
       </w:r>
     </w:p>
     <w:p>

</xml_diff>

<commit_message>
References: verify against Crossref/library records, fix GDELT and Richardson entries, add DOIs
Co-Authored-By: Claude Sonnet 5.5 <noreply@anthropic.com>
Claude-Session: https://claude.ai/code/session_011aZmoPyuUT34TyBPwawaPZ
</commit_message>
<xml_diff>
--- a/misq_note/hf/MANUSCRIPT_MISQ_v2.docx
+++ b/misq_note/hf/MANUSCRIPT_MISQ_v2.docx
@@ -1995,25 +1995,7 @@
         <w:pStyle w:val="FirstParagraph"/>
       </w:pPr>
       <w:r>
-        <w:t xml:space="preserve">[All references must be checked against the originals, including volume, page, and year, before submission; items marked</w:t>
-      </w:r>
-      <w:r>
-        <w:t xml:space="preserve"> </w:t>
-      </w:r>
-      <w:r>
-        <w:t xml:space="preserve">“</w:t>
-      </w:r>
-      <w:r>
-        <w:t xml:space="preserve">verify</w:t>
-      </w:r>
-      <w:r>
-        <w:t xml:space="preserve">”</w:t>
-      </w:r>
-      <w:r>
-        <w:t xml:space="preserve"> </w:t>
-      </w:r>
-      <w:r>
-        <w:t xml:space="preserve">are not confirmed.]</w:t>
+        <w:t xml:space="preserve">[On 14 October 2026 the journal articles, the Clauset chapter, the Leetaru and Schrodt paper and Richardson (1960) were checked against Crossref, publisher or library records. The textbooks (Austin, Cameron and Trivedi, Cover and Thomas, Searle) and Holm (1979) were not machine-checked and should be confirmed against the originals before submission.]</w:t>
       </w:r>
     </w:p>
     <w:p>
@@ -2106,7 +2088,7 @@
         <w:t xml:space="preserve"> </w:t>
       </w:r>
       <w:r>
-        <w:t xml:space="preserve">(89:1), pp. 79–112 [verify].</w:t>
+        <w:t xml:space="preserve">(89:1), pp. 79–112, https://doi.org/10.2308/accr-50576.</w:t>
       </w:r>
     </w:p>
     <w:p>
@@ -2178,7 +2160,7 @@
         <w:t xml:space="preserve"> </w:t>
       </w:r>
       <w:r>
-        <w:t xml:space="preserve">(6:3–4), pp. 103–109 [verify].</w:t>
+        <w:t xml:space="preserve">(6:3–4), pp. 103–109, https://doi.org/10.3233/AF-170211.</w:t>
       </w:r>
     </w:p>
     <w:p>
@@ -2238,7 +2220,7 @@
         <w:t xml:space="preserve"> </w:t>
       </w:r>
       <w:r>
-        <w:t xml:space="preserve">(27:5), pp. 1367–1403 [verify].</w:t>
+        <w:t xml:space="preserve">(27:5), pp. 1367–1403, https://doi.org/10.1093/rfs/hhu001.</w:t>
       </w:r>
     </w:p>
     <w:p>
@@ -2277,7 +2259,7 @@
         <w:t xml:space="preserve">Lewis Fry Richardson: His Intellectual Legacy and Influence in the Social Sciences</w:t>
       </w:r>
       <w:r>
-        <w:t xml:space="preserve">, N. J. Gleditsch (ed.), Cham: Springer, pp. 113–127. [verify]</w:t>
+        <w:t xml:space="preserve">, N. P. Gleditsch (ed.), Cham: Springer, pp. 113–127, https://doi.org/10.1007/978-3-030-31589-4_10.</w:t>
       </w:r>
     </w:p>
     <w:p>
@@ -2517,7 +2499,7 @@
         <w:t xml:space="preserve"> </w:t>
       </w:r>
       <w:r>
-        <w:t xml:space="preserve">(28:1), pp. 51–61. [verify]</w:t>
+        <w:t xml:space="preserve">(28:1), pp. 51–61, https://doi.org/10.1177/0022002784028001003.</w:t>
       </w:r>
     </w:p>
     <w:p>
@@ -2606,7 +2588,7 @@
         <w:t xml:space="preserve">“</w:t>
       </w:r>
       <w:r>
-        <w:t xml:space="preserve">GDELT: Global Database of Events, Language, and Tone,</w:t>
+        <w:t xml:space="preserve">GDELT: Global Data on Events, Location and Tone, 1979–2012,</w:t>
       </w:r>
       <w:r>
         <w:t xml:space="preserve">”</w:t>
@@ -2615,7 +2597,7 @@
         <w:t xml:space="preserve"> </w:t>
       </w:r>
       <w:r>
-        <w:t xml:space="preserve">paper presented at the International Studies Association Annual Convention. [verify]</w:t>
+        <w:t xml:space="preserve">paper presented at the International Studies Association Annual Convention, San Francisco, April.</w:t>
       </w:r>
     </w:p>
     <w:p>
@@ -2651,7 +2633,7 @@
         <w:t xml:space="preserve"> </w:t>
       </w:r>
       <w:r>
-        <w:t xml:space="preserve">(25:3), pp. 244–264. [verify]</w:t>
+        <w:t xml:space="preserve">(25:3), pp. 244–264, https://doi.org/10.1057/sj.2011.21.</w:t>
       </w:r>
     </w:p>
     <w:p>
@@ -2708,7 +2690,7 @@
         <w:t xml:space="preserve">Statistics of Deadly Quarrels</w:t>
       </w:r>
       <w:r>
-        <w:t xml:space="preserve">. Pittsburgh: Boxwood Press. [verify]</w:t>
+        <w:t xml:space="preserve">, Q. Wright and C. C. Lienau (eds.), Pittsburgh: Boxwood Press; Chicago: Quadrangle Books.</w:t>
       </w:r>
     </w:p>
     <w:p>

</xml_diff>

<commit_message>
Cite Chen, Blankespoor and Holm in text so every reference is cited
Co-Authored-By: Claude Sonnet 5.5 <noreply@anthropic.com>
Claude-Session: https://claude.ai/code/session_011aZmoPyuUT34TyBPwawaPZ
</commit_message>
<xml_diff>
--- a/misq_note/hf/MANUSCRIPT_MISQ_v2.docx
+++ b/misq_note/hf/MANUSCRIPT_MISQ_v2.docx
@@ -103,7 +103,7 @@
         <w:pStyle w:val="BodyText"/>
       </w:pPr>
       <w:r>
-        <w:t xml:space="preserve">Research on social media and markets has mostly asked whether platform content predicts prices (Bollen et al. 2011; for the news-media precursor, Tetlock 2007), and the closest work on presidential communication studies tweets and firm values or intraday reactions (Born et al. 2017; Ge et al. 2019). Explanations typically invoke attention (Barber and Odean 2008), rational inattention (Sims 2003), or the distinction between words and actions in central-bank communication (Gürkaynak et al. 2005). Those accounts name factors but offer no common currency in which they can be compared.</w:t>
+        <w:t xml:space="preserve">Research on social media and markets has mostly asked whether platform content predicts prices (Bollen et al. 2011; Chen et al. 2014; for the news-media precursor, Tetlock 2007), and, from the firm’s side, how dissemination through Twitter affects market liquidity (Blankespoor et al. 2014). The closest work on presidential communication studies tweets and firm values or intraday reactions (Born et al. 2017; Ge et al. 2019). Explanations typically invoke attention (Barber and Odean 2008), rational inattention (Sims 2003), or the distinction between words and actions in central-bank communication (Gürkaynak et al. 2005). Those accounts name factors but offer no common currency in which they can be compared.</w:t>
       </w:r>
     </w:p>
     <w:p>
@@ -569,7 +569,7 @@
         <w:pStyle w:val="FirstParagraph"/>
       </w:pPr>
       <w:r>
-        <w:t xml:space="preserve">Each analysis had a written plan committed to the repository before estimation. Plans state what the authors had already seen, define primary and secondary outcomes and decision rules, and are amended only through dated entries (Appendix A). The practice follows the argument for pre-registration in observational work with many analytic choices (Nosek et al. 2018). The plans are files in the authors’ repository, not entries in an independent registry; we therefore treat them as a transparency device, not as a guarantee against specification search. Several plans were written after earlier results had been seen, and the headline result in Section 4.2 arose from an amendment; we label it exploratory.</w:t>
+        <w:t xml:space="preserve">Each analysis had a written plan committed to the repository before estimation. Plans state what the authors had already seen, define primary and secondary outcomes and decision rules (with multiple comparisons handled by Holm’s (1979) sequential procedure), and are amended only through dated entries (Appendix A). The practice follows the argument for pre-registration in observational work with many analytic choices (Nosek et al. 2018). The plans are files in the authors’ repository, not entries in an independent registry; we therefore treat them as a transparency device, not as a guarantee against specification search. Several plans were written after earlier results had been seen, and the headline result in Section 4.2 arose from an amendment; we label it exploratory.</w:t>
       </w:r>
     </w:p>
     <w:bookmarkEnd w:id="32"/>

</xml_diff>

<commit_message>
Headline robustness (cluster rule, labels, windows, staleness, influence, spread); add to manuscript Section 4.2 as Table 2
Co-Authored-By: Claude Sonnet 5.5 <noreply@anthropic.com>
Claude-Session: https://claude.ai/code/session_011aZmoPyuUT34TyBPwawaPZ
</commit_message>
<xml_diff>
--- a/misq_note/hf/MANUSCRIPT_MISQ_v2.docx
+++ b/misq_note/hf/MANUSCRIPT_MISQ_v2.docx
@@ -943,6 +943,402 @@
       </w:r>
       <w:r>
         <w:t xml:space="preserve">To check that the co-movement is not an artefact of the hours in which posts happen to fall, we drew fake post times in the same clock hour on neighbouring days (with the same weekday status, at least two hours from any labelled post; 10,000 draws; ANALYSIS_PLAN_H5C_H8.md). On the adjudicated human-labelled posts (26 de-escalation, 14 escalation, after a three-hour cluster filter), the mean directional 30-minute return after the post is +0.62% for de-escalation and +0.53% for escalation, against placebo means of +0.05% and 95th percentiles of 0.22% and 0.26% (shares of placebo draws at least as large: below 0.0001 and 0.0003). The same test with model labels gives smaller but comparable results. The 30 minutes before the post also exceed the placebo for de-escalation (+0.57%, and +0.86% over the preceding hour; both below 0.0001) and, on the 30-minute window only, for escalation (+0.29%, p = 0.016). Tick counts in the half hour before a de-escalation post are 28% above those of comparable hours. We therefore describe the pre-post movement as drift larger than in comparable hours whose cause is not identified: it does not show leakage or the conduct of any party, and the market may be reacting to news that the post then repeats. Which of the three posting classes was reported first elsewhere makes no difference to the pre-post drift (30 events, p = 0.90).</w:t>
+      </w:r>
+    </w:p>
+    <w:p>
+      <w:pPr>
+        <w:pStyle w:val="BodyText"/>
+      </w:pPr>
+      <w:r>
+        <w:rPr>
+          <w:bCs/>
+          <w:b/>
+        </w:rPr>
+        <w:t xml:space="preserve">Robustness of the human-label result.</w:t>
+      </w:r>
+      <w:r>
+        <w:t xml:space="preserve"> </w:t>
+      </w:r>
+      <w:r>
+        <w:t xml:space="preserve">Table 2 varies one feature at a time (ANALYSIS_PLAN_ROBUST_HEADLINE.md). The direction of the post-window move is positive and significant in every variant for both classes, including when the three events on 23 March and 7 April are dropped (de-escalation mean 0.80%, median 0.48%) and when only posts on which both coders already agreed are used. The median is stable at 0.4–0.5% over 30 minutes; the mean is pulled up by a few events (the three largest de-escalation events, 2.7%, 3.3% and 10.5%, make up 54% of the summed move). The excess of the 30 minutes after a post over the 30 minutes before it is borderline (de-escalation p between 0.026 and 0.063 across cluster rules; escalation 0.044 to 0.097) and depends on the window: over 5 and 15 minutes the post move is preceded by no drift (pre-window means −0.05% and 0.00%; paired excess +0.72 and +0.76 points, p = 0.003 and 0.005), whereas over 60 minutes the earlier drift has caught up (paired −0.15, p = 0.37). The statement we can defend is therefore the short-window one. Quote quality does not explain the result: all prices used come from a tick no more than two minutes old, the median bid–ask spread is 0.05 on a price near 89.6, and the median absolute 30-minute move (0.46) is about nine spreads. The posts are a selected sample: of 191 war-period posts, 141 pass the three-hour filter, 68 carry a human signal label, and 45 (29 and 16) have a market window at the post time and 30 minutes later; 83% of the signal posts dropped for lack of a window were made at weekends or with the market closed (against 29% of all signal posts), so the result does not extend to weekend announcements.</w:t>
+      </w:r>
+    </w:p>
+    <w:tbl>
+      <w:tblPr>
+        <w:tblStyle w:val="Table"/>
+        <w:tblW w:type="pct" w:w="5000"/>
+        <w:tblLook w:firstRow="1" w:lastRow="0" w:firstColumn="0" w:lastColumn="0" w:noHBand="0" w:noVBand="0" w:val="0020"/>
+        <w:jc w:val="start"/>
+        <w:tblBorders>
+          <w:top w:val="single" w:sz="4" w:color="000000"/>
+          <w:left w:val="single" w:sz="4" w:color="000000"/>
+          <w:bottom w:val="single" w:sz="4" w:color="000000"/>
+          <w:right w:val="single" w:sz="4" w:color="000000"/>
+          <w:insideH w:val="single" w:sz="4" w:color="000000"/>
+          <w:insideV w:val="single" w:sz="4" w:color="000000"/>
+        </w:tblBorders>
+      </w:tblPr>
+      <w:tblGrid>
+        <w:gridCol w:w="2640"/>
+        <w:gridCol w:w="2640"/>
+        <w:gridCol w:w="2640"/>
+      </w:tblGrid>
+      <w:tr>
+        <w:trPr>
+          <w:tblHeader w:val="true"/>
+        </w:trPr>
+        <w:tc>
+          <w:tcPr/>
+          <w:p>
+            <w:pPr>
+              <w:pStyle w:val="Compact"/>
+              <w:jc w:val="left"/>
+            </w:pPr>
+            <w:r>
+              <w:t xml:space="preserve">Variant</w:t>
+            </w:r>
+          </w:p>
+        </w:tc>
+        <w:tc>
+          <w:tcPr/>
+          <w:p>
+            <w:pPr>
+              <w:pStyle w:val="Compact"/>
+              <w:jc w:val="left"/>
+            </w:pPr>
+            <w:r>
+              <w:t xml:space="preserve">De-escalation: n, post-30 mean (median), paired post − pre (p)</w:t>
+            </w:r>
+          </w:p>
+        </w:tc>
+        <w:tc>
+          <w:tcPr/>
+          <w:p>
+            <w:pPr>
+              <w:pStyle w:val="Compact"/>
+              <w:jc w:val="left"/>
+            </w:pPr>
+            <w:r>
+              <w:t xml:space="preserve">Escalation: n, post-30 mean (median), paired post − pre (p)</w:t>
+            </w:r>
+          </w:p>
+        </w:tc>
+      </w:tr>
+      <w:tr>
+        <w:tc>
+          <w:tcPr/>
+          <w:p>
+            <w:pPr>
+              <w:pStyle w:val="Compact"/>
+              <w:jc w:val="left"/>
+            </w:pPr>
+            <w:r>
+              <w:t xml:space="preserve">Baseline (3-hour filter)</w:t>
+            </w:r>
+          </w:p>
+        </w:tc>
+        <w:tc>
+          <w:tcPr/>
+          <w:p>
+            <w:pPr>
+              <w:pStyle w:val="Compact"/>
+              <w:jc w:val="left"/>
+            </w:pPr>
+            <w:r>
+              <w:t xml:space="preserve">29, 1.05 (0.47), +0.48 (.030)</w:t>
+            </w:r>
+          </w:p>
+        </w:tc>
+        <w:tc>
+          <w:tcPr/>
+          <w:p>
+            <w:pPr>
+              <w:pStyle w:val="Compact"/>
+              <w:jc w:val="left"/>
+            </w:pPr>
+            <w:r>
+              <w:t xml:space="preserve">16, 0.48 (0.40), +0.26 (.058)</w:t>
+            </w:r>
+          </w:p>
+        </w:tc>
+      </w:tr>
+      <w:tr>
+        <w:tc>
+          <w:tcPr/>
+          <w:p>
+            <w:pPr>
+              <w:pStyle w:val="Compact"/>
+              <w:jc w:val="left"/>
+            </w:pPr>
+            <w:r>
+              <w:t xml:space="preserve">No cluster filter</w:t>
+            </w:r>
+          </w:p>
+        </w:tc>
+        <w:tc>
+          <w:tcPr/>
+          <w:p>
+            <w:pPr>
+              <w:pStyle w:val="Compact"/>
+              <w:jc w:val="left"/>
+            </w:pPr>
+            <w:r>
+              <w:t xml:space="preserve">34, 0.91 (0.46), +0.44 (.026)</w:t>
+            </w:r>
+          </w:p>
+        </w:tc>
+        <w:tc>
+          <w:tcPr/>
+          <w:p>
+            <w:pPr>
+              <w:pStyle w:val="Compact"/>
+              <w:jc w:val="left"/>
+            </w:pPr>
+            <w:r>
+              <w:t xml:space="preserve">19, 0.46 (0.35), +0.23 (.071)</w:t>
+            </w:r>
+          </w:p>
+        </w:tc>
+      </w:tr>
+      <w:tr>
+        <w:tc>
+          <w:tcPr/>
+          <w:p>
+            <w:pPr>
+              <w:pStyle w:val="Compact"/>
+              <w:jc w:val="left"/>
+            </w:pPr>
+            <w:r>
+              <w:t xml:space="preserve">6-hour filter</w:t>
+            </w:r>
+          </w:p>
+        </w:tc>
+        <w:tc>
+          <w:tcPr/>
+          <w:p>
+            <w:pPr>
+              <w:pStyle w:val="Compact"/>
+              <w:jc w:val="left"/>
+            </w:pPr>
+            <w:r>
+              <w:t xml:space="preserve">25, 1.08 (0.49), +0.42 (.063)</w:t>
+            </w:r>
+          </w:p>
+        </w:tc>
+        <w:tc>
+          <w:tcPr/>
+          <w:p>
+            <w:pPr>
+              <w:pStyle w:val="Compact"/>
+              <w:jc w:val="left"/>
+            </w:pPr>
+            <w:r>
+              <w:t xml:space="preserve">14, 0.54 (0.50), +0.27 (.097)</w:t>
+            </w:r>
+          </w:p>
+        </w:tc>
+      </w:tr>
+      <w:tr>
+        <w:tc>
+          <w:tcPr/>
+          <w:p>
+            <w:pPr>
+              <w:pStyle w:val="Compact"/>
+              <w:jc w:val="left"/>
+            </w:pPr>
+            <w:r>
+              <w:t xml:space="preserve">Both coders agreed before adjudication</w:t>
+            </w:r>
+          </w:p>
+        </w:tc>
+        <w:tc>
+          <w:tcPr/>
+          <w:p>
+            <w:pPr>
+              <w:pStyle w:val="Compact"/>
+              <w:jc w:val="left"/>
+            </w:pPr>
+            <w:r>
+              <w:t xml:space="preserve">28, 1.03 (0.47), +0.44 (.045)</w:t>
+            </w:r>
+          </w:p>
+        </w:tc>
+        <w:tc>
+          <w:tcPr/>
+          <w:p>
+            <w:pPr>
+              <w:pStyle w:val="Compact"/>
+              <w:jc w:val="left"/>
+            </w:pPr>
+            <w:r>
+              <w:t xml:space="preserve">7, 0.71 (0.54), +0.44 (.078)</w:t>
+            </w:r>
+          </w:p>
+        </w:tc>
+      </w:tr>
+      <w:tr>
+        <w:tc>
+          <w:tcPr/>
+          <w:p>
+            <w:pPr>
+              <w:pStyle w:val="Compact"/>
+              <w:jc w:val="left"/>
+            </w:pPr>
+            <w:r>
+              <w:t xml:space="preserve">Window 5 minutes</w:t>
+            </w:r>
+          </w:p>
+        </w:tc>
+        <w:tc>
+          <w:tcPr/>
+          <w:p>
+            <w:pPr>
+              <w:pStyle w:val="Compact"/>
+              <w:jc w:val="left"/>
+            </w:pPr>
+            <w:r>
+              <w:t xml:space="preserve">29, 0.67 (0.21), +0.72 (.003)</w:t>
+            </w:r>
+          </w:p>
+        </w:tc>
+        <w:tc>
+          <w:tcPr/>
+          <w:p>
+            <w:pPr>
+              <w:pStyle w:val="Compact"/>
+              <w:jc w:val="left"/>
+            </w:pPr>
+            <w:r>
+              <w:t xml:space="preserve">16, 0.46 (0.19), +0.38 (.096)</w:t>
+            </w:r>
+          </w:p>
+        </w:tc>
+      </w:tr>
+      <w:tr>
+        <w:tc>
+          <w:tcPr/>
+          <w:p>
+            <w:pPr>
+              <w:pStyle w:val="Compact"/>
+              <w:jc w:val="left"/>
+            </w:pPr>
+            <w:r>
+              <w:t xml:space="preserve">Window 15 minutes</w:t>
+            </w:r>
+          </w:p>
+        </w:tc>
+        <w:tc>
+          <w:tcPr/>
+          <w:p>
+            <w:pPr>
+              <w:pStyle w:val="Compact"/>
+              <w:jc w:val="left"/>
+            </w:pPr>
+            <w:r>
+              <w:t xml:space="preserve">29, 0.76 (0.60), +0.76 (.005)</w:t>
+            </w:r>
+          </w:p>
+        </w:tc>
+        <w:tc>
+          <w:tcPr/>
+          <w:p>
+            <w:pPr>
+              <w:pStyle w:val="Compact"/>
+              <w:jc w:val="left"/>
+            </w:pPr>
+            <w:r>
+              <w:t xml:space="preserve">16, 0.57 (0.42), +0.36 (.019)</w:t>
+            </w:r>
+          </w:p>
+        </w:tc>
+      </w:tr>
+      <w:tr>
+        <w:tc>
+          <w:tcPr/>
+          <w:p>
+            <w:pPr>
+              <w:pStyle w:val="Compact"/>
+              <w:jc w:val="left"/>
+            </w:pPr>
+            <w:r>
+              <w:t xml:space="preserve">Window 60 minutes</w:t>
+            </w:r>
+          </w:p>
+        </w:tc>
+        <w:tc>
+          <w:tcPr/>
+          <w:p>
+            <w:pPr>
+              <w:pStyle w:val="Compact"/>
+              <w:jc w:val="left"/>
+            </w:pPr>
+            <w:r>
+              <w:t xml:space="preserve">28, 1.18 (0.42), −0.15 (.365)</w:t>
+            </w:r>
+          </w:p>
+        </w:tc>
+        <w:tc>
+          <w:tcPr/>
+          <w:p>
+            <w:pPr>
+              <w:pStyle w:val="Compact"/>
+              <w:jc w:val="left"/>
+            </w:pPr>
+            <w:r>
+              <w:t xml:space="preserve">16, 0.48 (0.40), +0.44 (.086)</w:t>
+            </w:r>
+          </w:p>
+        </w:tc>
+      </w:tr>
+      <w:tr>
+        <w:tc>
+          <w:tcPr/>
+          <w:p>
+            <w:pPr>
+              <w:pStyle w:val="Compact"/>
+              <w:jc w:val="left"/>
+            </w:pPr>
+            <w:r>
+              <w:t xml:space="preserve">Drop 23 March and 7 April</w:t>
+            </w:r>
+          </w:p>
+        </w:tc>
+        <w:tc>
+          <w:tcPr/>
+          <w:p>
+            <w:pPr>
+              <w:pStyle w:val="Compact"/>
+              <w:jc w:val="left"/>
+            </w:pPr>
+            <w:r>
+              <w:t xml:space="preserve">26, 0.80 (0.48), +0.49 (.025)</w:t>
+            </w:r>
+          </w:p>
+        </w:tc>
+        <w:tc>
+          <w:tcPr/>
+          <w:p>
+            <w:pPr>
+              <w:pStyle w:val="Compact"/>
+              <w:jc w:val="left"/>
+            </w:pPr>
+            <w:r>
+              <w:t xml:space="preserve">16, 0.48 (0.40), +0.26 (.058)</w:t>
+            </w:r>
+          </w:p>
+        </w:tc>
+      </w:tr>
+    </w:tbl>
+    <w:p>
+      <w:pPr>
+        <w:pStyle w:val="BodyText"/>
+      </w:pPr>
+      <w:r>
+        <w:rPr>
+          <w:iCs/>
+          <w:i/>
+        </w:rPr>
+        <w:t xml:space="preserve">Table 2. Robustness of the human-label tick-level result (mean directional returns in percent; p from one-sided Wilcoxon tests of post &gt; pre; variants are not independent and p-values are not adjusted).</w:t>
       </w:r>
     </w:p>
     <w:bookmarkEnd w:id="45"/>

</xml_diff>